<commit_message>
Realize y agrege el diagrama de clases
</commit_message>
<xml_diff>
--- a/1er entrega TPI - comision 1 grupo 5 - Corregido.docx
+++ b/1er entrega TPI - comision 1 grupo 5 - Corregido.docx
@@ -860,22 +860,29 @@
           </w:r>
           <w:r>
             <w:rPr>
-              <w:rStyle w:val="Enlacedelndice"/>
+              <w:rStyle w:val="IndexLink"/>
             </w:rPr>
             <w:instrText xml:space="preserve"> TOC \f \o "1-9" \h</w:instrText>
           </w:r>
           <w:r>
             <w:rPr>
-              <w:rStyle w:val="Enlacedelndice"/>
+              <w:rStyle w:val="IndexLink"/>
             </w:rPr>
             <w:fldChar w:fldCharType="separate"/>
           </w:r>
           <w:hyperlink w:anchor="_Toc232530984">
             <w:r>
               <w:rPr>
-                <w:rStyle w:val="Enlacedelndice"/>
+                <w:rStyle w:val="IndexLink"/>
               </w:rPr>
               <w:t>1. Objetivo del trabajo</w:t>
+            </w:r>
+            <w:r>
+              <w:rPr>
+                <w:rStyle w:val="IndexLink"/>
+                <w:vanish/>
+              </w:rPr>
+              <w:tab/>
             </w:r>
             <w:r>
               <w:rPr>
@@ -897,9 +904,8 @@
             </w:r>
             <w:r>
               <w:rPr>
-                <w:rStyle w:val="Enlacedelndice"/>
+                <w:rStyle w:val="IndexLink"/>
               </w:rPr>
-              <w:tab/>
               <w:t>2</w:t>
             </w:r>
             <w:r>
@@ -922,10 +928,17 @@
           <w:hyperlink w:anchor="_Toc232530985">
             <w:r>
               <w:rPr>
-                <w:rStyle w:val="Enlacedelndice"/>
+                <w:rStyle w:val="IndexLink"/>
                 <w:bCs/>
               </w:rPr>
               <w:t>2. Presentación del grupo de trabajo</w:t>
+            </w:r>
+            <w:r>
+              <w:rPr>
+                <w:rStyle w:val="IndexLink"/>
+                <w:vanish/>
+              </w:rPr>
+              <w:tab/>
             </w:r>
             <w:r>
               <w:rPr>
@@ -947,9 +960,8 @@
             </w:r>
             <w:r>
               <w:rPr>
-                <w:rStyle w:val="Enlacedelndice"/>
+                <w:rStyle w:val="IndexLink"/>
               </w:rPr>
-              <w:tab/>
               <w:t>2</w:t>
             </w:r>
             <w:r>
@@ -990,7 +1002,7 @@
             </w:r>
             <w:r>
               <w:rPr>
-                <w:rStyle w:val="Enlacedelndice"/>
+                <w:rStyle w:val="IndexLink"/>
               </w:rPr>
               <w:t>3. Caso relevado</w:t>
               <w:tab/>
@@ -1034,7 +1046,7 @@
             </w:r>
             <w:r>
               <w:rPr>
-                <w:rStyle w:val="Enlacedelndice"/>
+                <w:rStyle w:val="IndexLink"/>
               </w:rPr>
               <w:t>4. Fuentes de Requerimientos</w:t>
               <w:tab/>
@@ -1078,7 +1090,7 @@
             </w:r>
             <w:r>
               <w:rPr>
-                <w:rStyle w:val="Enlacedelndice"/>
+                <w:rStyle w:val="IndexLink"/>
               </w:rPr>
               <w:t>5. Requerimientos Funcionales</w:t>
               <w:tab/>
@@ -1122,7 +1134,7 @@
             </w:r>
             <w:r>
               <w:rPr>
-                <w:rStyle w:val="Enlacedelndice"/>
+                <w:rStyle w:val="IndexLink"/>
               </w:rPr>
               <w:t>Anexo: Elicitación</w:t>
               <w:tab/>
@@ -1217,7 +1229,7 @@
           <w:szCs w:val="22"/>
         </w:rPr>
         <w:drawing>
-          <wp:anchor distT="0" distB="0" distL="114300" distR="114300" simplePos="0" relativeHeight="96" behindDoc="0" locked="0" layoutInCell="0" allowOverlap="1">
+          <wp:anchor distT="0" distB="0" distL="114300" distR="114300" simplePos="0" relativeHeight="97" behindDoc="0" locked="0" layoutInCell="0" allowOverlap="1">
             <wp:simplePos x="0" y="0"/>
             <wp:positionH relativeFrom="column">
               <wp:posOffset>4046220</wp:posOffset>
@@ -1288,23 +1300,7 @@
           <w:bCs/>
           <w:szCs w:val="22"/>
         </w:rPr>
-        <w:t xml:space="preserve">El objetivo del </w:t>
-      </w:r>
-      <w:r>
-        <w:rPr>
-          <w:rFonts w:cs="Arial" w:ascii="Arial" w:hAnsi="Arial"/>
-          <w:bCs/>
-          <w:szCs w:val="22"/>
-        </w:rPr>
-        <w:t xml:space="preserve">Trabajo Práctico Integrador es integrar todos los conocimientos adquiridos en el transcurso del cursado de la cátedra Análisis de Sistemas de Información como también las demás cátedras del año respectivo. En esta primera entrega, el objetivo específico es </w:t>
-      </w:r>
-      <w:r>
-        <w:rPr>
-          <w:rFonts w:cs="Arial" w:ascii="Arial" w:hAnsi="Arial"/>
-          <w:bCs/>
-          <w:szCs w:val="22"/>
-        </w:rPr>
-        <w:t>elaborar un listado de requerimientos funcionales para un sistema de software, identificando los actores involucrados y las funcionalidades específicas que deberá cumplir la aplicación.</w:t>
+        <w:t>El objetivo del Trabajo Práctico Integrador es integrar todos los conocimientos adquiridos en el transcurso del cursado de la cátedra Análisis de Sistemas de Información como también las demás cátedras del año respectivo. En esta primera entrega, el objetivo específico es elaborar un listado de requerimientos funcionales para un sistema de software, identificando los actores involucrados y las funcionalidades específicas que deberá cumplir la aplicación.</w:t>
       </w:r>
     </w:p>
     <w:p>
@@ -1342,39 +1338,7 @@
           <w:bCs/>
           <w:szCs w:val="22"/>
         </w:rPr>
-        <w:t xml:space="preserve">El trabajo permitirá establecer una base ordenada para el futuro diseño y desarrollo del sistema de información, asegurando que las funcionalidades propuestas respondan a una necesidad concreta del usuario: registrar, organizar, consultar </w:t>
-      </w:r>
-      <w:r>
-        <w:rPr>
-          <w:rFonts w:cs="Arial" w:ascii="Arial" w:hAnsi="Arial"/>
-          <w:bCs/>
-          <w:szCs w:val="22"/>
-        </w:rPr>
-        <w:t>y</w:t>
-      </w:r>
-      <w:r>
-        <w:rPr>
-          <w:rFonts w:cs="Arial" w:ascii="Arial" w:hAnsi="Arial"/>
-          <w:bCs/>
-          <w:szCs w:val="22"/>
-        </w:rPr>
-        <w:t xml:space="preserve"> comparar </w:t>
-      </w:r>
-      <w:r>
-        <w:rPr>
-          <w:rFonts w:cs="Arial" w:ascii="Arial" w:hAnsi="Arial"/>
-          <w:bCs/>
-          <w:szCs w:val="22"/>
-        </w:rPr>
-        <w:t>la</w:t>
-      </w:r>
-      <w:r>
-        <w:rPr>
-          <w:rFonts w:cs="Arial" w:ascii="Arial" w:hAnsi="Arial"/>
-          <w:bCs/>
-          <w:szCs w:val="22"/>
-        </w:rPr>
-        <w:t xml:space="preserve"> información relacionada con retiros holísticos.</w:t>
+        <w:t>El trabajo permitirá establecer una base ordenada para el futuro diseño y desarrollo del sistema de información, asegurando que las funcionalidades propuestas respondan a una necesidad concreta del usuario: registrar, organizar, consultar y comparar la información relacionada con retiros holísticos.</w:t>
       </w:r>
     </w:p>
     <w:p>
@@ -1664,21 +1628,7 @@
           <w:rFonts w:eastAsia="Arial" w:cs="Arial" w:ascii="Arial" w:hAnsi="Arial"/>
           <w:szCs w:val="22"/>
         </w:rPr>
-        <w:t>De cada retiro, se tiene que registrar un estado que permita saber la situación en la que se encuentra: si el retiro solo resulta de interés, si ya fue consultado, si se está esperando una respuesta, si está reservado, si fue señado, s</w:t>
-      </w:r>
-      <w:r>
-        <w:rPr>
-          <w:rFonts w:eastAsia="Arial" w:cs="Arial" w:ascii="Arial" w:hAnsi="Arial"/>
-          <w:szCs w:val="22"/>
-        </w:rPr>
-        <w:t>i</w:t>
-      </w:r>
-      <w:r>
-        <w:rPr>
-          <w:rFonts w:eastAsia="Arial" w:cs="Arial" w:ascii="Arial" w:hAnsi="Arial"/>
-          <w:szCs w:val="22"/>
-        </w:rPr>
-        <w:t xml:space="preserve"> está confirmado, cancelado o finalizado. Una vez finalizado un retiro, la aplicación tiene que permitir guardar la experiencia personal del usuario, incluyendo una valoración, comentarios, fotos, observaciones y una opinión del retiro. La opinión se podrá usar después para recordar la experiencia o compartirla con otras personas.</w:t>
+        <w:t>De cada retiro, se tiene que registrar un estado que permita saber la situación en la que se encuentra: si el retiro solo resulta de interés, si ya fue consultado, si se está esperando una respuesta, si está reservado, si fue señado, si está confirmado, cancelado o finalizado. Una vez finalizado un retiro, la aplicación tiene que permitir guardar la experiencia personal del usuario, incluyendo una valoración, comentarios, fotos, observaciones y una opinión del retiro. La opinión se podrá usar después para recordar la experiencia o compartirla con otras personas.</w:t>
       </w:r>
     </w:p>
     <w:p>
@@ -2166,7 +2116,7 @@
           <w:bottom w:w="0" w:type="dxa"/>
           <w:end w:w="108" w:type="dxa"/>
         </w:tblCellMar>
-        <w:tblLook w:firstRow="1" w:noVBand="1" w:lastRow="0" w:firstColumn="1" w:lastColumn="0" w:noHBand="0" w:val="04a0"/>
+        <w:tblLook w:val="04a0" w:firstRow="1" w:noVBand="1" w:lastRow="0" w:firstColumn="1" w:lastColumn="0" w:noHBand="0"/>
       </w:tblPr>
       <w:tblGrid>
         <w:gridCol w:w="562"/>
@@ -2497,29 +2447,7 @@
                 <w:szCs w:val="22"/>
                 <w:lang w:val="es-AR" w:eastAsia="es-AR" w:bidi="ar-SA"/>
               </w:rPr>
-              <w:t xml:space="preserve">Asignar </w:t>
-            </w:r>
-            <w:r>
-              <w:rPr>
-                <w:rFonts w:eastAsia="Arial" w:cs="Arial" w:ascii="Arial" w:hAnsi="Arial"/>
-                <w:b/>
-                <w:bCs/>
-                <w:kern w:val="2"/>
-                <w:szCs w:val="22"/>
-                <w:lang w:val="es-AR" w:eastAsia="es-AR" w:bidi="ar-SA"/>
-              </w:rPr>
-              <w:t>estados</w:t>
-            </w:r>
-            <w:r>
-              <w:rPr>
-                <w:rFonts w:eastAsia="Arial" w:cs="Arial" w:ascii="Arial" w:hAnsi="Arial"/>
-                <w:b/>
-                <w:bCs/>
-                <w:kern w:val="2"/>
-                <w:szCs w:val="22"/>
-                <w:lang w:val="es-AR" w:eastAsia="es-AR" w:bidi="ar-SA"/>
-              </w:rPr>
-              <w:t xml:space="preserve"> a un retiro:</w:t>
+              <w:t>Asignar estados a un retiro:</w:t>
             </w:r>
             <w:r>
               <w:rPr>
@@ -2598,25 +2526,7 @@
                 <w:szCs w:val="22"/>
                 <w:lang w:val="es-AR" w:eastAsia="es-AR" w:bidi="ar-SA"/>
               </w:rPr>
-              <w:t xml:space="preserve"> El sistema deberá permitir registrar la información de contacto de personas, páginas web u organizaciones vinculadas con un retiro, indicando nombre, correo electrónico, teléfono </w:t>
-            </w:r>
-            <w:r>
-              <w:rPr>
-                <w:rFonts w:eastAsia="Arial" w:cs="Arial" w:ascii="Arial" w:hAnsi="Arial"/>
-                <w:kern w:val="2"/>
-                <w:szCs w:val="22"/>
-                <w:lang w:val="es-AR" w:eastAsia="es-AR" w:bidi="ar-SA"/>
-              </w:rPr>
-              <w:t>y</w:t>
-            </w:r>
-            <w:r>
-              <w:rPr>
-                <w:rFonts w:eastAsia="Arial" w:cs="Arial" w:ascii="Arial" w:hAnsi="Arial"/>
-                <w:kern w:val="2"/>
-                <w:szCs w:val="22"/>
-                <w:lang w:val="es-AR" w:eastAsia="es-AR" w:bidi="ar-SA"/>
-              </w:rPr>
-              <w:t xml:space="preserve"> redes sociales.</w:t>
+              <w:t xml:space="preserve"> El sistema deberá permitir registrar la información de contacto de personas, páginas web u organizaciones vinculadas con un retiro, indicando nombre, correo electrónico, teléfono y redes sociales.</w:t>
             </w:r>
           </w:p>
         </w:tc>
@@ -2826,25 +2736,7 @@
                 <w:szCs w:val="22"/>
                 <w:lang w:val="es-AR" w:eastAsia="es-AR" w:bidi="ar-SA"/>
               </w:rPr>
-              <w:t xml:space="preserve"> El sistema deberá permitir registrar un acompañante indicando nombre </w:t>
-            </w:r>
-            <w:r>
-              <w:rPr>
-                <w:rFonts w:eastAsia="Arial" w:cs="Arial" w:ascii="Arial" w:hAnsi="Arial"/>
-                <w:kern w:val="2"/>
-                <w:szCs w:val="22"/>
-                <w:lang w:val="es-AR" w:eastAsia="es-AR" w:bidi="ar-SA"/>
-              </w:rPr>
-              <w:t>y</w:t>
-            </w:r>
-            <w:r>
-              <w:rPr>
-                <w:rFonts w:eastAsia="Arial" w:cs="Arial" w:ascii="Arial" w:hAnsi="Arial"/>
-                <w:kern w:val="2"/>
-                <w:szCs w:val="22"/>
-                <w:lang w:val="es-AR" w:eastAsia="es-AR" w:bidi="ar-SA"/>
-              </w:rPr>
-              <w:t xml:space="preserve"> apellido.</w:t>
+              <w:t xml:space="preserve"> El sistema deberá permitir registrar un acompañante indicando nombre y apellido.</w:t>
             </w:r>
           </w:p>
         </w:tc>
@@ -2907,18 +2799,7 @@
                 <w:szCs w:val="22"/>
                 <w:lang w:val="es-AR" w:eastAsia="es-AR" w:bidi="ar-SA"/>
               </w:rPr>
-              <w:t>Generar</w:t>
-            </w:r>
-            <w:r>
-              <w:rPr>
-                <w:rFonts w:eastAsia="Arial" w:cs="Arial" w:ascii="Arial" w:hAnsi="Arial"/>
-                <w:b/>
-                <w:bCs/>
-                <w:kern w:val="2"/>
-                <w:szCs w:val="22"/>
-                <w:lang w:val="es-AR" w:eastAsia="es-AR" w:bidi="ar-SA"/>
-              </w:rPr>
-              <w:t xml:space="preserve"> notificación de vencimiento de pago: </w:t>
+              <w:t xml:space="preserve">Generar notificación de vencimiento de pago: </w:t>
             </w:r>
             <w:r>
               <w:rPr>
@@ -2927,25 +2808,7 @@
                 <w:szCs w:val="22"/>
                 <w:lang w:val="es-AR" w:eastAsia="es-AR" w:bidi="ar-SA"/>
               </w:rPr>
-              <w:t xml:space="preserve">El sistema deberá </w:t>
-            </w:r>
-            <w:r>
-              <w:rPr>
-                <w:rFonts w:eastAsia="Arial" w:cs="Arial" w:ascii="Arial" w:hAnsi="Arial"/>
-                <w:kern w:val="2"/>
-                <w:szCs w:val="22"/>
-                <w:lang w:val="es-AR" w:eastAsia="es-AR" w:bidi="ar-SA"/>
-              </w:rPr>
-              <w:t>generar</w:t>
-            </w:r>
-            <w:r>
-              <w:rPr>
-                <w:rFonts w:eastAsia="Arial" w:cs="Arial" w:ascii="Arial" w:hAnsi="Arial"/>
-                <w:kern w:val="2"/>
-                <w:szCs w:val="22"/>
-                <w:lang w:val="es-AR" w:eastAsia="es-AR" w:bidi="ar-SA"/>
-              </w:rPr>
-              <w:t xml:space="preserve"> una notificación cuando se aproxime la fecha de vencimiento del pago de un retiro.</w:t>
+              <w:t>El sistema deberá generar una notificación cuando se aproxime la fecha de vencimiento del pago de un retiro.</w:t>
             </w:r>
           </w:p>
         </w:tc>
@@ -3012,18 +2875,7 @@
                 <w:szCs w:val="22"/>
                 <w:lang w:val="es-AR" w:eastAsia="es-AR" w:bidi="ar-SA"/>
               </w:rPr>
-              <w:t>Generar</w:t>
-            </w:r>
-            <w:r>
-              <w:rPr>
-                <w:rFonts w:eastAsia="Arial" w:cs="Arial" w:ascii="Arial" w:hAnsi="Arial"/>
-                <w:b/>
-                <w:bCs/>
-                <w:kern w:val="2"/>
-                <w:szCs w:val="22"/>
-                <w:lang w:val="es-AR" w:eastAsia="es-AR" w:bidi="ar-SA"/>
-              </w:rPr>
-              <w:t xml:space="preserve"> notificación de proximidad de retiro: </w:t>
+              <w:t xml:space="preserve">Generar notificación de proximidad de retiro: </w:t>
             </w:r>
             <w:r>
               <w:rPr>
@@ -3032,25 +2884,7 @@
                 <w:szCs w:val="22"/>
                 <w:lang w:val="es-AR" w:eastAsia="es-AR" w:bidi="ar-SA"/>
               </w:rPr>
-              <w:t xml:space="preserve">El sistema deberá </w:t>
-            </w:r>
-            <w:r>
-              <w:rPr>
-                <w:rFonts w:eastAsia="Arial" w:cs="Arial" w:ascii="Arial" w:hAnsi="Arial"/>
-                <w:kern w:val="2"/>
-                <w:szCs w:val="22"/>
-                <w:lang w:val="es-AR" w:eastAsia="es-AR" w:bidi="ar-SA"/>
-              </w:rPr>
-              <w:t>generar</w:t>
-            </w:r>
-            <w:r>
-              <w:rPr>
-                <w:rFonts w:eastAsia="Arial" w:cs="Arial" w:ascii="Arial" w:hAnsi="Arial"/>
-                <w:kern w:val="2"/>
-                <w:szCs w:val="22"/>
-                <w:lang w:val="es-AR" w:eastAsia="es-AR" w:bidi="ar-SA"/>
-              </w:rPr>
-              <w:t xml:space="preserve"> una notificación cuando se aproxime la fecha de realización de un retiro agendado.</w:t>
+              <w:t>El sistema deberá generar una notificación cuando se aproxime la fecha de realización de un retiro agendado.</w:t>
             </w:r>
             <w:r>
               <w:rPr>
@@ -3382,15 +3216,129 @@
           <w:szCs w:val="22"/>
         </w:rPr>
       </w:pPr>
-      <w:bookmarkStart w:id="5" w:name="_Toc232530989"/>
+      <w:bookmarkStart w:id="5" w:name="_Toc232530989_Copy_1"/>
       <w:r>
         <w:rPr>
           <w:sz w:val="22"/>
+        </w:rPr>
+        <w:t>D</w:t>
+      </w:r>
+      <w:bookmarkEnd w:id="5"/>
+      <w:r>
+        <w:rPr>
+          <w:sz w:val="22"/>
+        </w:rPr>
+        <w:t>iagrama de clases</w:t>
+      </w:r>
+    </w:p>
+    <w:p>
+      <w:pPr>
+        <w:pStyle w:val="Normal"/>
+        <w:numPr>
+          <w:ilvl w:val="0"/>
+          <w:numId w:val="0"/>
+        </w:numPr>
+        <w:spacing w:lineRule="auto" w:line="360" w:before="0" w:after="180"/>
+        <w:ind w:hanging="0" w:start="-5"/>
+        <w:jc w:val="center"/>
+        <w:rPr>
+          <w:sz w:val="22"/>
+          <w:szCs w:val="22"/>
+        </w:rPr>
+      </w:pPr>
+      <w:r>
+        <w:rPr>
+          <w:rFonts w:eastAsia="Arial" w:cs="Arial" w:ascii="Arial" w:hAnsi="Arial"/>
+          <w:szCs w:val="22"/>
+          <w:shd w:fill="FFFF00" w:val="clear"/>
+        </w:rPr>
+      </w:r>
+    </w:p>
+    <w:p>
+      <w:pPr>
+        <w:pStyle w:val="BodyText"/>
+        <w:rPr/>
+      </w:pPr>
+      <w:hyperlink r:id="rId7">
+        <w:r>
+          <w:rPr>
+            <w:rStyle w:val="Hyperlink"/>
+          </w:rPr>
+          <w:t>Foto Diagrama</w:t>
+        </w:r>
+      </w:hyperlink>
+    </w:p>
+    <w:p>
+      <w:pPr>
+        <w:pStyle w:val="BodyText"/>
+        <w:rPr/>
+      </w:pPr>
+      <w:r>
+        <w:rPr/>
+      </w:r>
+    </w:p>
+    <w:p>
+      <w:pPr>
+        <w:pStyle w:val="Normal"/>
+        <w:spacing w:lineRule="auto" w:line="360" w:before="0" w:after="0"/>
+        <w:jc w:val="both"/>
+        <w:rPr>
+          <w:rFonts w:ascii="Arial" w:hAnsi="Arial" w:eastAsia="Arial" w:cs="Arial"/>
+          <w:szCs w:val="22"/>
+          <w:shd w:fill="FFFF00" w:val="clear"/>
+        </w:rPr>
+      </w:pPr>
+      <w:r>
+        <w:rPr>
+          <w:rFonts w:eastAsia="Arial" w:cs="Arial" w:ascii="Arial" w:hAnsi="Arial"/>
+          <w:szCs w:val="22"/>
+          <w:shd w:fill="FFFF00" w:val="clear"/>
+        </w:rPr>
+      </w:r>
+    </w:p>
+    <w:p>
+      <w:pPr>
+        <w:pStyle w:val="Normal"/>
+        <w:spacing w:lineRule="auto" w:line="360" w:before="0" w:after="0"/>
+        <w:jc w:val="both"/>
+        <w:rPr>
+          <w:rFonts w:ascii="Arial" w:hAnsi="Arial" w:eastAsia="Arial" w:cs="Arial"/>
+          <w:szCs w:val="22"/>
+          <w:shd w:fill="FFFF00" w:val="clear"/>
+        </w:rPr>
+      </w:pPr>
+      <w:r>
+        <w:rPr>
+          <w:rFonts w:eastAsia="Arial" w:cs="Arial" w:ascii="Arial" w:hAnsi="Arial"/>
+          <w:szCs w:val="22"/>
+          <w:shd w:fill="FFFF00" w:val="clear"/>
+        </w:rPr>
+      </w:r>
+    </w:p>
+    <w:p>
+      <w:pPr>
+        <w:pStyle w:val="Heading1"/>
+        <w:numPr>
+          <w:ilvl w:val="0"/>
+          <w:numId w:val="0"/>
+        </w:numPr>
+        <w:spacing w:lineRule="auto" w:line="360" w:before="0" w:after="180"/>
+        <w:ind w:hanging="0" w:start="-5"/>
+        <w:jc w:val="center"/>
+        <w:rPr>
+          <w:sz w:val="22"/>
+          <w:szCs w:val="22"/>
+        </w:rPr>
+      </w:pPr>
+      <w:bookmarkStart w:id="6" w:name="_Toc232530989"/>
+      <w:r>
+        <w:rPr>
+          <w:sz w:val="22"/>
           <w:szCs w:val="22"/>
         </w:rPr>
         <w:t>Anexo: Elicitación</w:t>
       </w:r>
-      <w:bookmarkEnd w:id="5"/>
+      <w:bookmarkEnd w:id="6"/>
     </w:p>
     <w:p>
       <w:pPr>
@@ -3430,7 +3378,7 @@
           <w:szCs w:val="22"/>
         </w:rPr>
       </w:pPr>
-      <w:hyperlink r:id="rId7">
+      <w:hyperlink r:id="rId8">
         <w:r>
           <w:rPr>
             <w:rStyle w:val="Style8"/>
@@ -3467,7 +3415,7 @@
           <w:szCs w:val="22"/>
         </w:rPr>
         <w:drawing>
-          <wp:anchor distT="0" distB="0" distL="0" distR="0" simplePos="0" relativeHeight="3" behindDoc="0" locked="0" layoutInCell="0" allowOverlap="1">
+          <wp:anchor distT="0" distB="0" distL="0" distR="0" simplePos="0" relativeHeight="96" behindDoc="0" locked="0" layoutInCell="0" allowOverlap="1">
             <wp:simplePos x="0" y="0"/>
             <wp:positionH relativeFrom="column">
               <wp:align>left</wp:align>
@@ -3492,7 +3440,7 @@
                     </pic:cNvPicPr>
                   </pic:nvPicPr>
                   <pic:blipFill>
-                    <a:blip r:embed="rId8"/>
+                    <a:blip r:embed="rId9"/>
                     <a:stretch>
                       <a:fillRect/>
                     </a:stretch>
@@ -3544,7 +3492,7 @@
                         <wps:spPr>
                           <a:xfrm>
                             <a:off x="0" y="0"/>
-                            <a:ext cx="41400" cy="140400"/>
+                            <a:ext cx="40680" cy="139680"/>
                           </a:xfrm>
                           <a:prstGeom prst="rect">
                             <a:avLst/>
@@ -3565,7 +3513,7 @@
                             <w:p>
                               <w:pPr>
                                 <w:pStyle w:val="Normal"/>
-                                <w:overflowPunct w:val="true"/>
+                                <w:overflowPunct w:val="false"/>
                                 <w:spacing w:lineRule="auto" w:line="240" w:before="0" w:after="0"/>
                                 <w:rPr/>
                               </w:pPr>
@@ -3588,8 +3536,8 @@
                         <wps:cNvSpPr/>
                         <wps:spPr>
                           <a:xfrm>
-                            <a:off x="5781600" y="4562640"/>
-                            <a:ext cx="41400" cy="140400"/>
+                            <a:off x="5782320" y="4563000"/>
+                            <a:ext cx="40680" cy="139680"/>
                           </a:xfrm>
                           <a:prstGeom prst="rect">
                             <a:avLst/>
@@ -3610,7 +3558,7 @@
                             <w:p>
                               <w:pPr>
                                 <w:pStyle w:val="Normal"/>
-                                <w:overflowPunct w:val="true"/>
+                                <w:overflowPunct w:val="false"/>
                                 <w:spacing w:lineRule="auto" w:line="240" w:before="0" w:after="0"/>
                                 <w:rPr/>
                               </w:pPr>
@@ -3634,7 +3582,7 @@
                           <pic:cNvPicPr/>
                         </pic:nvPicPr>
                         <pic:blipFill>
-                          <a:blip r:embed="rId9"/>
+                          <a:blip r:embed="rId10"/>
                           <a:stretch/>
                         </pic:blipFill>
                         <pic:spPr>
@@ -3656,7 +3604,7 @@
                         <wps:spPr>
                           <a:xfrm>
                             <a:off x="18360" y="200160"/>
-                            <a:ext cx="5739120" cy="720"/>
+                            <a:ext cx="5739840" cy="720"/>
                           </a:xfrm>
                           <a:prstGeom prst="line">
                             <a:avLst/>
@@ -3679,8 +3627,8 @@
                         <wps:cNvSpPr/>
                         <wps:spPr>
                           <a:xfrm>
-                            <a:off x="5757480" y="195120"/>
-                            <a:ext cx="720" cy="4449600"/>
+                            <a:off x="5758200" y="195120"/>
+                            <a:ext cx="720" cy="4450680"/>
                           </a:xfrm>
                           <a:prstGeom prst="line">
                             <a:avLst/>
@@ -3703,8 +3651,8 @@
                         <wps:cNvSpPr/>
                         <wps:spPr>
                           <a:xfrm flipH="1">
-                            <a:off x="23400" y="4645080"/>
-                            <a:ext cx="5739120" cy="720"/>
+                            <a:off x="23400" y="4645800"/>
+                            <a:ext cx="5739840" cy="720"/>
                           </a:xfrm>
                           <a:prstGeom prst="line">
                             <a:avLst/>
@@ -3728,7 +3676,7 @@
                         <wps:spPr>
                           <a:xfrm flipV="1">
                             <a:off x="23400" y="200160"/>
-                            <a:ext cx="720" cy="4449600"/>
+                            <a:ext cx="720" cy="4449960"/>
                           </a:xfrm>
                           <a:prstGeom prst="line">
                             <a:avLst/>
@@ -3755,8 +3703,8 @@
           </mc:Choice>
           <mc:Fallback>
             <w:pict>
-              <v:group id="shape_0" alt="Group 13652" style="position:absolute;margin-left:0pt;margin-top:-360.55pt;width:458.5pt;height:370.3pt" coordorigin="0,-7211" coordsize="9170,7406">
-                <v:rect id="shape_0" stroked="f" o:allowincell="f" style="position:absolute;left:0;top:-7211;width:64;height:220;mso-wrap-style:square;v-text-anchor:top">
+              <v:group id="shape_0" alt="Group 13652" style="position:absolute;margin-left:0pt;margin-top:-370.55pt;width:458.5pt;height:370.3pt" coordorigin="0,-7411" coordsize="9170,7406">
+                <v:rect id="shape_0" stroked="f" o:allowincell="f" style="position:absolute;left:0;top:-7411;width:63;height:219;mso-wrap-style:square;v-text-anchor:top;mso-position-vertical:top">
                   <v:fill o:detectmouseclick="t" on="false"/>
                   <v:stroke color="#3465a4" joinstyle="round" endcap="flat"/>
                   <v:textbox>
@@ -3764,7 +3712,7 @@
                       <w:p>
                         <w:pPr>
                           <w:pStyle w:val="Normal"/>
-                          <w:overflowPunct w:val="true"/>
+                          <w:overflowPunct w:val="false"/>
                           <w:spacing w:lineRule="auto" w:line="240" w:before="0" w:after="0"/>
                           <w:rPr/>
                         </w:pPr>
@@ -3780,7 +3728,7 @@
                   </v:textbox>
                   <w10:wrap type="square"/>
                 </v:rect>
-                <v:rect id="shape_0" stroked="f" o:allowincell="f" style="position:absolute;left:9105;top:-26;width:64;height:220;mso-wrap-style:square;v-text-anchor:top">
+                <v:rect id="shape_0" stroked="f" o:allowincell="f" style="position:absolute;left:9106;top:-225;width:63;height:219;mso-wrap-style:square;v-text-anchor:top;mso-position-vertical:top">
                   <v:fill o:detectmouseclick="t" on="false"/>
                   <v:stroke color="#3465a4" joinstyle="round" endcap="flat"/>
                   <v:textbox>
@@ -3788,7 +3736,7 @@
                       <w:p>
                         <w:pPr>
                           <w:pStyle w:val="Normal"/>
-                          <w:overflowPunct w:val="true"/>
+                          <w:overflowPunct w:val="false"/>
                           <w:spacing w:lineRule="auto" w:line="240" w:before="0" w:after="0"/>
                           <w:rPr/>
                         </w:pPr>
@@ -3823,27 +3771,27 @@
                   <v:path o:extrusionok="f" gradientshapeok="t" o:connecttype="rect"/>
                   <o:lock v:ext="edit" aspectratio="t"/>
                 </v:shapetype>
-                <v:shape id="shape_0" stroked="f" o:allowincell="f" style="position:absolute;left:45;top:-6895;width:9012;height:6981;mso-wrap-style:none;v-text-anchor:middle" type="_x0000_t75">
-                  <v:imagedata r:id="rId10" o:detectmouseclick="t"/>
+                <v:shape id="shape_0" stroked="f" o:allowincell="f" style="position:absolute;left:45;top:-7095;width:9012;height:6981;mso-wrap-style:none;v-text-anchor:middle;mso-position-vertical:top" type="_x0000_t75">
+                  <v:imagedata r:id="rId11" o:detectmouseclick="t"/>
                   <v:stroke color="#3465a4" joinstyle="round" endcap="flat"/>
                   <w10:wrap type="square"/>
                 </v:shape>
-                <v:line id="shape_0" from="29,-6896" to="9066,-6896" stroked="t" o:allowincell="f" style="position:absolute">
+                <v:line id="shape_0" from="29,-7096" to="9067,-7096" stroked="t" o:allowincell="f" style="position:absolute;mso-position-vertical:top">
                   <v:stroke color="black" joinstyle="round" endcap="flat"/>
                   <v:fill o:detectmouseclick="t" on="false"/>
                   <w10:wrap type="square"/>
                 </v:line>
-                <v:line id="shape_0" from="9067,-6903" to="9067,103" stroked="t" o:allowincell="f" style="position:absolute">
+                <v:line id="shape_0" from="9068,-7104" to="9068,-96" stroked="t" o:allowincell="f" style="position:absolute;mso-position-vertical:top">
                   <v:stroke color="black" joinstyle="round" endcap="flat"/>
                   <v:fill o:detectmouseclick="t" on="false"/>
                   <w10:wrap type="square"/>
                 </v:line>
-                <v:line id="shape_0" from="37,104" to="9074,104" stroked="t" o:allowincell="f" style="position:absolute;flip:x">
+                <v:line id="shape_0" from="37,-95" to="9075,-95" stroked="t" o:allowincell="f" style="position:absolute;flip:x;mso-position-vertical:top">
                   <v:stroke color="black" joinstyle="round" endcap="flat"/>
                   <v:fill o:detectmouseclick="t" on="false"/>
                   <w10:wrap type="square"/>
                 </v:line>
-                <v:line id="shape_0" from="37,-6896" to="37,110" stroked="t" o:allowincell="f" style="position:absolute;flip:y">
+                <v:line id="shape_0" from="37,-7096" to="37,-89" stroked="t" o:allowincell="f" style="position:absolute;flip:y;mso-position-vertical:top">
                   <v:stroke color="black" joinstyle="round" endcap="flat"/>
                   <v:fill o:detectmouseclick="t" on="false"/>
                   <w10:wrap type="square"/>
@@ -3889,8 +3837,8 @@
                         <wps:cNvSpPr/>
                         <wps:spPr>
                           <a:xfrm>
-                            <a:off x="5751720" y="3002760"/>
-                            <a:ext cx="40680" cy="141120"/>
+                            <a:off x="5752440" y="3003480"/>
+                            <a:ext cx="39960" cy="140400"/>
                           </a:xfrm>
                           <a:prstGeom prst="rect">
                             <a:avLst/>
@@ -3911,7 +3859,7 @@
                             <w:p>
                               <w:pPr>
                                 <w:pStyle w:val="Normal"/>
-                                <w:overflowPunct w:val="true"/>
+                                <w:overflowPunct w:val="false"/>
                                 <w:spacing w:lineRule="auto" w:line="240" w:before="0" w:after="0"/>
                                 <w:rPr/>
                               </w:pPr>
@@ -3934,8 +3882,8 @@
                         <wps:cNvSpPr/>
                         <wps:spPr>
                           <a:xfrm>
-                            <a:off x="0" y="3198600"/>
-                            <a:ext cx="477360" cy="141120"/>
+                            <a:off x="0" y="3198960"/>
+                            <a:ext cx="477000" cy="140400"/>
                           </a:xfrm>
                           <a:prstGeom prst="rect">
                             <a:avLst/>
@@ -3956,7 +3904,7 @@
                             <w:p>
                               <w:pPr>
                                 <w:pStyle w:val="Normal"/>
-                                <w:overflowPunct w:val="true"/>
+                                <w:overflowPunct w:val="false"/>
                                 <w:spacing w:lineRule="auto" w:line="240" w:before="0" w:after="0"/>
                                 <w:rPr/>
                               </w:pPr>
@@ -3979,8 +3927,8 @@
                         <wps:cNvSpPr/>
                         <wps:spPr>
                           <a:xfrm>
-                            <a:off x="359280" y="3198600"/>
-                            <a:ext cx="40680" cy="141120"/>
+                            <a:off x="359280" y="3198960"/>
+                            <a:ext cx="39960" cy="140400"/>
                           </a:xfrm>
                           <a:prstGeom prst="rect">
                             <a:avLst/>
@@ -4001,7 +3949,7 @@
                             <w:p>
                               <w:pPr>
                                 <w:pStyle w:val="Normal"/>
-                                <w:overflowPunct w:val="true"/>
+                                <w:overflowPunct w:val="false"/>
                                 <w:spacing w:lineRule="auto" w:line="240" w:before="0" w:after="0"/>
                                 <w:rPr/>
                               </w:pPr>
@@ -4024,8 +3972,8 @@
                         <wps:cNvSpPr/>
                         <wps:spPr>
                           <a:xfrm>
-                            <a:off x="391320" y="3198600"/>
-                            <a:ext cx="166320" cy="141120"/>
+                            <a:off x="391320" y="3198960"/>
+                            <a:ext cx="165600" cy="140400"/>
                           </a:xfrm>
                           <a:prstGeom prst="rect">
                             <a:avLst/>
@@ -4046,7 +3994,7 @@
                             <w:p>
                               <w:pPr>
                                 <w:pStyle w:val="Normal"/>
-                                <w:overflowPunct w:val="true"/>
+                                <w:overflowPunct w:val="false"/>
                                 <w:spacing w:lineRule="auto" w:line="240" w:before="0" w:after="0"/>
                                 <w:rPr/>
                               </w:pPr>
@@ -4069,8 +4017,8 @@
                         <wps:cNvSpPr/>
                         <wps:spPr>
                           <a:xfrm>
-                            <a:off x="517680" y="3198600"/>
-                            <a:ext cx="40680" cy="141120"/>
+                            <a:off x="517680" y="3198960"/>
+                            <a:ext cx="39960" cy="140400"/>
                           </a:xfrm>
                           <a:prstGeom prst="rect">
                             <a:avLst/>
@@ -4091,7 +4039,7 @@
                             <w:p>
                               <w:pPr>
                                 <w:pStyle w:val="Normal"/>
-                                <w:overflowPunct w:val="true"/>
+                                <w:overflowPunct w:val="false"/>
                                 <w:spacing w:lineRule="auto" w:line="240" w:before="0" w:after="0"/>
                                 <w:rPr/>
                               </w:pPr>
@@ -4114,8 +4062,8 @@
                         <wps:cNvSpPr/>
                         <wps:spPr>
                           <a:xfrm>
-                            <a:off x="548640" y="3198600"/>
-                            <a:ext cx="434880" cy="141120"/>
+                            <a:off x="548640" y="3198960"/>
+                            <a:ext cx="434520" cy="140400"/>
                           </a:xfrm>
                           <a:prstGeom prst="rect">
                             <a:avLst/>
@@ -4136,7 +4084,7 @@
                             <w:p>
                               <w:pPr>
                                 <w:pStyle w:val="Normal"/>
-                                <w:overflowPunct w:val="true"/>
+                                <w:overflowPunct w:val="false"/>
                                 <w:spacing w:lineRule="auto" w:line="240" w:before="0" w:after="0"/>
                                 <w:rPr/>
                               </w:pPr>
@@ -4159,8 +4107,8 @@
                         <wps:cNvSpPr/>
                         <wps:spPr>
                           <a:xfrm>
-                            <a:off x="877680" y="3198600"/>
-                            <a:ext cx="40680" cy="141120"/>
+                            <a:off x="877680" y="3198960"/>
+                            <a:ext cx="39960" cy="140400"/>
                           </a:xfrm>
                           <a:prstGeom prst="rect">
                             <a:avLst/>
@@ -4181,7 +4129,7 @@
                             <w:p>
                               <w:pPr>
                                 <w:pStyle w:val="Normal"/>
-                                <w:overflowPunct w:val="true"/>
+                                <w:overflowPunct w:val="false"/>
                                 <w:spacing w:lineRule="auto" w:line="240" w:before="0" w:after="0"/>
                                 <w:rPr/>
                               </w:pPr>
@@ -4204,8 +4152,8 @@
                         <wps:cNvSpPr/>
                         <wps:spPr>
                           <a:xfrm>
-                            <a:off x="907920" y="3198600"/>
-                            <a:ext cx="166320" cy="141120"/>
+                            <a:off x="907920" y="3198960"/>
+                            <a:ext cx="165600" cy="140400"/>
                           </a:xfrm>
                           <a:prstGeom prst="rect">
                             <a:avLst/>
@@ -4226,7 +4174,7 @@
                             <w:p>
                               <w:pPr>
                                 <w:pStyle w:val="Normal"/>
-                                <w:overflowPunct w:val="true"/>
+                                <w:overflowPunct w:val="false"/>
                                 <w:spacing w:lineRule="auto" w:line="240" w:before="0" w:after="0"/>
                                 <w:rPr/>
                               </w:pPr>
@@ -4249,8 +4197,8 @@
                         <wps:cNvSpPr/>
                         <wps:spPr>
                           <a:xfrm>
-                            <a:off x="1034280" y="3198600"/>
-                            <a:ext cx="40680" cy="141120"/>
+                            <a:off x="1034280" y="3198960"/>
+                            <a:ext cx="39960" cy="140400"/>
                           </a:xfrm>
                           <a:prstGeom prst="rect">
                             <a:avLst/>
@@ -4271,7 +4219,7 @@
                             <w:p>
                               <w:pPr>
                                 <w:pStyle w:val="Normal"/>
-                                <w:overflowPunct w:val="true"/>
+                                <w:overflowPunct w:val="false"/>
                                 <w:spacing w:lineRule="auto" w:line="240" w:before="0" w:after="0"/>
                                 <w:rPr/>
                               </w:pPr>
@@ -4294,8 +4242,8 @@
                         <wps:cNvSpPr/>
                         <wps:spPr>
                           <a:xfrm>
-                            <a:off x="1066320" y="3198600"/>
-                            <a:ext cx="754920" cy="141120"/>
+                            <a:off x="1066320" y="3198960"/>
+                            <a:ext cx="754560" cy="140400"/>
                           </a:xfrm>
                           <a:prstGeom prst="rect">
                             <a:avLst/>
@@ -4316,7 +4264,7 @@
                             <w:p>
                               <w:pPr>
                                 <w:pStyle w:val="Normal"/>
-                                <w:overflowPunct w:val="true"/>
+                                <w:overflowPunct w:val="false"/>
                                 <w:spacing w:lineRule="auto" w:line="240" w:before="0" w:after="0"/>
                                 <w:rPr/>
                               </w:pPr>
@@ -4339,8 +4287,8 @@
                         <wps:cNvSpPr/>
                         <wps:spPr>
                           <a:xfrm>
-                            <a:off x="1634400" y="3198600"/>
-                            <a:ext cx="40680" cy="141120"/>
+                            <a:off x="1634400" y="3198960"/>
+                            <a:ext cx="39960" cy="140400"/>
                           </a:xfrm>
                           <a:prstGeom prst="rect">
                             <a:avLst/>
@@ -4361,7 +4309,7 @@
                             <w:p>
                               <w:pPr>
                                 <w:pStyle w:val="Normal"/>
-                                <w:overflowPunct w:val="true"/>
+                                <w:overflowPunct w:val="false"/>
                                 <w:spacing w:lineRule="auto" w:line="240" w:before="0" w:after="0"/>
                                 <w:rPr/>
                               </w:pPr>
@@ -4384,8 +4332,8 @@
                         <wps:cNvSpPr/>
                         <wps:spPr>
                           <a:xfrm>
-                            <a:off x="1666080" y="3198600"/>
-                            <a:ext cx="544320" cy="141120"/>
+                            <a:off x="1666080" y="3198960"/>
+                            <a:ext cx="543600" cy="140400"/>
                           </a:xfrm>
                           <a:prstGeom prst="rect">
                             <a:avLst/>
@@ -4406,7 +4354,7 @@
                             <w:p>
                               <w:pPr>
                                 <w:pStyle w:val="Normal"/>
-                                <w:overflowPunct w:val="true"/>
+                                <w:overflowPunct w:val="false"/>
                                 <w:spacing w:lineRule="auto" w:line="240" w:before="0" w:after="0"/>
                                 <w:rPr/>
                               </w:pPr>
@@ -4429,8 +4377,8 @@
                         <wps:cNvSpPr/>
                         <wps:spPr>
                           <a:xfrm>
-                            <a:off x="2076480" y="3198600"/>
-                            <a:ext cx="40680" cy="141120"/>
+                            <a:off x="2076480" y="3198960"/>
+                            <a:ext cx="39960" cy="140400"/>
                           </a:xfrm>
                           <a:prstGeom prst="rect">
                             <a:avLst/>
@@ -4451,7 +4399,7 @@
                             <w:p>
                               <w:pPr>
                                 <w:pStyle w:val="Normal"/>
-                                <w:overflowPunct w:val="true"/>
+                                <w:overflowPunct w:val="false"/>
                                 <w:spacing w:lineRule="auto" w:line="240" w:before="0" w:after="0"/>
                                 <w:rPr/>
                               </w:pPr>
@@ -4474,8 +4422,8 @@
                         <wps:cNvSpPr/>
                         <wps:spPr>
                           <a:xfrm>
-                            <a:off x="4390560" y="5029200"/>
-                            <a:ext cx="40680" cy="141120"/>
+                            <a:off x="4390920" y="5029920"/>
+                            <a:ext cx="39960" cy="140400"/>
                           </a:xfrm>
                           <a:prstGeom prst="rect">
                             <a:avLst/>
@@ -4496,7 +4444,7 @@
                             <w:p>
                               <w:pPr>
                                 <w:pStyle w:val="Normal"/>
-                                <w:overflowPunct w:val="true"/>
+                                <w:overflowPunct w:val="false"/>
                                 <w:spacing w:lineRule="auto" w:line="240" w:before="0" w:after="0"/>
                                 <w:rPr/>
                               </w:pPr>
@@ -4519,8 +4467,8 @@
                         <wps:cNvSpPr/>
                         <wps:spPr>
                           <a:xfrm>
-                            <a:off x="0" y="5225400"/>
-                            <a:ext cx="653400" cy="141120"/>
+                            <a:off x="0" y="5226120"/>
+                            <a:ext cx="652680" cy="140400"/>
                           </a:xfrm>
                           <a:prstGeom prst="rect">
                             <a:avLst/>
@@ -4541,7 +4489,7 @@
                             <w:p>
                               <w:pPr>
                                 <w:pStyle w:val="Normal"/>
-                                <w:overflowPunct w:val="true"/>
+                                <w:overflowPunct w:val="false"/>
                                 <w:spacing w:lineRule="auto" w:line="240" w:before="0" w:after="0"/>
                                 <w:rPr>
                                   <w:rFonts w:ascii="Aptos" w:hAnsi="Aptos" w:eastAsia="" w:cs="" w:asciiTheme="minorHAnsi" w:cstheme="minorBidi" w:eastAsiaTheme="minorEastAsia" w:hAnsiTheme="minorHAnsi"/>
@@ -4550,7 +4498,7 @@
                               </w:pPr>
                               <w:r>
                                 <w:rPr>
-                                  <w:rFonts w:eastAsia="" w:cs="" w:cstheme="minorBidi" w:eastAsiaTheme="minorEastAsia" w:ascii="Aptos" w:hAnsi="Aptos"/>
+                                  <w:rFonts w:eastAsia="" w:cs="" w:ascii="Aptos" w:hAnsi="Aptos" w:cstheme="minorBidi" w:eastAsiaTheme="minorEastAsia"/>
                                   <w:sz w:val="18"/>
                                 </w:rPr>
                                 <w:t>Menc</w:t>
@@ -4559,7 +4507,7 @@
                             <w:p>
                               <w:pPr>
                                 <w:pStyle w:val="Normal"/>
-                                <w:overflowPunct w:val="true"/>
+                                <w:overflowPunct w:val="false"/>
                                 <w:spacing w:lineRule="auto" w:line="240" w:before="0" w:after="0"/>
                                 <w:rPr>
                                   <w:rFonts w:ascii="Aptos" w:hAnsi="Aptos" w:eastAsia="" w:cs="" w:asciiTheme="minorHAnsi" w:cstheme="minorBidi" w:eastAsiaTheme="minorEastAsia" w:hAnsiTheme="minorHAnsi"/>
@@ -4568,7 +4516,7 @@
                               </w:pPr>
                               <w:r>
                                 <w:rPr>
-                                  <w:rFonts w:eastAsia="" w:cs="" w:cstheme="minorBidi" w:eastAsiaTheme="minorEastAsia" w:ascii="Aptos" w:hAnsi="Aptos"/>
+                                  <w:rFonts w:eastAsia="" w:cs="" w:ascii="Aptos" w:hAnsi="Aptos" w:cstheme="minorBidi" w:eastAsiaTheme="minorEastAsia"/>
                                   <w:sz w:val="18"/>
                                 </w:rPr>
                                 <w:t>iona</w:t>
@@ -4585,8 +4533,8 @@
                         <wps:cNvSpPr/>
                         <wps:spPr>
                           <a:xfrm>
-                            <a:off x="492120" y="5225400"/>
-                            <a:ext cx="40680" cy="141120"/>
+                            <a:off x="492120" y="5226120"/>
+                            <a:ext cx="39960" cy="140400"/>
                           </a:xfrm>
                           <a:prstGeom prst="rect">
                             <a:avLst/>
@@ -4607,7 +4555,7 @@
                             <w:p>
                               <w:pPr>
                                 <w:pStyle w:val="Normal"/>
-                                <w:overflowPunct w:val="true"/>
+                                <w:overflowPunct w:val="false"/>
                                 <w:spacing w:lineRule="auto" w:line="240" w:before="0" w:after="0"/>
                                 <w:rPr/>
                               </w:pPr>
@@ -4630,8 +4578,8 @@
                         <wps:cNvSpPr/>
                         <wps:spPr>
                           <a:xfrm>
-                            <a:off x="523080" y="5225400"/>
-                            <a:ext cx="82080" cy="141120"/>
+                            <a:off x="523080" y="5226120"/>
+                            <a:ext cx="81360" cy="140400"/>
                           </a:xfrm>
                           <a:prstGeom prst="rect">
                             <a:avLst/>
@@ -4652,7 +4600,7 @@
                             <w:p>
                               <w:pPr>
                                 <w:pStyle w:val="Normal"/>
-                                <w:overflowPunct w:val="true"/>
+                                <w:overflowPunct w:val="false"/>
                                 <w:spacing w:lineRule="auto" w:line="240" w:before="0" w:after="0"/>
                                 <w:rPr/>
                               </w:pPr>
@@ -4675,8 +4623,8 @@
                         <wps:cNvSpPr/>
                         <wps:spPr>
                           <a:xfrm>
-                            <a:off x="586800" y="5225400"/>
-                            <a:ext cx="40680" cy="141120"/>
+                            <a:off x="586800" y="5226120"/>
+                            <a:ext cx="39960" cy="140400"/>
                           </a:xfrm>
                           <a:prstGeom prst="rect">
                             <a:avLst/>
@@ -4697,7 +4645,7 @@
                             <w:p>
                               <w:pPr>
                                 <w:pStyle w:val="Normal"/>
-                                <w:overflowPunct w:val="true"/>
+                                <w:overflowPunct w:val="false"/>
                                 <w:spacing w:lineRule="auto" w:line="240" w:before="0" w:after="0"/>
                                 <w:rPr/>
                               </w:pPr>
@@ -4720,8 +4668,8 @@
                         <wps:cNvSpPr/>
                         <wps:spPr>
                           <a:xfrm>
-                            <a:off x="618480" y="5225400"/>
-                            <a:ext cx="191880" cy="141120"/>
+                            <a:off x="618480" y="5226120"/>
+                            <a:ext cx="191160" cy="140400"/>
                           </a:xfrm>
                           <a:prstGeom prst="rect">
                             <a:avLst/>
@@ -4742,7 +4690,7 @@
                             <w:p>
                               <w:pPr>
                                 <w:pStyle w:val="Normal"/>
-                                <w:overflowPunct w:val="true"/>
+                                <w:overflowPunct w:val="false"/>
                                 <w:spacing w:lineRule="auto" w:line="240" w:before="0" w:after="0"/>
                                 <w:rPr/>
                               </w:pPr>
@@ -4765,8 +4713,8 @@
                         <wps:cNvSpPr/>
                         <wps:spPr>
                           <a:xfrm>
-                            <a:off x="763920" y="5225400"/>
-                            <a:ext cx="40680" cy="141120"/>
+                            <a:off x="763920" y="5226120"/>
+                            <a:ext cx="39960" cy="140400"/>
                           </a:xfrm>
                           <a:prstGeom prst="rect">
                             <a:avLst/>
@@ -4787,7 +4735,7 @@
                             <w:p>
                               <w:pPr>
                                 <w:pStyle w:val="Normal"/>
-                                <w:overflowPunct w:val="true"/>
+                                <w:overflowPunct w:val="false"/>
                                 <w:spacing w:lineRule="auto" w:line="240" w:before="0" w:after="0"/>
                                 <w:rPr/>
                               </w:pPr>
@@ -4810,8 +4758,8 @@
                         <wps:cNvSpPr/>
                         <wps:spPr>
                           <a:xfrm>
-                            <a:off x="794880" y="5225400"/>
-                            <a:ext cx="460440" cy="141120"/>
+                            <a:off x="794880" y="5226120"/>
+                            <a:ext cx="459720" cy="140400"/>
                           </a:xfrm>
                           <a:prstGeom prst="rect">
                             <a:avLst/>
@@ -4832,7 +4780,7 @@
                             <w:p>
                               <w:pPr>
                                 <w:pStyle w:val="Normal"/>
-                                <w:overflowPunct w:val="true"/>
+                                <w:overflowPunct w:val="false"/>
                                 <w:spacing w:lineRule="auto" w:line="240" w:before="0" w:after="0"/>
                                 <w:rPr/>
                               </w:pPr>
@@ -4855,8 +4803,8 @@
                         <wps:cNvSpPr/>
                         <wps:spPr>
                           <a:xfrm>
-                            <a:off x="1141560" y="5225400"/>
-                            <a:ext cx="40680" cy="141120"/>
+                            <a:off x="1141560" y="5226120"/>
+                            <a:ext cx="39960" cy="140400"/>
                           </a:xfrm>
                           <a:prstGeom prst="rect">
                             <a:avLst/>
@@ -4877,7 +4825,7 @@
                             <w:p>
                               <w:pPr>
                                 <w:pStyle w:val="Normal"/>
-                                <w:overflowPunct w:val="true"/>
+                                <w:overflowPunct w:val="false"/>
                                 <w:spacing w:lineRule="auto" w:line="240" w:before="0" w:after="0"/>
                                 <w:rPr/>
                               </w:pPr>
@@ -4900,8 +4848,8 @@
                         <wps:cNvSpPr/>
                         <wps:spPr>
                           <a:xfrm>
-                            <a:off x="1173600" y="5225400"/>
-                            <a:ext cx="788040" cy="141120"/>
+                            <a:off x="1173600" y="5226120"/>
+                            <a:ext cx="787320" cy="140400"/>
                           </a:xfrm>
                           <a:prstGeom prst="rect">
                             <a:avLst/>
@@ -4922,7 +4870,7 @@
                             <w:p>
                               <w:pPr>
                                 <w:pStyle w:val="Normal"/>
-                                <w:overflowPunct w:val="true"/>
+                                <w:overflowPunct w:val="false"/>
                                 <w:spacing w:lineRule="auto" w:line="240" w:before="0" w:after="0"/>
                                 <w:rPr/>
                               </w:pPr>
@@ -4945,8 +4893,8 @@
                         <wps:cNvSpPr/>
                         <wps:spPr>
                           <a:xfrm>
-                            <a:off x="1767240" y="5225400"/>
-                            <a:ext cx="40680" cy="141120"/>
+                            <a:off x="1767240" y="5226120"/>
+                            <a:ext cx="39960" cy="140400"/>
                           </a:xfrm>
                           <a:prstGeom prst="rect">
                             <a:avLst/>
@@ -4967,7 +4915,7 @@
                             <w:p>
                               <w:pPr>
                                 <w:pStyle w:val="Normal"/>
-                                <w:overflowPunct w:val="true"/>
+                                <w:overflowPunct w:val="false"/>
                                 <w:spacing w:lineRule="auto" w:line="240" w:before="0" w:after="0"/>
                                 <w:rPr/>
                               </w:pPr>
@@ -4990,8 +4938,8 @@
                         <wps:cNvSpPr/>
                         <wps:spPr>
                           <a:xfrm>
-                            <a:off x="1798920" y="5225400"/>
-                            <a:ext cx="166320" cy="141120"/>
+                            <a:off x="1798920" y="5226120"/>
+                            <a:ext cx="165600" cy="140400"/>
                           </a:xfrm>
                           <a:prstGeom prst="rect">
                             <a:avLst/>
@@ -5012,7 +4960,7 @@
                             <w:p>
                               <w:pPr>
                                 <w:pStyle w:val="Normal"/>
-                                <w:overflowPunct w:val="true"/>
+                                <w:overflowPunct w:val="false"/>
                                 <w:spacing w:lineRule="auto" w:line="240" w:before="0" w:after="0"/>
                                 <w:rPr/>
                               </w:pPr>
@@ -5035,8 +4983,8 @@
                         <wps:cNvSpPr/>
                         <wps:spPr>
                           <a:xfrm>
-                            <a:off x="1925280" y="5225400"/>
-                            <a:ext cx="40680" cy="141120"/>
+                            <a:off x="1925280" y="5226120"/>
+                            <a:ext cx="39960" cy="140400"/>
                           </a:xfrm>
                           <a:prstGeom prst="rect">
                             <a:avLst/>
@@ -5057,7 +5005,7 @@
                             <w:p>
                               <w:pPr>
                                 <w:pStyle w:val="Normal"/>
-                                <w:overflowPunct w:val="true"/>
+                                <w:overflowPunct w:val="false"/>
                                 <w:spacing w:lineRule="auto" w:line="240" w:before="0" w:after="0"/>
                                 <w:rPr/>
                               </w:pPr>
@@ -5080,8 +5028,8 @@
                         <wps:cNvSpPr/>
                         <wps:spPr>
                           <a:xfrm>
-                            <a:off x="1956960" y="5225400"/>
-                            <a:ext cx="334080" cy="141120"/>
+                            <a:off x="1956960" y="5226120"/>
+                            <a:ext cx="333360" cy="140400"/>
                           </a:xfrm>
                           <a:prstGeom prst="rect">
                             <a:avLst/>
@@ -5102,7 +5050,7 @@
                             <w:p>
                               <w:pPr>
                                 <w:pStyle w:val="Normal"/>
-                                <w:overflowPunct w:val="true"/>
+                                <w:overflowPunct w:val="false"/>
                                 <w:spacing w:lineRule="auto" w:line="240" w:before="0" w:after="0"/>
                                 <w:rPr/>
                               </w:pPr>
@@ -5125,8 +5073,8 @@
                         <wps:cNvSpPr/>
                         <wps:spPr>
                           <a:xfrm>
-                            <a:off x="2209320" y="5225400"/>
-                            <a:ext cx="40680" cy="141120"/>
+                            <a:off x="2209320" y="5226120"/>
+                            <a:ext cx="39960" cy="140400"/>
                           </a:xfrm>
                           <a:prstGeom prst="rect">
                             <a:avLst/>
@@ -5147,7 +5095,7 @@
                             <w:p>
                               <w:pPr>
                                 <w:pStyle w:val="Normal"/>
-                                <w:overflowPunct w:val="true"/>
+                                <w:overflowPunct w:val="false"/>
                                 <w:spacing w:lineRule="auto" w:line="240" w:before="0" w:after="0"/>
                                 <w:rPr/>
                               </w:pPr>
@@ -5170,8 +5118,8 @@
                         <wps:cNvSpPr/>
                         <wps:spPr>
                           <a:xfrm>
-                            <a:off x="2241000" y="5225400"/>
-                            <a:ext cx="115560" cy="141120"/>
+                            <a:off x="2241000" y="5226120"/>
+                            <a:ext cx="114840" cy="140400"/>
                           </a:xfrm>
                           <a:prstGeom prst="rect">
                             <a:avLst/>
@@ -5192,7 +5140,7 @@
                             <w:p>
                               <w:pPr>
                                 <w:pStyle w:val="Normal"/>
-                                <w:overflowPunct w:val="true"/>
+                                <w:overflowPunct w:val="false"/>
                                 <w:spacing w:lineRule="auto" w:line="240" w:before="0" w:after="0"/>
                                 <w:rPr/>
                               </w:pPr>
@@ -5215,8 +5163,8 @@
                         <wps:cNvSpPr/>
                         <wps:spPr>
                           <a:xfrm>
-                            <a:off x="2329200" y="5225400"/>
-                            <a:ext cx="40680" cy="141120"/>
+                            <a:off x="2329200" y="5226120"/>
+                            <a:ext cx="39960" cy="140400"/>
                           </a:xfrm>
                           <a:prstGeom prst="rect">
                             <a:avLst/>
@@ -5237,7 +5185,7 @@
                             <w:p>
                               <w:pPr>
                                 <w:pStyle w:val="Normal"/>
-                                <w:overflowPunct w:val="true"/>
+                                <w:overflowPunct w:val="false"/>
                                 <w:spacing w:lineRule="auto" w:line="240" w:before="0" w:after="0"/>
                                 <w:rPr/>
                               </w:pPr>
@@ -5260,8 +5208,8 @@
                         <wps:cNvSpPr/>
                         <wps:spPr>
                           <a:xfrm>
-                            <a:off x="2359800" y="5225400"/>
-                            <a:ext cx="384840" cy="141120"/>
+                            <a:off x="2359800" y="5226120"/>
+                            <a:ext cx="384120" cy="140400"/>
                           </a:xfrm>
                           <a:prstGeom prst="rect">
                             <a:avLst/>
@@ -5282,7 +5230,7 @@
                             <w:p>
                               <w:pPr>
                                 <w:pStyle w:val="Normal"/>
-                                <w:overflowPunct w:val="true"/>
+                                <w:overflowPunct w:val="false"/>
                                 <w:spacing w:lineRule="auto" w:line="240" w:before="0" w:after="0"/>
                                 <w:rPr/>
                               </w:pPr>
@@ -5305,8 +5253,8 @@
                         <wps:cNvSpPr/>
                         <wps:spPr>
                           <a:xfrm>
-                            <a:off x="2650320" y="5225400"/>
-                            <a:ext cx="40680" cy="141120"/>
+                            <a:off x="2650320" y="5226120"/>
+                            <a:ext cx="39960" cy="140400"/>
                           </a:xfrm>
                           <a:prstGeom prst="rect">
                             <a:avLst/>
@@ -5327,7 +5275,7 @@
                             <w:p>
                               <w:pPr>
                                 <w:pStyle w:val="Normal"/>
-                                <w:overflowPunct w:val="true"/>
+                                <w:overflowPunct w:val="false"/>
                                 <w:spacing w:lineRule="auto" w:line="240" w:before="0" w:after="0"/>
                                 <w:rPr/>
                               </w:pPr>
@@ -5351,7 +5299,7 @@
                           <pic:cNvPicPr/>
                         </pic:nvPicPr>
                         <pic:blipFill>
-                          <a:blip r:embed="rId11"/>
+                          <a:blip r:embed="rId12"/>
                           <a:stretch/>
                         </pic:blipFill>
                         <pic:spPr>
@@ -5377,7 +5325,7 @@
                         <wps:spPr>
                           <a:xfrm>
                             <a:off x="18360" y="4320"/>
-                            <a:ext cx="5709960" cy="720"/>
+                            <a:ext cx="5710680" cy="720"/>
                           </a:xfrm>
                           <a:prstGeom prst="line">
                             <a:avLst/>
@@ -5400,8 +5348,8 @@
                         <wps:cNvSpPr/>
                         <wps:spPr>
                           <a:xfrm>
-                            <a:off x="5728320" y="0"/>
-                            <a:ext cx="0" cy="3079800"/>
+                            <a:off x="5729040" y="0"/>
+                            <a:ext cx="720" cy="3080520"/>
                           </a:xfrm>
                           <a:prstGeom prst="line">
                             <a:avLst/>
@@ -5424,8 +5372,8 @@
                         <wps:cNvSpPr/>
                         <wps:spPr>
                           <a:xfrm flipH="1">
-                            <a:off x="23400" y="3080520"/>
-                            <a:ext cx="5709240" cy="720"/>
+                            <a:off x="23400" y="3080880"/>
+                            <a:ext cx="5709960" cy="720"/>
                           </a:xfrm>
                           <a:prstGeom prst="line">
                             <a:avLst/>
@@ -5449,7 +5397,7 @@
                         <wps:spPr>
                           <a:xfrm flipV="1">
                             <a:off x="23400" y="4320"/>
-                            <a:ext cx="720" cy="3080520"/>
+                            <a:ext cx="720" cy="3080880"/>
                           </a:xfrm>
                           <a:prstGeom prst="line">
                             <a:avLst/>
@@ -5474,13 +5422,13 @@
                           <pic:cNvPicPr/>
                         </pic:nvPicPr>
                         <pic:blipFill>
-                          <a:blip r:embed="rId12"/>
+                          <a:blip r:embed="rId13"/>
                           <a:stretch/>
                         </pic:blipFill>
                         <pic:spPr>
                           <a:xfrm>
-                            <a:off x="28080" y="3399120"/>
-                            <a:ext cx="4331880" cy="1702440"/>
+                            <a:off x="28080" y="3399840"/>
+                            <a:ext cx="4331880" cy="1701720"/>
                           </a:xfrm>
                           <a:prstGeom prst="rect">
                             <a:avLst/>
@@ -5499,8 +5447,8 @@
                         <wps:cNvSpPr/>
                         <wps:spPr>
                           <a:xfrm>
-                            <a:off x="18360" y="3394080"/>
-                            <a:ext cx="4347360" cy="720"/>
+                            <a:off x="18360" y="3394800"/>
+                            <a:ext cx="4347720" cy="720"/>
                           </a:xfrm>
                           <a:prstGeom prst="line">
                             <a:avLst/>
@@ -5523,7 +5471,7 @@
                         <wps:cNvSpPr/>
                         <wps:spPr>
                           <a:xfrm>
-                            <a:off x="4366440" y="3389040"/>
+                            <a:off x="4366800" y="3389760"/>
                             <a:ext cx="720" cy="1717560"/>
                           </a:xfrm>
                           <a:prstGeom prst="line">
@@ -5547,8 +5495,8 @@
                         <wps:cNvSpPr/>
                         <wps:spPr>
                           <a:xfrm flipH="1">
-                            <a:off x="23400" y="5107320"/>
-                            <a:ext cx="4347360" cy="720"/>
+                            <a:off x="23400" y="5108040"/>
+                            <a:ext cx="4347720" cy="720"/>
                           </a:xfrm>
                           <a:prstGeom prst="line">
                             <a:avLst/>
@@ -5571,7 +5519,7 @@
                         <wps:cNvSpPr/>
                         <wps:spPr>
                           <a:xfrm flipV="1">
-                            <a:off x="23400" y="3394080"/>
+                            <a:off x="23400" y="3394800"/>
                             <a:ext cx="720" cy="1717560"/>
                           </a:xfrm>
                           <a:prstGeom prst="line">
@@ -5600,7 +5548,7 @@
           <mc:Fallback>
             <w:pict>
               <v:group id="shape_0" alt="Group 14120" style="position:absolute;margin-left:0pt;margin-top:-423.35pt;width:456.1pt;height:422.55pt" coordorigin="0,-8467" coordsize="9122,8451">
-                <v:rect id="shape_0" stroked="f" o:allowincell="f" style="position:absolute;left:9058;top:-3738;width:63;height:221;mso-wrap-style:square;v-text-anchor:top;mso-position-vertical:top">
+                <v:rect id="shape_0" stroked="f" o:allowincell="f" style="position:absolute;left:9059;top:-3737;width:62;height:220;mso-wrap-style:square;v-text-anchor:top;mso-position-vertical:top">
                   <v:fill o:detectmouseclick="t" on="false"/>
                   <v:stroke color="#3465a4" joinstyle="round" endcap="flat"/>
                   <v:textbox>
@@ -5608,7 +5556,7 @@
                       <w:p>
                         <w:pPr>
                           <w:pStyle w:val="Normal"/>
-                          <w:overflowPunct w:val="true"/>
+                          <w:overflowPunct w:val="false"/>
                           <w:spacing w:lineRule="auto" w:line="240" w:before="0" w:after="0"/>
                           <w:rPr/>
                         </w:pPr>
@@ -5624,7 +5572,7 @@
                   </v:textbox>
                   <w10:wrap type="square"/>
                 </v:rect>
-                <v:rect id="shape_0" stroked="f" o:allowincell="f" style="position:absolute;left:0;top:-3430;width:751;height:221;mso-wrap-style:square;v-text-anchor:top;mso-position-vertical:top">
+                <v:rect id="shape_0" stroked="f" o:allowincell="f" style="position:absolute;left:0;top:-3429;width:750;height:220;mso-wrap-style:square;v-text-anchor:top;mso-position-vertical:top">
                   <v:fill o:detectmouseclick="t" on="false"/>
                   <v:stroke color="#3465a4" joinstyle="round" endcap="flat"/>
                   <v:textbox>
@@ -5632,7 +5580,7 @@
                       <w:p>
                         <w:pPr>
                           <w:pStyle w:val="Normal"/>
-                          <w:overflowPunct w:val="true"/>
+                          <w:overflowPunct w:val="false"/>
                           <w:spacing w:lineRule="auto" w:line="240" w:before="0" w:after="0"/>
                           <w:rPr/>
                         </w:pPr>
@@ -5648,7 +5596,7 @@
                   </v:textbox>
                   <w10:wrap type="square"/>
                 </v:rect>
-                <v:rect id="shape_0" stroked="f" o:allowincell="f" style="position:absolute;left:566;top:-3430;width:63;height:221;mso-wrap-style:square;v-text-anchor:top;mso-position-vertical:top">
+                <v:rect id="shape_0" stroked="f" o:allowincell="f" style="position:absolute;left:566;top:-3429;width:62;height:220;mso-wrap-style:square;v-text-anchor:top;mso-position-vertical:top">
                   <v:fill o:detectmouseclick="t" on="false"/>
                   <v:stroke color="#3465a4" joinstyle="round" endcap="flat"/>
                   <v:textbox>
@@ -5656,7 +5604,7 @@
                       <w:p>
                         <w:pPr>
                           <w:pStyle w:val="Normal"/>
-                          <w:overflowPunct w:val="true"/>
+                          <w:overflowPunct w:val="false"/>
                           <w:spacing w:lineRule="auto" w:line="240" w:before="0" w:after="0"/>
                           <w:rPr/>
                         </w:pPr>
@@ -5672,7 +5620,7 @@
                   </v:textbox>
                   <w10:wrap type="square"/>
                 </v:rect>
-                <v:rect id="shape_0" stroked="f" o:allowincell="f" style="position:absolute;left:616;top:-3430;width:261;height:221;mso-wrap-style:square;v-text-anchor:top;mso-position-vertical:top">
+                <v:rect id="shape_0" stroked="f" o:allowincell="f" style="position:absolute;left:616;top:-3429;width:260;height:220;mso-wrap-style:square;v-text-anchor:top;mso-position-vertical:top">
                   <v:fill o:detectmouseclick="t" on="false"/>
                   <v:stroke color="#3465a4" joinstyle="round" endcap="flat"/>
                   <v:textbox>
@@ -5680,7 +5628,7 @@
                       <w:p>
                         <w:pPr>
                           <w:pStyle w:val="Normal"/>
-                          <w:overflowPunct w:val="true"/>
+                          <w:overflowPunct w:val="false"/>
                           <w:spacing w:lineRule="auto" w:line="240" w:before="0" w:after="0"/>
                           <w:rPr/>
                         </w:pPr>
@@ -5696,7 +5644,7 @@
                   </v:textbox>
                   <w10:wrap type="square"/>
                 </v:rect>
-                <v:rect id="shape_0" stroked="f" o:allowincell="f" style="position:absolute;left:815;top:-3430;width:63;height:221;mso-wrap-style:square;v-text-anchor:top;mso-position-vertical:top">
+                <v:rect id="shape_0" stroked="f" o:allowincell="f" style="position:absolute;left:815;top:-3429;width:62;height:220;mso-wrap-style:square;v-text-anchor:top;mso-position-vertical:top">
                   <v:fill o:detectmouseclick="t" on="false"/>
                   <v:stroke color="#3465a4" joinstyle="round" endcap="flat"/>
                   <v:textbox>
@@ -5704,7 +5652,7 @@
                       <w:p>
                         <w:pPr>
                           <w:pStyle w:val="Normal"/>
-                          <w:overflowPunct w:val="true"/>
+                          <w:overflowPunct w:val="false"/>
                           <w:spacing w:lineRule="auto" w:line="240" w:before="0" w:after="0"/>
                           <w:rPr/>
                         </w:pPr>
@@ -5720,7 +5668,7 @@
                   </v:textbox>
                   <w10:wrap type="square"/>
                 </v:rect>
-                <v:rect id="shape_0" stroked="f" o:allowincell="f" style="position:absolute;left:864;top:-3430;width:684;height:221;mso-wrap-style:square;v-text-anchor:top;mso-position-vertical:top">
+                <v:rect id="shape_0" stroked="f" o:allowincell="f" style="position:absolute;left:864;top:-3429;width:683;height:220;mso-wrap-style:square;v-text-anchor:top;mso-position-vertical:top">
                   <v:fill o:detectmouseclick="t" on="false"/>
                   <v:stroke color="#3465a4" joinstyle="round" endcap="flat"/>
                   <v:textbox>
@@ -5728,7 +5676,7 @@
                       <w:p>
                         <w:pPr>
                           <w:pStyle w:val="Normal"/>
-                          <w:overflowPunct w:val="true"/>
+                          <w:overflowPunct w:val="false"/>
                           <w:spacing w:lineRule="auto" w:line="240" w:before="0" w:after="0"/>
                           <w:rPr/>
                         </w:pPr>
@@ -5744,7 +5692,7 @@
                   </v:textbox>
                   <w10:wrap type="square"/>
                 </v:rect>
-                <v:rect id="shape_0" stroked="f" o:allowincell="f" style="position:absolute;left:1382;top:-3430;width:63;height:221;mso-wrap-style:square;v-text-anchor:top;mso-position-vertical:top">
+                <v:rect id="shape_0" stroked="f" o:allowincell="f" style="position:absolute;left:1382;top:-3429;width:62;height:220;mso-wrap-style:square;v-text-anchor:top;mso-position-vertical:top">
                   <v:fill o:detectmouseclick="t" on="false"/>
                   <v:stroke color="#3465a4" joinstyle="round" endcap="flat"/>
                   <v:textbox>
@@ -5752,7 +5700,7 @@
                       <w:p>
                         <w:pPr>
                           <w:pStyle w:val="Normal"/>
-                          <w:overflowPunct w:val="true"/>
+                          <w:overflowPunct w:val="false"/>
                           <w:spacing w:lineRule="auto" w:line="240" w:before="0" w:after="0"/>
                           <w:rPr/>
                         </w:pPr>
@@ -5768,7 +5716,7 @@
                   </v:textbox>
                   <w10:wrap type="square"/>
                 </v:rect>
-                <v:rect id="shape_0" stroked="f" o:allowincell="f" style="position:absolute;left:1430;top:-3430;width:261;height:221;mso-wrap-style:square;v-text-anchor:top;mso-position-vertical:top">
+                <v:rect id="shape_0" stroked="f" o:allowincell="f" style="position:absolute;left:1430;top:-3429;width:260;height:220;mso-wrap-style:square;v-text-anchor:top;mso-position-vertical:top">
                   <v:fill o:detectmouseclick="t" on="false"/>
                   <v:stroke color="#3465a4" joinstyle="round" endcap="flat"/>
                   <v:textbox>
@@ -5776,7 +5724,7 @@
                       <w:p>
                         <w:pPr>
                           <w:pStyle w:val="Normal"/>
-                          <w:overflowPunct w:val="true"/>
+                          <w:overflowPunct w:val="false"/>
                           <w:spacing w:lineRule="auto" w:line="240" w:before="0" w:after="0"/>
                           <w:rPr/>
                         </w:pPr>
@@ -5792,7 +5740,7 @@
                   </v:textbox>
                   <w10:wrap type="square"/>
                 </v:rect>
-                <v:rect id="shape_0" stroked="f" o:allowincell="f" style="position:absolute;left:1629;top:-3430;width:63;height:221;mso-wrap-style:square;v-text-anchor:top;mso-position-vertical:top">
+                <v:rect id="shape_0" stroked="f" o:allowincell="f" style="position:absolute;left:1629;top:-3429;width:62;height:220;mso-wrap-style:square;v-text-anchor:top;mso-position-vertical:top">
                   <v:fill o:detectmouseclick="t" on="false"/>
                   <v:stroke color="#3465a4" joinstyle="round" endcap="flat"/>
                   <v:textbox>
@@ -5800,7 +5748,7 @@
                       <w:p>
                         <w:pPr>
                           <w:pStyle w:val="Normal"/>
-                          <w:overflowPunct w:val="true"/>
+                          <w:overflowPunct w:val="false"/>
                           <w:spacing w:lineRule="auto" w:line="240" w:before="0" w:after="0"/>
                           <w:rPr/>
                         </w:pPr>
@@ -5816,7 +5764,7 @@
                   </v:textbox>
                   <w10:wrap type="square"/>
                 </v:rect>
-                <v:rect id="shape_0" stroked="f" o:allowincell="f" style="position:absolute;left:1679;top:-3430;width:1188;height:221;mso-wrap-style:square;v-text-anchor:top;mso-position-vertical:top">
+                <v:rect id="shape_0" stroked="f" o:allowincell="f" style="position:absolute;left:1679;top:-3429;width:1187;height:220;mso-wrap-style:square;v-text-anchor:top;mso-position-vertical:top">
                   <v:fill o:detectmouseclick="t" on="false"/>
                   <v:stroke color="#3465a4" joinstyle="round" endcap="flat"/>
                   <v:textbox>
@@ -5824,7 +5772,7 @@
                       <w:p>
                         <w:pPr>
                           <w:pStyle w:val="Normal"/>
-                          <w:overflowPunct w:val="true"/>
+                          <w:overflowPunct w:val="false"/>
                           <w:spacing w:lineRule="auto" w:line="240" w:before="0" w:after="0"/>
                           <w:rPr/>
                         </w:pPr>
@@ -5840,7 +5788,7 @@
                   </v:textbox>
                   <w10:wrap type="square"/>
                 </v:rect>
-                <v:rect id="shape_0" stroked="f" o:allowincell="f" style="position:absolute;left:2574;top:-3430;width:63;height:221;mso-wrap-style:square;v-text-anchor:top;mso-position-vertical:top">
+                <v:rect id="shape_0" stroked="f" o:allowincell="f" style="position:absolute;left:2574;top:-3429;width:62;height:220;mso-wrap-style:square;v-text-anchor:top;mso-position-vertical:top">
                   <v:fill o:detectmouseclick="t" on="false"/>
                   <v:stroke color="#3465a4" joinstyle="round" endcap="flat"/>
                   <v:textbox>
@@ -5848,7 +5796,7 @@
                       <w:p>
                         <w:pPr>
                           <w:pStyle w:val="Normal"/>
-                          <w:overflowPunct w:val="true"/>
+                          <w:overflowPunct w:val="false"/>
                           <w:spacing w:lineRule="auto" w:line="240" w:before="0" w:after="0"/>
                           <w:rPr/>
                         </w:pPr>
@@ -5864,7 +5812,7 @@
                   </v:textbox>
                   <w10:wrap type="square"/>
                 </v:rect>
-                <v:rect id="shape_0" stroked="f" o:allowincell="f" style="position:absolute;left:2624;top:-3430;width:856;height:221;mso-wrap-style:square;v-text-anchor:top;mso-position-vertical:top">
+                <v:rect id="shape_0" stroked="f" o:allowincell="f" style="position:absolute;left:2624;top:-3429;width:855;height:220;mso-wrap-style:square;v-text-anchor:top;mso-position-vertical:top">
                   <v:fill o:detectmouseclick="t" on="false"/>
                   <v:stroke color="#3465a4" joinstyle="round" endcap="flat"/>
                   <v:textbox>
@@ -5872,7 +5820,7 @@
                       <w:p>
                         <w:pPr>
                           <w:pStyle w:val="Normal"/>
-                          <w:overflowPunct w:val="true"/>
+                          <w:overflowPunct w:val="false"/>
                           <w:spacing w:lineRule="auto" w:line="240" w:before="0" w:after="0"/>
                           <w:rPr/>
                         </w:pPr>
@@ -5888,7 +5836,7 @@
                   </v:textbox>
                   <w10:wrap type="square"/>
                 </v:rect>
-                <v:rect id="shape_0" stroked="f" o:allowincell="f" style="position:absolute;left:3270;top:-3430;width:63;height:221;mso-wrap-style:square;v-text-anchor:top;mso-position-vertical:top">
+                <v:rect id="shape_0" stroked="f" o:allowincell="f" style="position:absolute;left:3270;top:-3429;width:62;height:220;mso-wrap-style:square;v-text-anchor:top;mso-position-vertical:top">
                   <v:fill o:detectmouseclick="t" on="false"/>
                   <v:stroke color="#3465a4" joinstyle="round" endcap="flat"/>
                   <v:textbox>
@@ -5896,7 +5844,7 @@
                       <w:p>
                         <w:pPr>
                           <w:pStyle w:val="Normal"/>
-                          <w:overflowPunct w:val="true"/>
+                          <w:overflowPunct w:val="false"/>
                           <w:spacing w:lineRule="auto" w:line="240" w:before="0" w:after="0"/>
                           <w:rPr/>
                         </w:pPr>
@@ -5912,7 +5860,7 @@
                   </v:textbox>
                   <w10:wrap type="square"/>
                 </v:rect>
-                <v:rect id="shape_0" stroked="f" o:allowincell="f" style="position:absolute;left:6914;top:-547;width:63;height:221;mso-wrap-style:square;v-text-anchor:top;mso-position-vertical:top">
+                <v:rect id="shape_0" stroked="f" o:allowincell="f" style="position:absolute;left:6915;top:-546;width:62;height:220;mso-wrap-style:square;v-text-anchor:top;mso-position-vertical:top">
                   <v:fill o:detectmouseclick="t" on="false"/>
                   <v:stroke color="#3465a4" joinstyle="round" endcap="flat"/>
                   <v:textbox>
@@ -5920,7 +5868,7 @@
                       <w:p>
                         <w:pPr>
                           <w:pStyle w:val="Normal"/>
-                          <w:overflowPunct w:val="true"/>
+                          <w:overflowPunct w:val="false"/>
                           <w:spacing w:lineRule="auto" w:line="240" w:before="0" w:after="0"/>
                           <w:rPr/>
                         </w:pPr>
@@ -5936,7 +5884,7 @@
                   </v:textbox>
                   <w10:wrap type="square"/>
                 </v:rect>
-                <v:rect id="shape_0" stroked="f" o:allowincell="f" style="position:absolute;left:0;top:-238;width:1028;height:221;mso-wrap-style:square;v-text-anchor:top;mso-position-vertical:top">
+                <v:rect id="shape_0" stroked="f" o:allowincell="f" style="position:absolute;left:0;top:-237;width:1027;height:220;mso-wrap-style:square;v-text-anchor:top;mso-position-vertical:top">
                   <v:fill o:detectmouseclick="t" on="false"/>
                   <v:stroke color="#3465a4" joinstyle="round" endcap="flat"/>
                   <v:textbox>
@@ -5944,7 +5892,7 @@
                       <w:p>
                         <w:pPr>
                           <w:pStyle w:val="Normal"/>
-                          <w:overflowPunct w:val="true"/>
+                          <w:overflowPunct w:val="false"/>
                           <w:spacing w:lineRule="auto" w:line="240" w:before="0" w:after="0"/>
                           <w:rPr>
                             <w:rFonts w:ascii="Aptos" w:hAnsi="Aptos" w:eastAsia="" w:cs="" w:asciiTheme="minorHAnsi" w:cstheme="minorBidi" w:eastAsiaTheme="minorEastAsia" w:hAnsiTheme="minorHAnsi"/>
@@ -5953,7 +5901,7 @@
                         </w:pPr>
                         <w:r>
                           <w:rPr>
-                            <w:rFonts w:eastAsia="" w:cs="" w:cstheme="minorBidi" w:eastAsiaTheme="minorEastAsia" w:ascii="Aptos" w:hAnsi="Aptos"/>
+                            <w:rFonts w:eastAsia="" w:cs="" w:ascii="Aptos" w:hAnsi="Aptos" w:cstheme="minorBidi" w:eastAsiaTheme="minorEastAsia"/>
                             <w:sz w:val="18"/>
                           </w:rPr>
                           <w:t>Menc</w:t>
@@ -5962,7 +5910,7 @@
                       <w:p>
                         <w:pPr>
                           <w:pStyle w:val="Normal"/>
-                          <w:overflowPunct w:val="true"/>
+                          <w:overflowPunct w:val="false"/>
                           <w:spacing w:lineRule="auto" w:line="240" w:before="0" w:after="0"/>
                           <w:rPr>
                             <w:rFonts w:ascii="Aptos" w:hAnsi="Aptos" w:eastAsia="" w:cs="" w:asciiTheme="minorHAnsi" w:cstheme="minorBidi" w:eastAsiaTheme="minorEastAsia" w:hAnsiTheme="minorHAnsi"/>
@@ -5971,7 +5919,7 @@
                         </w:pPr>
                         <w:r>
                           <w:rPr>
-                            <w:rFonts w:eastAsia="" w:cs="" w:cstheme="minorBidi" w:eastAsiaTheme="minorEastAsia" w:ascii="Aptos" w:hAnsi="Aptos"/>
+                            <w:rFonts w:eastAsia="" w:cs="" w:ascii="Aptos" w:hAnsi="Aptos" w:cstheme="minorBidi" w:eastAsiaTheme="minorEastAsia"/>
                             <w:sz w:val="18"/>
                           </w:rPr>
                           <w:t>iona</w:t>
@@ -5981,7 +5929,7 @@
                   </v:textbox>
                   <w10:wrap type="square"/>
                 </v:rect>
-                <v:rect id="shape_0" stroked="f" o:allowincell="f" style="position:absolute;left:775;top:-238;width:63;height:221;mso-wrap-style:square;v-text-anchor:top;mso-position-vertical:top">
+                <v:rect id="shape_0" stroked="f" o:allowincell="f" style="position:absolute;left:775;top:-237;width:62;height:220;mso-wrap-style:square;v-text-anchor:top;mso-position-vertical:top">
                   <v:fill o:detectmouseclick="t" on="false"/>
                   <v:stroke color="#3465a4" joinstyle="round" endcap="flat"/>
                   <v:textbox>
@@ -5989,7 +5937,7 @@
                       <w:p>
                         <w:pPr>
                           <w:pStyle w:val="Normal"/>
-                          <w:overflowPunct w:val="true"/>
+                          <w:overflowPunct w:val="false"/>
                           <w:spacing w:lineRule="auto" w:line="240" w:before="0" w:after="0"/>
                           <w:rPr/>
                         </w:pPr>
@@ -6005,7 +5953,7 @@
                   </v:textbox>
                   <w10:wrap type="square"/>
                 </v:rect>
-                <v:rect id="shape_0" stroked="f" o:allowincell="f" style="position:absolute;left:824;top:-238;width:128;height:221;mso-wrap-style:square;v-text-anchor:top;mso-position-vertical:top">
+                <v:rect id="shape_0" stroked="f" o:allowincell="f" style="position:absolute;left:824;top:-237;width:127;height:220;mso-wrap-style:square;v-text-anchor:top;mso-position-vertical:top">
                   <v:fill o:detectmouseclick="t" on="false"/>
                   <v:stroke color="#3465a4" joinstyle="round" endcap="flat"/>
                   <v:textbox>
@@ -6013,7 +5961,7 @@
                       <w:p>
                         <w:pPr>
                           <w:pStyle w:val="Normal"/>
-                          <w:overflowPunct w:val="true"/>
+                          <w:overflowPunct w:val="false"/>
                           <w:spacing w:lineRule="auto" w:line="240" w:before="0" w:after="0"/>
                           <w:rPr/>
                         </w:pPr>
@@ -6029,7 +5977,7 @@
                   </v:textbox>
                   <w10:wrap type="square"/>
                 </v:rect>
-                <v:rect id="shape_0" stroked="f" o:allowincell="f" style="position:absolute;left:924;top:-238;width:63;height:221;mso-wrap-style:square;v-text-anchor:top;mso-position-vertical:top">
+                <v:rect id="shape_0" stroked="f" o:allowincell="f" style="position:absolute;left:924;top:-237;width:62;height:220;mso-wrap-style:square;v-text-anchor:top;mso-position-vertical:top">
                   <v:fill o:detectmouseclick="t" on="false"/>
                   <v:stroke color="#3465a4" joinstyle="round" endcap="flat"/>
                   <v:textbox>
@@ -6037,7 +5985,7 @@
                       <w:p>
                         <w:pPr>
                           <w:pStyle w:val="Normal"/>
-                          <w:overflowPunct w:val="true"/>
+                          <w:overflowPunct w:val="false"/>
                           <w:spacing w:lineRule="auto" w:line="240" w:before="0" w:after="0"/>
                           <w:rPr/>
                         </w:pPr>
@@ -6053,7 +6001,7 @@
                   </v:textbox>
                   <w10:wrap type="square"/>
                 </v:rect>
-                <v:rect id="shape_0" stroked="f" o:allowincell="f" style="position:absolute;left:974;top:-238;width:301;height:221;mso-wrap-style:square;v-text-anchor:top;mso-position-vertical:top">
+                <v:rect id="shape_0" stroked="f" o:allowincell="f" style="position:absolute;left:974;top:-237;width:300;height:220;mso-wrap-style:square;v-text-anchor:top;mso-position-vertical:top">
                   <v:fill o:detectmouseclick="t" on="false"/>
                   <v:stroke color="#3465a4" joinstyle="round" endcap="flat"/>
                   <v:textbox>
@@ -6061,7 +6009,7 @@
                       <w:p>
                         <w:pPr>
                           <w:pStyle w:val="Normal"/>
-                          <w:overflowPunct w:val="true"/>
+                          <w:overflowPunct w:val="false"/>
                           <w:spacing w:lineRule="auto" w:line="240" w:before="0" w:after="0"/>
                           <w:rPr/>
                         </w:pPr>
@@ -6077,7 +6025,7 @@
                   </v:textbox>
                   <w10:wrap type="square"/>
                 </v:rect>
-                <v:rect id="shape_0" stroked="f" o:allowincell="f" style="position:absolute;left:1203;top:-238;width:63;height:221;mso-wrap-style:square;v-text-anchor:top;mso-position-vertical:top">
+                <v:rect id="shape_0" stroked="f" o:allowincell="f" style="position:absolute;left:1203;top:-237;width:62;height:220;mso-wrap-style:square;v-text-anchor:top;mso-position-vertical:top">
                   <v:fill o:detectmouseclick="t" on="false"/>
                   <v:stroke color="#3465a4" joinstyle="round" endcap="flat"/>
                   <v:textbox>
@@ -6085,7 +6033,7 @@
                       <w:p>
                         <w:pPr>
                           <w:pStyle w:val="Normal"/>
-                          <w:overflowPunct w:val="true"/>
+                          <w:overflowPunct w:val="false"/>
                           <w:spacing w:lineRule="auto" w:line="240" w:before="0" w:after="0"/>
                           <w:rPr/>
                         </w:pPr>
@@ -6101,7 +6049,7 @@
                   </v:textbox>
                   <w10:wrap type="square"/>
                 </v:rect>
-                <v:rect id="shape_0" stroked="f" o:allowincell="f" style="position:absolute;left:1252;top:-238;width:724;height:221;mso-wrap-style:square;v-text-anchor:top;mso-position-vertical:top">
+                <v:rect id="shape_0" stroked="f" o:allowincell="f" style="position:absolute;left:1252;top:-237;width:723;height:220;mso-wrap-style:square;v-text-anchor:top;mso-position-vertical:top">
                   <v:fill o:detectmouseclick="t" on="false"/>
                   <v:stroke color="#3465a4" joinstyle="round" endcap="flat"/>
                   <v:textbox>
@@ -6109,7 +6057,7 @@
                       <w:p>
                         <w:pPr>
                           <w:pStyle w:val="Normal"/>
-                          <w:overflowPunct w:val="true"/>
+                          <w:overflowPunct w:val="false"/>
                           <w:spacing w:lineRule="auto" w:line="240" w:before="0" w:after="0"/>
                           <w:rPr/>
                         </w:pPr>
@@ -6125,7 +6073,7 @@
                   </v:textbox>
                   <w10:wrap type="square"/>
                 </v:rect>
-                <v:rect id="shape_0" stroked="f" o:allowincell="f" style="position:absolute;left:1798;top:-238;width:63;height:221;mso-wrap-style:square;v-text-anchor:top;mso-position-vertical:top">
+                <v:rect id="shape_0" stroked="f" o:allowincell="f" style="position:absolute;left:1798;top:-237;width:62;height:220;mso-wrap-style:square;v-text-anchor:top;mso-position-vertical:top">
                   <v:fill o:detectmouseclick="t" on="false"/>
                   <v:stroke color="#3465a4" joinstyle="round" endcap="flat"/>
                   <v:textbox>
@@ -6133,7 +6081,7 @@
                       <w:p>
                         <w:pPr>
                           <w:pStyle w:val="Normal"/>
-                          <w:overflowPunct w:val="true"/>
+                          <w:overflowPunct w:val="false"/>
                           <w:spacing w:lineRule="auto" w:line="240" w:before="0" w:after="0"/>
                           <w:rPr/>
                         </w:pPr>
@@ -6149,7 +6097,7 @@
                   </v:textbox>
                   <w10:wrap type="square"/>
                 </v:rect>
-                <v:rect id="shape_0" stroked="f" o:allowincell="f" style="position:absolute;left:1848;top:-238;width:1240;height:221;mso-wrap-style:square;v-text-anchor:top;mso-position-vertical:top">
+                <v:rect id="shape_0" stroked="f" o:allowincell="f" style="position:absolute;left:1848;top:-237;width:1239;height:220;mso-wrap-style:square;v-text-anchor:top;mso-position-vertical:top">
                   <v:fill o:detectmouseclick="t" on="false"/>
                   <v:stroke color="#3465a4" joinstyle="round" endcap="flat"/>
                   <v:textbox>
@@ -6157,7 +6105,7 @@
                       <w:p>
                         <w:pPr>
                           <w:pStyle w:val="Normal"/>
-                          <w:overflowPunct w:val="true"/>
+                          <w:overflowPunct w:val="false"/>
                           <w:spacing w:lineRule="auto" w:line="240" w:before="0" w:after="0"/>
                           <w:rPr/>
                         </w:pPr>
@@ -6173,7 +6121,7 @@
                   </v:textbox>
                   <w10:wrap type="square"/>
                 </v:rect>
-                <v:rect id="shape_0" stroked="f" o:allowincell="f" style="position:absolute;left:2783;top:-238;width:63;height:221;mso-wrap-style:square;v-text-anchor:top;mso-position-vertical:top">
+                <v:rect id="shape_0" stroked="f" o:allowincell="f" style="position:absolute;left:2783;top:-237;width:62;height:220;mso-wrap-style:square;v-text-anchor:top;mso-position-vertical:top">
                   <v:fill o:detectmouseclick="t" on="false"/>
                   <v:stroke color="#3465a4" joinstyle="round" endcap="flat"/>
                   <v:textbox>
@@ -6181,7 +6129,7 @@
                       <w:p>
                         <w:pPr>
                           <w:pStyle w:val="Normal"/>
-                          <w:overflowPunct w:val="true"/>
+                          <w:overflowPunct w:val="false"/>
                           <w:spacing w:lineRule="auto" w:line="240" w:before="0" w:after="0"/>
                           <w:rPr/>
                         </w:pPr>
@@ -6197,7 +6145,7 @@
                   </v:textbox>
                   <w10:wrap type="square"/>
                 </v:rect>
-                <v:rect id="shape_0" stroked="f" o:allowincell="f" style="position:absolute;left:2833;top:-238;width:261;height:221;mso-wrap-style:square;v-text-anchor:top;mso-position-vertical:top">
+                <v:rect id="shape_0" stroked="f" o:allowincell="f" style="position:absolute;left:2833;top:-237;width:260;height:220;mso-wrap-style:square;v-text-anchor:top;mso-position-vertical:top">
                   <v:fill o:detectmouseclick="t" on="false"/>
                   <v:stroke color="#3465a4" joinstyle="round" endcap="flat"/>
                   <v:textbox>
@@ -6205,7 +6153,7 @@
                       <w:p>
                         <w:pPr>
                           <w:pStyle w:val="Normal"/>
-                          <w:overflowPunct w:val="true"/>
+                          <w:overflowPunct w:val="false"/>
                           <w:spacing w:lineRule="auto" w:line="240" w:before="0" w:after="0"/>
                           <w:rPr/>
                         </w:pPr>
@@ -6221,7 +6169,7 @@
                   </v:textbox>
                   <w10:wrap type="square"/>
                 </v:rect>
-                <v:rect id="shape_0" stroked="f" o:allowincell="f" style="position:absolute;left:3032;top:-238;width:63;height:221;mso-wrap-style:square;v-text-anchor:top;mso-position-vertical:top">
+                <v:rect id="shape_0" stroked="f" o:allowincell="f" style="position:absolute;left:3032;top:-237;width:62;height:220;mso-wrap-style:square;v-text-anchor:top;mso-position-vertical:top">
                   <v:fill o:detectmouseclick="t" on="false"/>
                   <v:stroke color="#3465a4" joinstyle="round" endcap="flat"/>
                   <v:textbox>
@@ -6229,7 +6177,7 @@
                       <w:p>
                         <w:pPr>
                           <w:pStyle w:val="Normal"/>
-                          <w:overflowPunct w:val="true"/>
+                          <w:overflowPunct w:val="false"/>
                           <w:spacing w:lineRule="auto" w:line="240" w:before="0" w:after="0"/>
                           <w:rPr/>
                         </w:pPr>
@@ -6245,7 +6193,7 @@
                   </v:textbox>
                   <w10:wrap type="square"/>
                 </v:rect>
-                <v:rect id="shape_0" stroked="f" o:allowincell="f" style="position:absolute;left:3082;top:-238;width:525;height:221;mso-wrap-style:square;v-text-anchor:top;mso-position-vertical:top">
+                <v:rect id="shape_0" stroked="f" o:allowincell="f" style="position:absolute;left:3082;top:-237;width:524;height:220;mso-wrap-style:square;v-text-anchor:top;mso-position-vertical:top">
                   <v:fill o:detectmouseclick="t" on="false"/>
                   <v:stroke color="#3465a4" joinstyle="round" endcap="flat"/>
                   <v:textbox>
@@ -6253,7 +6201,7 @@
                       <w:p>
                         <w:pPr>
                           <w:pStyle w:val="Normal"/>
-                          <w:overflowPunct w:val="true"/>
+                          <w:overflowPunct w:val="false"/>
                           <w:spacing w:lineRule="auto" w:line="240" w:before="0" w:after="0"/>
                           <w:rPr/>
                         </w:pPr>
@@ -6269,7 +6217,7 @@
                   </v:textbox>
                   <w10:wrap type="square"/>
                 </v:rect>
-                <v:rect id="shape_0" stroked="f" o:allowincell="f" style="position:absolute;left:3479;top:-238;width:63;height:221;mso-wrap-style:square;v-text-anchor:top;mso-position-vertical:top">
+                <v:rect id="shape_0" stroked="f" o:allowincell="f" style="position:absolute;left:3479;top:-237;width:62;height:220;mso-wrap-style:square;v-text-anchor:top;mso-position-vertical:top">
                   <v:fill o:detectmouseclick="t" on="false"/>
                   <v:stroke color="#3465a4" joinstyle="round" endcap="flat"/>
                   <v:textbox>
@@ -6277,7 +6225,7 @@
                       <w:p>
                         <w:pPr>
                           <w:pStyle w:val="Normal"/>
-                          <w:overflowPunct w:val="true"/>
+                          <w:overflowPunct w:val="false"/>
                           <w:spacing w:lineRule="auto" w:line="240" w:before="0" w:after="0"/>
                           <w:rPr/>
                         </w:pPr>
@@ -6293,7 +6241,7 @@
                   </v:textbox>
                   <w10:wrap type="square"/>
                 </v:rect>
-                <v:rect id="shape_0" stroked="f" o:allowincell="f" style="position:absolute;left:3529;top:-238;width:181;height:221;mso-wrap-style:square;v-text-anchor:top;mso-position-vertical:top">
+                <v:rect id="shape_0" stroked="f" o:allowincell="f" style="position:absolute;left:3529;top:-237;width:180;height:220;mso-wrap-style:square;v-text-anchor:top;mso-position-vertical:top">
                   <v:fill o:detectmouseclick="t" on="false"/>
                   <v:stroke color="#3465a4" joinstyle="round" endcap="flat"/>
                   <v:textbox>
@@ -6301,7 +6249,7 @@
                       <w:p>
                         <w:pPr>
                           <w:pStyle w:val="Normal"/>
-                          <w:overflowPunct w:val="true"/>
+                          <w:overflowPunct w:val="false"/>
                           <w:spacing w:lineRule="auto" w:line="240" w:before="0" w:after="0"/>
                           <w:rPr/>
                         </w:pPr>
@@ -6317,7 +6265,7 @@
                   </v:textbox>
                   <w10:wrap type="square"/>
                 </v:rect>
-                <v:rect id="shape_0" stroked="f" o:allowincell="f" style="position:absolute;left:3668;top:-238;width:63;height:221;mso-wrap-style:square;v-text-anchor:top;mso-position-vertical:top">
+                <v:rect id="shape_0" stroked="f" o:allowincell="f" style="position:absolute;left:3668;top:-237;width:62;height:220;mso-wrap-style:square;v-text-anchor:top;mso-position-vertical:top">
                   <v:fill o:detectmouseclick="t" on="false"/>
                   <v:stroke color="#3465a4" joinstyle="round" endcap="flat"/>
                   <v:textbox>
@@ -6325,7 +6273,7 @@
                       <w:p>
                         <w:pPr>
                           <w:pStyle w:val="Normal"/>
-                          <w:overflowPunct w:val="true"/>
+                          <w:overflowPunct w:val="false"/>
                           <w:spacing w:lineRule="auto" w:line="240" w:before="0" w:after="0"/>
                           <w:rPr/>
                         </w:pPr>
@@ -6341,7 +6289,7 @@
                   </v:textbox>
                   <w10:wrap type="square"/>
                 </v:rect>
-                <v:rect id="shape_0" stroked="f" o:allowincell="f" style="position:absolute;left:3716;top:-238;width:605;height:221;mso-wrap-style:square;v-text-anchor:top;mso-position-vertical:top">
+                <v:rect id="shape_0" stroked="f" o:allowincell="f" style="position:absolute;left:3716;top:-237;width:604;height:220;mso-wrap-style:square;v-text-anchor:top;mso-position-vertical:top">
                   <v:fill o:detectmouseclick="t" on="false"/>
                   <v:stroke color="#3465a4" joinstyle="round" endcap="flat"/>
                   <v:textbox>
@@ -6349,7 +6297,7 @@
                       <w:p>
                         <w:pPr>
                           <w:pStyle w:val="Normal"/>
-                          <w:overflowPunct w:val="true"/>
+                          <w:overflowPunct w:val="false"/>
                           <w:spacing w:lineRule="auto" w:line="240" w:before="0" w:after="0"/>
                           <w:rPr/>
                         </w:pPr>
@@ -6365,7 +6313,7 @@
                   </v:textbox>
                   <w10:wrap type="square"/>
                 </v:rect>
-                <v:rect id="shape_0" stroked="f" o:allowincell="f" style="position:absolute;left:4174;top:-238;width:63;height:221;mso-wrap-style:square;v-text-anchor:top;mso-position-vertical:top">
+                <v:rect id="shape_0" stroked="f" o:allowincell="f" style="position:absolute;left:4174;top:-237;width:62;height:220;mso-wrap-style:square;v-text-anchor:top;mso-position-vertical:top">
                   <v:fill o:detectmouseclick="t" on="false"/>
                   <v:stroke color="#3465a4" joinstyle="round" endcap="flat"/>
                   <v:textbox>
@@ -6373,7 +6321,7 @@
                       <w:p>
                         <w:pPr>
                           <w:pStyle w:val="Normal"/>
-                          <w:overflowPunct w:val="true"/>
+                          <w:overflowPunct w:val="false"/>
                           <w:spacing w:lineRule="auto" w:line="240" w:before="0" w:after="0"/>
                           <w:rPr/>
                         </w:pPr>
@@ -6390,51 +6338,51 @@
                   <w10:wrap type="square"/>
                 </v:rect>
                 <v:shape id="shape_0" stroked="t" o:allowincell="f" style="position:absolute;left:44;top:-8452;width:8966;height:4826;mso-wrap-style:none;v-text-anchor:middle;mso-position-vertical:top" type="_x0000_t75">
-                  <v:imagedata r:id="rId13" o:detectmouseclick="t"/>
-                  <v:stroke color="black" joinstyle="miter" endcap="flat"/>
+                  <v:imagedata r:id="rId14" o:detectmouseclick="t"/>
+                  <v:stroke color="black" joinstyle="round" endcap="flat"/>
                   <w10:wrap type="square"/>
                 </v:shape>
-                <v:line id="shape_0" from="29,-8460" to="9020,-8460" stroked="t" o:allowincell="f" style="position:absolute;mso-position-vertical:top">
+                <v:line id="shape_0" from="29,-8460" to="9021,-8460" stroked="t" o:allowincell="f" style="position:absolute;mso-position-vertical:top">
                   <v:stroke color="black" joinstyle="round" endcap="flat"/>
                   <v:fill o:detectmouseclick="t" on="false"/>
                   <w10:wrap type="square"/>
                 </v:line>
-                <v:line id="shape_0" from="9021,-8467" to="9021,-3618" stroked="t" o:allowincell="f" style="position:absolute;mso-position-vertical:top">
+                <v:line id="shape_0" from="9022,-8467" to="9022,-3617" stroked="t" o:allowincell="f" style="position:absolute;mso-position-vertical:top">
                   <v:stroke color="black" joinstyle="round" endcap="flat"/>
                   <v:fill o:detectmouseclick="t" on="false"/>
                   <w10:wrap type="square"/>
                 </v:line>
-                <v:line id="shape_0" from="37,-3616" to="9027,-3616" stroked="t" o:allowincell="f" style="position:absolute;flip:x;mso-position-vertical:top">
+                <v:line id="shape_0" from="37,-3615" to="9028,-3615" stroked="t" o:allowincell="f" style="position:absolute;flip:x;mso-position-vertical:top">
                   <v:stroke color="black" joinstyle="round" endcap="flat"/>
                   <v:fill o:detectmouseclick="t" on="false"/>
                   <w10:wrap type="square"/>
                 </v:line>
-                <v:line id="shape_0" from="37,-8460" to="37,-3610" stroked="t" o:allowincell="f" style="position:absolute;flip:y;mso-position-vertical:top">
+                <v:line id="shape_0" from="37,-8460" to="37,-3609" stroked="t" o:allowincell="f" style="position:absolute;flip:y;mso-position-vertical:top">
                   <v:stroke color="black" joinstyle="round" endcap="flat"/>
                   <v:fill o:detectmouseclick="t" on="false"/>
                   <w10:wrap type="square"/>
                 </v:line>
-                <v:shape id="shape_0" stroked="t" o:allowincell="f" style="position:absolute;left:44;top:-3114;width:6821;height:2680;mso-wrap-style:none;v-text-anchor:middle;mso-position-vertical:top" type="_x0000_t75">
-                  <v:imagedata r:id="rId14" o:detectmouseclick="t"/>
-                  <v:stroke color="black" joinstyle="miter" endcap="flat"/>
+                <v:shape id="shape_0" stroked="t" o:allowincell="f" style="position:absolute;left:44;top:-3113;width:6821;height:2679;mso-wrap-style:none;v-text-anchor:middle;mso-position-vertical:top" type="_x0000_t75">
+                  <v:imagedata r:id="rId15" o:detectmouseclick="t"/>
+                  <v:stroke color="black" joinstyle="round" endcap="flat"/>
                   <w10:wrap type="square"/>
                 </v:shape>
-                <v:line id="shape_0" from="29,-3122" to="6874,-3122" stroked="t" o:allowincell="f" style="position:absolute;mso-position-vertical:top">
+                <v:line id="shape_0" from="29,-3121" to="6875,-3121" stroked="t" o:allowincell="f" style="position:absolute;mso-position-vertical:top">
                   <v:stroke color="black" joinstyle="round" endcap="flat"/>
                   <v:fill o:detectmouseclick="t" on="false"/>
                   <w10:wrap type="square"/>
                 </v:line>
-                <v:line id="shape_0" from="6876,-3130" to="6876,-426" stroked="t" o:allowincell="f" style="position:absolute;mso-position-vertical:top">
+                <v:line id="shape_0" from="6877,-3129" to="6877,-425" stroked="t" o:allowincell="f" style="position:absolute;mso-position-vertical:top">
                   <v:stroke color="black" joinstyle="round" endcap="flat"/>
                   <v:fill o:detectmouseclick="t" on="false"/>
                   <w10:wrap type="square"/>
                 </v:line>
-                <v:line id="shape_0" from="37,-424" to="6882,-424" stroked="t" o:allowincell="f" style="position:absolute;flip:x;mso-position-vertical:top">
+                <v:line id="shape_0" from="37,-423" to="6883,-423" stroked="t" o:allowincell="f" style="position:absolute;flip:x;mso-position-vertical:top">
                   <v:stroke color="black" joinstyle="round" endcap="flat"/>
                   <v:fill o:detectmouseclick="t" on="false"/>
                   <w10:wrap type="square"/>
                 </v:line>
-                <v:line id="shape_0" from="37,-3122" to="37,-418" stroked="t" o:allowincell="f" style="position:absolute;flip:y;mso-position-vertical:top">
+                <v:line id="shape_0" from="37,-3121" to="37,-417" stroked="t" o:allowincell="f" style="position:absolute;flip:y;mso-position-vertical:top">
                   <v:stroke color="black" joinstyle="round" endcap="flat"/>
                   <v:fill o:detectmouseclick="t" on="false"/>
                   <w10:wrap type="square"/>
@@ -6482,8 +6430,8 @@
                         <wps:cNvSpPr/>
                         <wps:spPr>
                           <a:xfrm>
-                            <a:off x="5781600" y="3357360"/>
-                            <a:ext cx="41400" cy="140400"/>
+                            <a:off x="5782320" y="3357720"/>
+                            <a:ext cx="40680" cy="139680"/>
                           </a:xfrm>
                           <a:prstGeom prst="rect">
                             <a:avLst/>
@@ -6504,7 +6452,7 @@
                             <w:p>
                               <w:pPr>
                                 <w:pStyle w:val="Normal"/>
-                                <w:overflowPunct w:val="true"/>
+                                <w:overflowPunct w:val="false"/>
                                 <w:spacing w:lineRule="auto" w:line="240" w:before="0" w:after="0"/>
                                 <w:rPr/>
                               </w:pPr>
@@ -6527,8 +6475,8 @@
                         <wps:cNvSpPr/>
                         <wps:spPr>
                           <a:xfrm>
-                            <a:off x="0" y="3552840"/>
-                            <a:ext cx="41400" cy="140400"/>
+                            <a:off x="0" y="3553560"/>
+                            <a:ext cx="40680" cy="139680"/>
                           </a:xfrm>
                           <a:prstGeom prst="rect">
                             <a:avLst/>
@@ -6549,7 +6497,7 @@
                             <w:p>
                               <w:pPr>
                                 <w:pStyle w:val="Normal"/>
-                                <w:overflowPunct w:val="true"/>
+                                <w:overflowPunct w:val="false"/>
                                 <w:spacing w:lineRule="auto" w:line="240" w:before="0" w:after="0"/>
                                 <w:rPr/>
                               </w:pPr>
@@ -6573,7 +6521,7 @@
                           <pic:cNvPicPr/>
                         </pic:nvPicPr>
                         <pic:blipFill>
-                          <a:blip r:embed="rId15"/>
+                          <a:blip r:embed="rId16"/>
                           <a:stretch/>
                         </pic:blipFill>
                         <pic:spPr>
@@ -6599,7 +6547,7 @@
                         <wps:spPr>
                           <a:xfrm>
                             <a:off x="18360" y="4320"/>
-                            <a:ext cx="5739120" cy="720"/>
+                            <a:ext cx="5739840" cy="720"/>
                           </a:xfrm>
                           <a:prstGeom prst="line">
                             <a:avLst/>
@@ -6622,8 +6570,8 @@
                         <wps:cNvSpPr/>
                         <wps:spPr>
                           <a:xfrm>
-                            <a:off x="5757480" y="0"/>
-                            <a:ext cx="720" cy="3439080"/>
+                            <a:off x="5758200" y="0"/>
+                            <a:ext cx="720" cy="3439800"/>
                           </a:xfrm>
                           <a:prstGeom prst="line">
                             <a:avLst/>
@@ -6646,8 +6594,8 @@
                         <wps:cNvSpPr/>
                         <wps:spPr>
                           <a:xfrm flipH="1">
-                            <a:off x="23400" y="3439800"/>
-                            <a:ext cx="5739120" cy="720"/>
+                            <a:off x="23400" y="3440520"/>
+                            <a:ext cx="5739840" cy="720"/>
                           </a:xfrm>
                           <a:prstGeom prst="line">
                             <a:avLst/>
@@ -6671,7 +6619,7 @@
                         <wps:spPr>
                           <a:xfrm flipV="1">
                             <a:off x="23400" y="4320"/>
-                            <a:ext cx="720" cy="3439800"/>
+                            <a:ext cx="720" cy="3440520"/>
                           </a:xfrm>
                           <a:prstGeom prst="line">
                             <a:avLst/>
@@ -6699,7 +6647,7 @@
           <mc:Fallback>
             <w:pict>
               <v:group id="shape_0" alt="Group 13936" style="position:absolute;margin-left:0pt;margin-top:-291.8pt;width:458.5pt;height:290.8pt" coordorigin="0,-5836" coordsize="9170,5816">
-                <v:rect id="shape_0" stroked="f" o:allowincell="f" style="position:absolute;left:9105;top:-549;width:64;height:220;mso-wrap-style:square;v-text-anchor:top;mso-position-vertical:top">
+                <v:rect id="shape_0" stroked="f" o:allowincell="f" style="position:absolute;left:9106;top:-548;width:63;height:219;mso-wrap-style:square;v-text-anchor:top;mso-position-vertical:top">
                   <v:fill o:detectmouseclick="t" on="false"/>
                   <v:stroke color="#3465a4" joinstyle="round" endcap="flat"/>
                   <v:textbox>
@@ -6707,7 +6655,7 @@
                       <w:p>
                         <w:pPr>
                           <w:pStyle w:val="Normal"/>
-                          <w:overflowPunct w:val="true"/>
+                          <w:overflowPunct w:val="false"/>
                           <w:spacing w:lineRule="auto" w:line="240" w:before="0" w:after="0"/>
                           <w:rPr/>
                         </w:pPr>
@@ -6723,7 +6671,7 @@
                   </v:textbox>
                   <w10:wrap type="square"/>
                 </v:rect>
-                <v:rect id="shape_0" stroked="f" o:allowincell="f" style="position:absolute;left:0;top:-241;width:64;height:220;mso-wrap-style:square;v-text-anchor:top;mso-position-vertical:top">
+                <v:rect id="shape_0" stroked="f" o:allowincell="f" style="position:absolute;left:0;top:-240;width:63;height:219;mso-wrap-style:square;v-text-anchor:top;mso-position-vertical:top">
                   <v:fill o:detectmouseclick="t" on="false"/>
                   <v:stroke color="#3465a4" joinstyle="round" endcap="flat"/>
                   <v:textbox>
@@ -6731,7 +6679,7 @@
                       <w:p>
                         <w:pPr>
                           <w:pStyle w:val="Normal"/>
-                          <w:overflowPunct w:val="true"/>
+                          <w:overflowPunct w:val="false"/>
                           <w:spacing w:lineRule="auto" w:line="240" w:before="0" w:after="0"/>
                           <w:rPr/>
                         </w:pPr>
@@ -6748,26 +6696,26 @@
                   <w10:wrap type="square"/>
                 </v:rect>
                 <v:shape id="shape_0" stroked="t" o:allowincell="f" style="position:absolute;left:45;top:-5828;width:9012;height:5392;mso-wrap-style:none;v-text-anchor:middle;mso-position-vertical:top" type="_x0000_t75">
-                  <v:imagedata r:id="rId16" o:detectmouseclick="t"/>
-                  <v:stroke color="black" joinstyle="miter" endcap="flat"/>
+                  <v:imagedata r:id="rId17" o:detectmouseclick="t"/>
+                  <v:stroke color="black" joinstyle="round" endcap="flat"/>
                   <w10:wrap type="square"/>
                 </v:shape>
-                <v:line id="shape_0" from="29,-5829" to="9066,-5829" stroked="t" o:allowincell="f" style="position:absolute;mso-position-vertical:top">
+                <v:line id="shape_0" from="29,-5829" to="9067,-5829" stroked="t" o:allowincell="f" style="position:absolute;mso-position-vertical:top">
                   <v:stroke color="black" joinstyle="round" endcap="flat"/>
                   <v:fill o:detectmouseclick="t" on="false"/>
                   <w10:wrap type="square"/>
                 </v:line>
-                <v:line id="shape_0" from="9067,-5836" to="9067,-421" stroked="t" o:allowincell="f" style="position:absolute;mso-position-vertical:top">
+                <v:line id="shape_0" from="9068,-5836" to="9068,-420" stroked="t" o:allowincell="f" style="position:absolute;mso-position-vertical:top">
                   <v:stroke color="black" joinstyle="round" endcap="flat"/>
                   <v:fill o:detectmouseclick="t" on="false"/>
                   <w10:wrap type="square"/>
                 </v:line>
-                <v:line id="shape_0" from="37,-419" to="9074,-419" stroked="t" o:allowincell="f" style="position:absolute;flip:x;mso-position-vertical:top">
+                <v:line id="shape_0" from="37,-418" to="9075,-418" stroked="t" o:allowincell="f" style="position:absolute;flip:x;mso-position-vertical:top">
                   <v:stroke color="black" joinstyle="round" endcap="flat"/>
                   <v:fill o:detectmouseclick="t" on="false"/>
                   <w10:wrap type="square"/>
                 </v:line>
-                <v:line id="shape_0" from="37,-5829" to="37,-413" stroked="t" o:allowincell="f" style="position:absolute;flip:y;mso-position-vertical:top">
+                <v:line id="shape_0" from="37,-5829" to="37,-412" stroked="t" o:allowincell="f" style="position:absolute;flip:y;mso-position-vertical:top">
                   <v:stroke color="black" joinstyle="round" endcap="flat"/>
                   <v:fill o:detectmouseclick="t" on="false"/>
                   <w10:wrap type="square"/>
@@ -6816,7 +6764,7 @@
           <w:szCs w:val="22"/>
         </w:rPr>
       </w:pPr>
-      <w:hyperlink r:id="rId17">
+      <w:hyperlink r:id="rId18">
         <w:r>
           <w:rPr>
             <w:rStyle w:val="Style8"/>
@@ -6898,8 +6846,8 @@
                         <wps:cNvSpPr/>
                         <wps:spPr>
                           <a:xfrm>
-                            <a:off x="5762520" y="3241800"/>
-                            <a:ext cx="41400" cy="140400"/>
+                            <a:off x="5763240" y="3242160"/>
+                            <a:ext cx="40680" cy="139680"/>
                           </a:xfrm>
                           <a:prstGeom prst="rect">
                             <a:avLst/>
@@ -6920,7 +6868,7 @@
                             <w:p>
                               <w:pPr>
                                 <w:pStyle w:val="Normal"/>
-                                <w:overflowPunct w:val="true"/>
+                                <w:overflowPunct w:val="false"/>
                                 <w:spacing w:lineRule="auto" w:line="240" w:before="0" w:after="0"/>
                                 <w:rPr/>
                               </w:pPr>
@@ -6944,7 +6892,7 @@
                           <pic:cNvPicPr/>
                         </pic:nvPicPr>
                         <pic:blipFill>
-                          <a:blip r:embed="rId18"/>
+                          <a:blip r:embed="rId19"/>
                           <a:stretch/>
                         </pic:blipFill>
                         <pic:spPr>
@@ -6970,7 +6918,7 @@
                         <wps:spPr>
                           <a:xfrm>
                             <a:off x="0" y="4320"/>
-                            <a:ext cx="5738400" cy="720"/>
+                            <a:ext cx="5739120" cy="720"/>
                           </a:xfrm>
                           <a:prstGeom prst="line">
                             <a:avLst/>
@@ -6993,8 +6941,8 @@
                         <wps:cNvSpPr/>
                         <wps:spPr>
                           <a:xfrm>
-                            <a:off x="5739120" y="0"/>
-                            <a:ext cx="0" cy="3324240"/>
+                            <a:off x="5739840" y="0"/>
+                            <a:ext cx="720" cy="3324960"/>
                           </a:xfrm>
                           <a:prstGeom prst="line">
                             <a:avLst/>
@@ -7017,8 +6965,8 @@
                         <wps:cNvSpPr/>
                         <wps:spPr>
                           <a:xfrm flipH="1">
-                            <a:off x="4320" y="3324960"/>
-                            <a:ext cx="5739120" cy="720"/>
+                            <a:off x="4320" y="3325320"/>
+                            <a:ext cx="5739840" cy="720"/>
                           </a:xfrm>
                           <a:prstGeom prst="line">
                             <a:avLst/>
@@ -7042,7 +6990,7 @@
                         <wps:spPr>
                           <a:xfrm flipV="1">
                             <a:off x="4320" y="4320"/>
-                            <a:ext cx="720" cy="3324960"/>
+                            <a:ext cx="720" cy="3325320"/>
                           </a:xfrm>
                           <a:prstGeom prst="line">
                             <a:avLst/>
@@ -7070,7 +7018,7 @@
           <mc:Fallback>
             <w:pict>
               <v:group id="shape_0" alt="Group 13937" style="position:absolute;margin-left:0pt;margin-top:-267.15pt;width:457pt;height:266.3pt" coordorigin="0,-5343" coordsize="9140,5326">
-                <v:rect id="shape_0" stroked="f" o:allowincell="f" style="position:absolute;left:9075;top:-238;width:64;height:220;mso-wrap-style:square;v-text-anchor:top;mso-position-vertical:top">
+                <v:rect id="shape_0" stroked="f" o:allowincell="f" style="position:absolute;left:9076;top:-237;width:63;height:219;mso-wrap-style:square;v-text-anchor:top;mso-position-vertical:top">
                   <v:fill o:detectmouseclick="t" on="false"/>
                   <v:stroke color="#3465a4" joinstyle="round" endcap="flat"/>
                   <v:textbox>
@@ -7078,7 +7026,7 @@
                       <w:p>
                         <w:pPr>
                           <w:pStyle w:val="Normal"/>
-                          <w:overflowPunct w:val="true"/>
+                          <w:overflowPunct w:val="false"/>
                           <w:spacing w:lineRule="auto" w:line="240" w:before="0" w:after="0"/>
                           <w:rPr/>
                         </w:pPr>
@@ -7095,26 +7043,26 @@
                   <w10:wrap type="square"/>
                 </v:rect>
                 <v:shape id="shape_0" stroked="t" o:allowincell="f" style="position:absolute;left:15;top:-5335;width:9012;height:5211;mso-wrap-style:none;v-text-anchor:middle;mso-position-vertical:top" type="_x0000_t75">
-                  <v:imagedata r:id="rId19" o:detectmouseclick="t"/>
-                  <v:stroke color="black" joinstyle="miter" endcap="flat"/>
+                  <v:imagedata r:id="rId20" o:detectmouseclick="t"/>
+                  <v:stroke color="black" joinstyle="round" endcap="flat"/>
                   <w10:wrap type="square"/>
                 </v:shape>
-                <v:line id="shape_0" from="0,-5336" to="9036,-5336" stroked="t" o:allowincell="f" style="position:absolute;mso-position-vertical:top">
+                <v:line id="shape_0" from="0,-5336" to="9037,-5336" stroked="t" o:allowincell="f" style="position:absolute;mso-position-vertical:top">
                   <v:stroke color="black" joinstyle="round" endcap="flat"/>
                   <v:fill o:detectmouseclick="t" on="false"/>
                   <w10:wrap type="square"/>
                 </v:line>
-                <v:line id="shape_0" from="9038,-5343" to="9038,-109" stroked="t" o:allowincell="f" style="position:absolute;mso-position-vertical:top">
+                <v:line id="shape_0" from="9039,-5343" to="9039,-108" stroked="t" o:allowincell="f" style="position:absolute;mso-position-vertical:top">
                   <v:stroke color="black" joinstyle="round" endcap="flat"/>
                   <v:fill o:detectmouseclick="t" on="false"/>
                   <w10:wrap type="square"/>
                 </v:line>
-                <v:line id="shape_0" from="7,-107" to="9044,-107" stroked="t" o:allowincell="f" style="position:absolute;flip:x;mso-position-vertical:top">
+                <v:line id="shape_0" from="7,-106" to="9045,-106" stroked="t" o:allowincell="f" style="position:absolute;flip:x;mso-position-vertical:top">
                   <v:stroke color="black" joinstyle="round" endcap="flat"/>
                   <v:fill o:detectmouseclick="t" on="false"/>
                   <w10:wrap type="square"/>
                 </v:line>
-                <v:line id="shape_0" from="7,-5336" to="7,-101" stroked="t" o:allowincell="f" style="position:absolute;flip:y;mso-position-vertical:top">
+                <v:line id="shape_0" from="7,-5336" to="7,-100" stroked="t" o:allowincell="f" style="position:absolute;flip:y;mso-position-vertical:top">
                   <v:stroke color="black" joinstyle="round" endcap="flat"/>
                   <v:fill o:detectmouseclick="t" on="false"/>
                   <w10:wrap type="square"/>
@@ -7190,7 +7138,7 @@
                     </pic:cNvPicPr>
                   </pic:nvPicPr>
                   <pic:blipFill>
-                    <a:blip r:embed="rId20"/>
+                    <a:blip r:embed="rId21"/>
                     <a:stretch>
                       <a:fillRect/>
                     </a:stretch>
@@ -7285,7 +7233,7 @@
                     </pic:cNvPicPr>
                   </pic:nvPicPr>
                   <pic:blipFill>
-                    <a:blip r:embed="rId21"/>
+                    <a:blip r:embed="rId22"/>
                     <a:stretch>
                       <a:fillRect/>
                     </a:stretch>
@@ -7362,7 +7310,7 @@
       </w:pPr>
       <w:r>
         <w:drawing>
-          <wp:anchor distT="0" distB="0" distL="114300" distR="114300" simplePos="0" relativeHeight="97" behindDoc="0" locked="0" layoutInCell="0" allowOverlap="1">
+          <wp:anchor distT="0" distB="0" distL="114300" distR="114300" simplePos="0" relativeHeight="98" behindDoc="0" locked="0" layoutInCell="0" allowOverlap="1">
             <wp:simplePos x="0" y="0"/>
             <wp:positionH relativeFrom="column">
               <wp:posOffset>60960</wp:posOffset>
@@ -7376,8 +7324,8 @@
               <wp:wrapPolygon edited="0">
                 <wp:start x="-1" y="0"/>
                 <wp:lineTo x="-1" y="21532"/>
-                <wp:lineTo x="21526" y="21532"/>
-                <wp:lineTo x="21526" y="0"/>
+                <wp:lineTo x="21524" y="21532"/>
+                <wp:lineTo x="21524" y="0"/>
                 <wp:lineTo x="-1" y="0"/>
               </wp:wrapPolygon>
             </wp:wrapThrough>
@@ -7395,7 +7343,7 @@
                     </pic:cNvPicPr>
                   </pic:nvPicPr>
                   <pic:blipFill>
-                    <a:blip r:embed="rId22"/>
+                    <a:blip r:embed="rId23"/>
                     <a:stretch>
                       <a:fillRect/>
                     </a:stretch>
@@ -7462,7 +7410,7 @@
           <w:szCs w:val="22"/>
         </w:rPr>
       </w:pPr>
-      <w:hyperlink r:id="rId23">
+      <w:hyperlink r:id="rId24">
         <w:r>
           <w:rPr>
             <w:rStyle w:val="Style8"/>
@@ -7538,7 +7486,7 @@
                         <wps:spPr>
                           <a:xfrm>
                             <a:off x="0" y="0"/>
-                            <a:ext cx="884520" cy="140400"/>
+                            <a:ext cx="883800" cy="139680"/>
                           </a:xfrm>
                           <a:prstGeom prst="rect">
                             <a:avLst/>
@@ -7559,7 +7507,7 @@
                             <w:p>
                               <w:pPr>
                                 <w:pStyle w:val="Normal"/>
-                                <w:overflowPunct w:val="true"/>
+                                <w:overflowPunct w:val="false"/>
                                 <w:spacing w:lineRule="auto" w:line="240" w:before="0" w:after="0"/>
                                 <w:rPr/>
                               </w:pPr>
@@ -7583,7 +7531,7 @@
                         <wps:spPr>
                           <a:xfrm>
                             <a:off x="666000" y="0"/>
-                            <a:ext cx="41400" cy="140400"/>
+                            <a:ext cx="40680" cy="139680"/>
                           </a:xfrm>
                           <a:prstGeom prst="rect">
                             <a:avLst/>
@@ -7604,7 +7552,7 @@
                             <w:p>
                               <w:pPr>
                                 <w:pStyle w:val="Normal"/>
-                                <w:overflowPunct w:val="true"/>
+                                <w:overflowPunct w:val="false"/>
                                 <w:spacing w:lineRule="auto" w:line="240" w:before="0" w:after="0"/>
                                 <w:rPr/>
                               </w:pPr>
@@ -7628,7 +7576,7 @@
                         <wps:spPr>
                           <a:xfrm>
                             <a:off x="698040" y="0"/>
-                            <a:ext cx="74880" cy="140400"/>
+                            <a:ext cx="74160" cy="139680"/>
                           </a:xfrm>
                           <a:prstGeom prst="rect">
                             <a:avLst/>
@@ -7649,7 +7597,7 @@
                             <w:p>
                               <w:pPr>
                                 <w:pStyle w:val="Normal"/>
-                                <w:overflowPunct w:val="true"/>
+                                <w:overflowPunct w:val="false"/>
                                 <w:spacing w:lineRule="auto" w:line="240" w:before="0" w:after="0"/>
                                 <w:rPr/>
                               </w:pPr>
@@ -7673,7 +7621,7 @@
                         <wps:spPr>
                           <a:xfrm>
                             <a:off x="754920" y="0"/>
-                            <a:ext cx="41400" cy="140400"/>
+                            <a:ext cx="40680" cy="139680"/>
                           </a:xfrm>
                           <a:prstGeom prst="rect">
                             <a:avLst/>
@@ -7694,7 +7642,7 @@
                             <w:p>
                               <w:pPr>
                                 <w:pStyle w:val="Normal"/>
-                                <w:overflowPunct w:val="true"/>
+                                <w:overflowPunct w:val="false"/>
                                 <w:spacing w:lineRule="auto" w:line="240" w:before="0" w:after="0"/>
                                 <w:rPr/>
                               </w:pPr>
@@ -7718,7 +7666,7 @@
                         <wps:spPr>
                           <a:xfrm>
                             <a:off x="786600" y="0"/>
-                            <a:ext cx="530280" cy="140400"/>
+                            <a:ext cx="529560" cy="139680"/>
                           </a:xfrm>
                           <a:prstGeom prst="rect">
                             <a:avLst/>
@@ -7739,7 +7687,7 @@
                             <w:p>
                               <w:pPr>
                                 <w:pStyle w:val="Normal"/>
-                                <w:overflowPunct w:val="true"/>
+                                <w:overflowPunct w:val="false"/>
                                 <w:spacing w:lineRule="auto" w:line="240" w:before="0" w:after="0"/>
                                 <w:rPr/>
                               </w:pPr>
@@ -7763,7 +7711,7 @@
                         <wps:spPr>
                           <a:xfrm>
                             <a:off x="1186200" y="0"/>
-                            <a:ext cx="41400" cy="140400"/>
+                            <a:ext cx="40680" cy="139680"/>
                           </a:xfrm>
                           <a:prstGeom prst="rect">
                             <a:avLst/>
@@ -7784,7 +7732,7 @@
                             <w:p>
                               <w:pPr>
                                 <w:pStyle w:val="Normal"/>
-                                <w:overflowPunct w:val="true"/>
+                                <w:overflowPunct w:val="false"/>
                                 <w:spacing w:lineRule="auto" w:line="240" w:before="0" w:after="0"/>
                                 <w:rPr/>
                               </w:pPr>
@@ -7808,7 +7756,7 @@
                         <wps:spPr>
                           <a:xfrm>
                             <a:off x="1217880" y="0"/>
-                            <a:ext cx="758160" cy="140400"/>
+                            <a:ext cx="757440" cy="139680"/>
                           </a:xfrm>
                           <a:prstGeom prst="rect">
                             <a:avLst/>
@@ -7829,7 +7777,7 @@
                             <w:p>
                               <w:pPr>
                                 <w:pStyle w:val="Normal"/>
-                                <w:overflowPunct w:val="true"/>
+                                <w:overflowPunct w:val="false"/>
                                 <w:spacing w:lineRule="auto" w:line="240" w:before="0" w:after="0"/>
                                 <w:rPr/>
                               </w:pPr>
@@ -7853,7 +7801,7 @@
                         <wps:spPr>
                           <a:xfrm>
                             <a:off x="1788840" y="0"/>
-                            <a:ext cx="41400" cy="140400"/>
+                            <a:ext cx="40680" cy="139680"/>
                           </a:xfrm>
                           <a:prstGeom prst="rect">
                             <a:avLst/>
@@ -7874,7 +7822,7 @@
                             <w:p>
                               <w:pPr>
                                 <w:pStyle w:val="Normal"/>
-                                <w:overflowPunct w:val="true"/>
+                                <w:overflowPunct w:val="false"/>
                                 <w:spacing w:lineRule="auto" w:line="240" w:before="0" w:after="0"/>
                                 <w:rPr/>
                               </w:pPr>
@@ -7897,8 +7845,8 @@
                         <wps:cNvSpPr/>
                         <wps:spPr>
                           <a:xfrm>
-                            <a:off x="5781600" y="2802960"/>
-                            <a:ext cx="41400" cy="139680"/>
+                            <a:off x="5782320" y="2803680"/>
+                            <a:ext cx="40680" cy="138960"/>
                           </a:xfrm>
                           <a:prstGeom prst="rect">
                             <a:avLst/>
@@ -7919,7 +7867,7 @@
                             <w:p>
                               <w:pPr>
                                 <w:pStyle w:val="Normal"/>
-                                <w:overflowPunct w:val="true"/>
+                                <w:overflowPunct w:val="false"/>
                                 <w:spacing w:lineRule="auto" w:line="240" w:before="0" w:after="0"/>
                                 <w:rPr/>
                               </w:pPr>
@@ -7942,8 +7890,8 @@
                         <wps:cNvSpPr/>
                         <wps:spPr>
                           <a:xfrm>
-                            <a:off x="0" y="2997360"/>
-                            <a:ext cx="664920" cy="140400"/>
+                            <a:off x="0" y="2997720"/>
+                            <a:ext cx="664200" cy="139680"/>
                           </a:xfrm>
                           <a:prstGeom prst="rect">
                             <a:avLst/>
@@ -7964,7 +7912,7 @@
                             <w:p>
                               <w:pPr>
                                 <w:pStyle w:val="Normal"/>
-                                <w:overflowPunct w:val="true"/>
+                                <w:overflowPunct w:val="false"/>
                                 <w:spacing w:lineRule="auto" w:line="240" w:before="0" w:after="0"/>
                                 <w:rPr/>
                               </w:pPr>
@@ -7987,8 +7935,8 @@
                         <wps:cNvSpPr/>
                         <wps:spPr>
                           <a:xfrm>
-                            <a:off x="501120" y="2997360"/>
-                            <a:ext cx="41400" cy="140400"/>
+                            <a:off x="501120" y="2997720"/>
+                            <a:ext cx="40680" cy="139680"/>
                           </a:xfrm>
                           <a:prstGeom prst="rect">
                             <a:avLst/>
@@ -8009,7 +7957,7 @@
                             <w:p>
                               <w:pPr>
                                 <w:pStyle w:val="Normal"/>
-                                <w:overflowPunct w:val="true"/>
+                                <w:overflowPunct w:val="false"/>
                                 <w:spacing w:lineRule="auto" w:line="240" w:before="0" w:after="0"/>
                                 <w:rPr/>
                               </w:pPr>
@@ -8032,8 +7980,8 @@
                         <wps:cNvSpPr/>
                         <wps:spPr>
                           <a:xfrm>
-                            <a:off x="532800" y="2997360"/>
-                            <a:ext cx="74160" cy="140400"/>
+                            <a:off x="532800" y="2997720"/>
+                            <a:ext cx="73800" cy="139680"/>
                           </a:xfrm>
                           <a:prstGeom prst="rect">
                             <a:avLst/>
@@ -8054,7 +8002,7 @@
                             <w:p>
                               <w:pPr>
                                 <w:pStyle w:val="Normal"/>
-                                <w:overflowPunct w:val="true"/>
+                                <w:overflowPunct w:val="false"/>
                                 <w:spacing w:lineRule="auto" w:line="240" w:before="0" w:after="0"/>
                                 <w:rPr/>
                               </w:pPr>
@@ -8077,8 +8025,8 @@
                         <wps:cNvSpPr/>
                         <wps:spPr>
                           <a:xfrm>
-                            <a:off x="589320" y="2997360"/>
-                            <a:ext cx="41400" cy="140400"/>
+                            <a:off x="589320" y="2997720"/>
+                            <a:ext cx="40680" cy="139680"/>
                           </a:xfrm>
                           <a:prstGeom prst="rect">
                             <a:avLst/>
@@ -8099,7 +8047,7 @@
                             <w:p>
                               <w:pPr>
                                 <w:pStyle w:val="Normal"/>
-                                <w:overflowPunct w:val="true"/>
+                                <w:overflowPunct w:val="false"/>
                                 <w:spacing w:lineRule="auto" w:line="240" w:before="0" w:after="0"/>
                                 <w:rPr/>
                               </w:pPr>
@@ -8122,8 +8070,8 @@
                         <wps:cNvSpPr/>
                         <wps:spPr>
                           <a:xfrm>
-                            <a:off x="621000" y="2997360"/>
-                            <a:ext cx="715680" cy="140400"/>
+                            <a:off x="621000" y="2997720"/>
+                            <a:ext cx="714960" cy="139680"/>
                           </a:xfrm>
                           <a:prstGeom prst="rect">
                             <a:avLst/>
@@ -8144,7 +8092,7 @@
                             <w:p>
                               <w:pPr>
                                 <w:pStyle w:val="Normal"/>
-                                <w:overflowPunct w:val="true"/>
+                                <w:overflowPunct w:val="false"/>
                                 <w:spacing w:lineRule="auto" w:line="240" w:before="0" w:after="0"/>
                                 <w:rPr/>
                               </w:pPr>
@@ -8167,8 +8115,8 @@
                         <wps:cNvSpPr/>
                         <wps:spPr>
                           <a:xfrm>
-                            <a:off x="1160640" y="2997360"/>
-                            <a:ext cx="41400" cy="140400"/>
+                            <a:off x="1160640" y="2997720"/>
+                            <a:ext cx="40680" cy="139680"/>
                           </a:xfrm>
                           <a:prstGeom prst="rect">
                             <a:avLst/>
@@ -8189,7 +8137,7 @@
                             <w:p>
                               <w:pPr>
                                 <w:pStyle w:val="Normal"/>
-                                <w:overflowPunct w:val="true"/>
+                                <w:overflowPunct w:val="false"/>
                                 <w:spacing w:lineRule="auto" w:line="240" w:before="0" w:after="0"/>
                                 <w:rPr/>
                               </w:pPr>
@@ -8213,7 +8161,7 @@
                           <pic:cNvPicPr/>
                         </pic:nvPicPr>
                         <pic:blipFill>
-                          <a:blip r:embed="rId24"/>
+                          <a:blip r:embed="rId25"/>
                           <a:stretch/>
                         </pic:blipFill>
                         <pic:spPr>
@@ -8239,7 +8187,7 @@
                         <wps:spPr>
                           <a:xfrm>
                             <a:off x="18360" y="195120"/>
-                            <a:ext cx="5739120" cy="0"/>
+                            <a:ext cx="5739840" cy="720"/>
                           </a:xfrm>
                           <a:prstGeom prst="line">
                             <a:avLst/>
@@ -8262,8 +8210,8 @@
                         <wps:cNvSpPr/>
                         <wps:spPr>
                           <a:xfrm>
-                            <a:off x="5757480" y="189720"/>
-                            <a:ext cx="720" cy="2690640"/>
+                            <a:off x="5758200" y="189720"/>
+                            <a:ext cx="720" cy="2691000"/>
                           </a:xfrm>
                           <a:prstGeom prst="line">
                             <a:avLst/>
@@ -8286,8 +8234,8 @@
                         <wps:cNvSpPr/>
                         <wps:spPr>
                           <a:xfrm flipH="1">
-                            <a:off x="23400" y="2880360"/>
-                            <a:ext cx="5739120" cy="0"/>
+                            <a:off x="23400" y="2881080"/>
+                            <a:ext cx="5739840" cy="0"/>
                           </a:xfrm>
                           <a:prstGeom prst="line">
                             <a:avLst/>
@@ -8311,7 +8259,7 @@
                         <wps:spPr>
                           <a:xfrm flipV="1">
                             <a:off x="23400" y="195120"/>
-                            <a:ext cx="720" cy="2689200"/>
+                            <a:ext cx="720" cy="2689920"/>
                           </a:xfrm>
                           <a:prstGeom prst="line">
                             <a:avLst/>
@@ -8339,7 +8287,7 @@
           <mc:Fallback>
             <w:pict>
               <v:group id="shape_0" alt="Group 13482" style="position:absolute;margin-left:0pt;margin-top:-247.15pt;width:458.5pt;height:247.05pt" coordorigin="0,-4943" coordsize="9170,4941">
-                <v:rect id="shape_0" stroked="f" o:allowincell="f" style="position:absolute;left:0;top:-4943;width:1392;height:220;mso-wrap-style:square;v-text-anchor:top;mso-position-vertical:top">
+                <v:rect id="shape_0" stroked="f" o:allowincell="f" style="position:absolute;left:0;top:-4943;width:1391;height:219;mso-wrap-style:square;v-text-anchor:top;mso-position-vertical:top">
                   <v:fill o:detectmouseclick="t" on="false"/>
                   <v:stroke color="#3465a4" joinstyle="round" endcap="flat"/>
                   <v:textbox>
@@ -8347,7 +8295,7 @@
                       <w:p>
                         <w:pPr>
                           <w:pStyle w:val="Normal"/>
-                          <w:overflowPunct w:val="true"/>
+                          <w:overflowPunct w:val="false"/>
                           <w:spacing w:lineRule="auto" w:line="240" w:before="0" w:after="0"/>
                           <w:rPr/>
                         </w:pPr>
@@ -8363,7 +8311,7 @@
                   </v:textbox>
                   <w10:wrap type="square"/>
                 </v:rect>
-                <v:rect id="shape_0" stroked="f" o:allowincell="f" style="position:absolute;left:1049;top:-4943;width:64;height:220;mso-wrap-style:square;v-text-anchor:top;mso-position-vertical:top">
+                <v:rect id="shape_0" stroked="f" o:allowincell="f" style="position:absolute;left:1049;top:-4943;width:63;height:219;mso-wrap-style:square;v-text-anchor:top;mso-position-vertical:top">
                   <v:fill o:detectmouseclick="t" on="false"/>
                   <v:stroke color="#3465a4" joinstyle="round" endcap="flat"/>
                   <v:textbox>
@@ -8371,7 +8319,7 @@
                       <w:p>
                         <w:pPr>
                           <w:pStyle w:val="Normal"/>
-                          <w:overflowPunct w:val="true"/>
+                          <w:overflowPunct w:val="false"/>
                           <w:spacing w:lineRule="auto" w:line="240" w:before="0" w:after="0"/>
                           <w:rPr/>
                         </w:pPr>
@@ -8387,7 +8335,7 @@
                   </v:textbox>
                   <w10:wrap type="square"/>
                 </v:rect>
-                <v:rect id="shape_0" stroked="f" o:allowincell="f" style="position:absolute;left:1099;top:-4943;width:117;height:220;mso-wrap-style:square;v-text-anchor:top;mso-position-vertical:top">
+                <v:rect id="shape_0" stroked="f" o:allowincell="f" style="position:absolute;left:1099;top:-4943;width:116;height:219;mso-wrap-style:square;v-text-anchor:top;mso-position-vertical:top">
                   <v:fill o:detectmouseclick="t" on="false"/>
                   <v:stroke color="#3465a4" joinstyle="round" endcap="flat"/>
                   <v:textbox>
@@ -8395,7 +8343,7 @@
                       <w:p>
                         <w:pPr>
                           <w:pStyle w:val="Normal"/>
-                          <w:overflowPunct w:val="true"/>
+                          <w:overflowPunct w:val="false"/>
                           <w:spacing w:lineRule="auto" w:line="240" w:before="0" w:after="0"/>
                           <w:rPr/>
                         </w:pPr>
@@ -8411,7 +8359,7 @@
                   </v:textbox>
                   <w10:wrap type="square"/>
                 </v:rect>
-                <v:rect id="shape_0" stroked="f" o:allowincell="f" style="position:absolute;left:1189;top:-4943;width:64;height:220;mso-wrap-style:square;v-text-anchor:top;mso-position-vertical:top">
+                <v:rect id="shape_0" stroked="f" o:allowincell="f" style="position:absolute;left:1189;top:-4943;width:63;height:219;mso-wrap-style:square;v-text-anchor:top;mso-position-vertical:top">
                   <v:fill o:detectmouseclick="t" on="false"/>
                   <v:stroke color="#3465a4" joinstyle="round" endcap="flat"/>
                   <v:textbox>
@@ -8419,7 +8367,7 @@
                       <w:p>
                         <w:pPr>
                           <w:pStyle w:val="Normal"/>
-                          <w:overflowPunct w:val="true"/>
+                          <w:overflowPunct w:val="false"/>
                           <w:spacing w:lineRule="auto" w:line="240" w:before="0" w:after="0"/>
                           <w:rPr/>
                         </w:pPr>
@@ -8435,7 +8383,7 @@
                   </v:textbox>
                   <w10:wrap type="square"/>
                 </v:rect>
-                <v:rect id="shape_0" stroked="f" o:allowincell="f" style="position:absolute;left:1239;top:-4943;width:834;height:220;mso-wrap-style:square;v-text-anchor:top;mso-position-vertical:top">
+                <v:rect id="shape_0" stroked="f" o:allowincell="f" style="position:absolute;left:1239;top:-4943;width:833;height:219;mso-wrap-style:square;v-text-anchor:top;mso-position-vertical:top">
                   <v:fill o:detectmouseclick="t" on="false"/>
                   <v:stroke color="#3465a4" joinstyle="round" endcap="flat"/>
                   <v:textbox>
@@ -8443,7 +8391,7 @@
                       <w:p>
                         <w:pPr>
                           <w:pStyle w:val="Normal"/>
-                          <w:overflowPunct w:val="true"/>
+                          <w:overflowPunct w:val="false"/>
                           <w:spacing w:lineRule="auto" w:line="240" w:before="0" w:after="0"/>
                           <w:rPr/>
                         </w:pPr>
@@ -8459,7 +8407,7 @@
                   </v:textbox>
                   <w10:wrap type="square"/>
                 </v:rect>
-                <v:rect id="shape_0" stroked="f" o:allowincell="f" style="position:absolute;left:1868;top:-4943;width:64;height:220;mso-wrap-style:square;v-text-anchor:top;mso-position-vertical:top">
+                <v:rect id="shape_0" stroked="f" o:allowincell="f" style="position:absolute;left:1868;top:-4943;width:63;height:219;mso-wrap-style:square;v-text-anchor:top;mso-position-vertical:top">
                   <v:fill o:detectmouseclick="t" on="false"/>
                   <v:stroke color="#3465a4" joinstyle="round" endcap="flat"/>
                   <v:textbox>
@@ -8467,7 +8415,7 @@
                       <w:p>
                         <w:pPr>
                           <w:pStyle w:val="Normal"/>
-                          <w:overflowPunct w:val="true"/>
+                          <w:overflowPunct w:val="false"/>
                           <w:spacing w:lineRule="auto" w:line="240" w:before="0" w:after="0"/>
                           <w:rPr/>
                         </w:pPr>
@@ -8483,7 +8431,7 @@
                   </v:textbox>
                   <w10:wrap type="square"/>
                 </v:rect>
-                <v:rect id="shape_0" stroked="f" o:allowincell="f" style="position:absolute;left:1918;top:-4943;width:1193;height:220;mso-wrap-style:square;v-text-anchor:top;mso-position-vertical:top">
+                <v:rect id="shape_0" stroked="f" o:allowincell="f" style="position:absolute;left:1918;top:-4943;width:1192;height:219;mso-wrap-style:square;v-text-anchor:top;mso-position-vertical:top">
                   <v:fill o:detectmouseclick="t" on="false"/>
                   <v:stroke color="#3465a4" joinstyle="round" endcap="flat"/>
                   <v:textbox>
@@ -8491,7 +8439,7 @@
                       <w:p>
                         <w:pPr>
                           <w:pStyle w:val="Normal"/>
-                          <w:overflowPunct w:val="true"/>
+                          <w:overflowPunct w:val="false"/>
                           <w:spacing w:lineRule="auto" w:line="240" w:before="0" w:after="0"/>
                           <w:rPr/>
                         </w:pPr>
@@ -8507,7 +8455,7 @@
                   </v:textbox>
                   <w10:wrap type="square"/>
                 </v:rect>
-                <v:rect id="shape_0" stroked="f" o:allowincell="f" style="position:absolute;left:2817;top:-4943;width:64;height:220;mso-wrap-style:square;v-text-anchor:top;mso-position-vertical:top">
+                <v:rect id="shape_0" stroked="f" o:allowincell="f" style="position:absolute;left:2817;top:-4943;width:63;height:219;mso-wrap-style:square;v-text-anchor:top;mso-position-vertical:top">
                   <v:fill o:detectmouseclick="t" on="false"/>
                   <v:stroke color="#3465a4" joinstyle="round" endcap="flat"/>
                   <v:textbox>
@@ -8515,7 +8463,7 @@
                       <w:p>
                         <w:pPr>
                           <w:pStyle w:val="Normal"/>
-                          <w:overflowPunct w:val="true"/>
+                          <w:overflowPunct w:val="false"/>
                           <w:spacing w:lineRule="auto" w:line="240" w:before="0" w:after="0"/>
                           <w:rPr/>
                         </w:pPr>
@@ -8531,7 +8479,7 @@
                   </v:textbox>
                   <w10:wrap type="square"/>
                 </v:rect>
-                <v:rect id="shape_0" stroked="f" o:allowincell="f" style="position:absolute;left:9105;top:-529;width:64;height:219;mso-wrap-style:square;v-text-anchor:top;mso-position-vertical:top">
+                <v:rect id="shape_0" stroked="f" o:allowincell="f" style="position:absolute;left:9106;top:-528;width:63;height:218;mso-wrap-style:square;v-text-anchor:top;mso-position-vertical:top">
                   <v:fill o:detectmouseclick="t" on="false"/>
                   <v:stroke color="#3465a4" joinstyle="round" endcap="flat"/>
                   <v:textbox>
@@ -8539,7 +8487,7 @@
                       <w:p>
                         <w:pPr>
                           <w:pStyle w:val="Normal"/>
-                          <w:overflowPunct w:val="true"/>
+                          <w:overflowPunct w:val="false"/>
                           <w:spacing w:lineRule="auto" w:line="240" w:before="0" w:after="0"/>
                           <w:rPr/>
                         </w:pPr>
@@ -8555,7 +8503,7 @@
                   </v:textbox>
                   <w10:wrap type="square"/>
                 </v:rect>
-                <v:rect id="shape_0" stroked="f" o:allowincell="f" style="position:absolute;left:0;top:-223;width:1046;height:220;mso-wrap-style:square;v-text-anchor:top;mso-position-vertical:top">
+                <v:rect id="shape_0" stroked="f" o:allowincell="f" style="position:absolute;left:0;top:-222;width:1045;height:219;mso-wrap-style:square;v-text-anchor:top;mso-position-vertical:top">
                   <v:fill o:detectmouseclick="t" on="false"/>
                   <v:stroke color="#3465a4" joinstyle="round" endcap="flat"/>
                   <v:textbox>
@@ -8563,7 +8511,7 @@
                       <w:p>
                         <w:pPr>
                           <w:pStyle w:val="Normal"/>
-                          <w:overflowPunct w:val="true"/>
+                          <w:overflowPunct w:val="false"/>
                           <w:spacing w:lineRule="auto" w:line="240" w:before="0" w:after="0"/>
                           <w:rPr/>
                         </w:pPr>
@@ -8579,7 +8527,7 @@
                   </v:textbox>
                   <w10:wrap type="square"/>
                 </v:rect>
-                <v:rect id="shape_0" stroked="f" o:allowincell="f" style="position:absolute;left:789;top:-223;width:64;height:220;mso-wrap-style:square;v-text-anchor:top;mso-position-vertical:top">
+                <v:rect id="shape_0" stroked="f" o:allowincell="f" style="position:absolute;left:789;top:-222;width:63;height:219;mso-wrap-style:square;v-text-anchor:top;mso-position-vertical:top">
                   <v:fill o:detectmouseclick="t" on="false"/>
                   <v:stroke color="#3465a4" joinstyle="round" endcap="flat"/>
                   <v:textbox>
@@ -8587,7 +8535,7 @@
                       <w:p>
                         <w:pPr>
                           <w:pStyle w:val="Normal"/>
-                          <w:overflowPunct w:val="true"/>
+                          <w:overflowPunct w:val="false"/>
                           <w:spacing w:lineRule="auto" w:line="240" w:before="0" w:after="0"/>
                           <w:rPr/>
                         </w:pPr>
@@ -8603,7 +8551,7 @@
                   </v:textbox>
                   <w10:wrap type="square"/>
                 </v:rect>
-                <v:rect id="shape_0" stroked="f" o:allowincell="f" style="position:absolute;left:839;top:-223;width:116;height:220;mso-wrap-style:square;v-text-anchor:top;mso-position-vertical:top">
+                <v:rect id="shape_0" stroked="f" o:allowincell="f" style="position:absolute;left:839;top:-222;width:115;height:219;mso-wrap-style:square;v-text-anchor:top;mso-position-vertical:top">
                   <v:fill o:detectmouseclick="t" on="false"/>
                   <v:stroke color="#3465a4" joinstyle="round" endcap="flat"/>
                   <v:textbox>
@@ -8611,7 +8559,7 @@
                       <w:p>
                         <w:pPr>
                           <w:pStyle w:val="Normal"/>
-                          <w:overflowPunct w:val="true"/>
+                          <w:overflowPunct w:val="false"/>
                           <w:spacing w:lineRule="auto" w:line="240" w:before="0" w:after="0"/>
                           <w:rPr/>
                         </w:pPr>
@@ -8627,7 +8575,7 @@
                   </v:textbox>
                   <w10:wrap type="square"/>
                 </v:rect>
-                <v:rect id="shape_0" stroked="f" o:allowincell="f" style="position:absolute;left:928;top:-223;width:64;height:220;mso-wrap-style:square;v-text-anchor:top;mso-position-vertical:top">
+                <v:rect id="shape_0" stroked="f" o:allowincell="f" style="position:absolute;left:928;top:-222;width:63;height:219;mso-wrap-style:square;v-text-anchor:top;mso-position-vertical:top">
                   <v:fill o:detectmouseclick="t" on="false"/>
                   <v:stroke color="#3465a4" joinstyle="round" endcap="flat"/>
                   <v:textbox>
@@ -8635,7 +8583,7 @@
                       <w:p>
                         <w:pPr>
                           <w:pStyle w:val="Normal"/>
-                          <w:overflowPunct w:val="true"/>
+                          <w:overflowPunct w:val="false"/>
                           <w:spacing w:lineRule="auto" w:line="240" w:before="0" w:after="0"/>
                           <w:rPr/>
                         </w:pPr>
@@ -8651,7 +8599,7 @@
                   </v:textbox>
                   <w10:wrap type="square"/>
                 </v:rect>
-                <v:rect id="shape_0" stroked="f" o:allowincell="f" style="position:absolute;left:978;top:-223;width:1126;height:220;mso-wrap-style:square;v-text-anchor:top;mso-position-vertical:top">
+                <v:rect id="shape_0" stroked="f" o:allowincell="f" style="position:absolute;left:978;top:-222;width:1125;height:219;mso-wrap-style:square;v-text-anchor:top;mso-position-vertical:top">
                   <v:fill o:detectmouseclick="t" on="false"/>
                   <v:stroke color="#3465a4" joinstyle="round" endcap="flat"/>
                   <v:textbox>
@@ -8659,7 +8607,7 @@
                       <w:p>
                         <w:pPr>
                           <w:pStyle w:val="Normal"/>
-                          <w:overflowPunct w:val="true"/>
+                          <w:overflowPunct w:val="false"/>
                           <w:spacing w:lineRule="auto" w:line="240" w:before="0" w:after="0"/>
                           <w:rPr/>
                         </w:pPr>
@@ -8675,7 +8623,7 @@
                   </v:textbox>
                   <w10:wrap type="square"/>
                 </v:rect>
-                <v:rect id="shape_0" stroked="f" o:allowincell="f" style="position:absolute;left:1828;top:-223;width:64;height:220;mso-wrap-style:square;v-text-anchor:top;mso-position-vertical:top">
+                <v:rect id="shape_0" stroked="f" o:allowincell="f" style="position:absolute;left:1828;top:-222;width:63;height:219;mso-wrap-style:square;v-text-anchor:top;mso-position-vertical:top">
                   <v:fill o:detectmouseclick="t" on="false"/>
                   <v:stroke color="#3465a4" joinstyle="round" endcap="flat"/>
                   <v:textbox>
@@ -8683,7 +8631,7 @@
                       <w:p>
                         <w:pPr>
                           <w:pStyle w:val="Normal"/>
-                          <w:overflowPunct w:val="true"/>
+                          <w:overflowPunct w:val="false"/>
                           <w:spacing w:lineRule="auto" w:line="240" w:before="0" w:after="0"/>
                           <w:rPr/>
                         </w:pPr>
@@ -8700,26 +8648,26 @@
                   <w10:wrap type="square"/>
                 </v:rect>
                 <v:shape id="shape_0" stroked="t" o:allowincell="f" style="position:absolute;left:45;top:-4629;width:9012;height:4212;mso-wrap-style:none;v-text-anchor:middle;mso-position-vertical:top" type="_x0000_t75">
-                  <v:imagedata r:id="rId25" o:detectmouseclick="t"/>
-                  <v:stroke color="black" joinstyle="miter" endcap="flat"/>
+                  <v:imagedata r:id="rId26" o:detectmouseclick="t"/>
+                  <v:stroke color="black" joinstyle="round" endcap="flat"/>
                   <w10:wrap type="square"/>
                 </v:shape>
-                <v:line id="shape_0" from="29,-4636" to="9066,-4636" stroked="t" o:allowincell="f" style="position:absolute;mso-position-vertical:top">
+                <v:line id="shape_0" from="29,-4636" to="9067,-4636" stroked="t" o:allowincell="f" style="position:absolute;mso-position-vertical:top">
                   <v:stroke color="black" joinstyle="round" endcap="flat"/>
                   <v:fill o:detectmouseclick="t" on="false"/>
                   <w10:wrap type="square"/>
                 </v:line>
-                <v:line id="shape_0" from="9067,-4644" to="9067,-408" stroked="t" o:allowincell="f" style="position:absolute;mso-position-vertical:top">
+                <v:line id="shape_0" from="9068,-4644" to="9068,-407" stroked="t" o:allowincell="f" style="position:absolute;mso-position-vertical:top">
                   <v:stroke color="black" joinstyle="round" endcap="flat"/>
                   <v:fill o:detectmouseclick="t" on="false"/>
                   <w10:wrap type="square"/>
                 </v:line>
-                <v:line id="shape_0" from="37,-407" to="9074,-407" stroked="t" o:allowincell="f" style="position:absolute;flip:x;mso-position-vertical:top">
+                <v:line id="shape_0" from="37,-406" to="9075,-406" stroked="t" o:allowincell="f" style="position:absolute;flip:x;mso-position-vertical:top">
                   <v:stroke color="black" joinstyle="round" endcap="flat"/>
                   <v:fill o:detectmouseclick="t" on="false"/>
                   <w10:wrap type="square"/>
                 </v:line>
-                <v:line id="shape_0" from="37,-4636" to="37,-402" stroked="t" o:allowincell="f" style="position:absolute;flip:y;mso-position-vertical:top">
+                <v:line id="shape_0" from="37,-4636" to="37,-401" stroked="t" o:allowincell="f" style="position:absolute;flip:y;mso-position-vertical:top">
                   <v:stroke color="black" joinstyle="round" endcap="flat"/>
                   <v:fill o:detectmouseclick="t" on="false"/>
                   <w10:wrap type="square"/>
@@ -8767,8 +8715,8 @@
                         <wps:cNvSpPr/>
                         <wps:spPr>
                           <a:xfrm>
-                            <a:off x="5781600" y="2463120"/>
-                            <a:ext cx="41400" cy="139680"/>
+                            <a:off x="5782320" y="2463840"/>
+                            <a:ext cx="40680" cy="138960"/>
                           </a:xfrm>
                           <a:prstGeom prst="rect">
                             <a:avLst/>
@@ -8789,7 +8737,7 @@
                             <w:p>
                               <w:pPr>
                                 <w:pStyle w:val="Normal"/>
-                                <w:overflowPunct w:val="true"/>
+                                <w:overflowPunct w:val="false"/>
                                 <w:spacing w:lineRule="auto" w:line="240" w:before="0" w:after="0"/>
                                 <w:rPr/>
                               </w:pPr>
@@ -8812,8 +8760,8 @@
                         <wps:cNvSpPr/>
                         <wps:spPr>
                           <a:xfrm>
-                            <a:off x="0" y="2658240"/>
-                            <a:ext cx="41400" cy="139680"/>
+                            <a:off x="0" y="2658600"/>
+                            <a:ext cx="40680" cy="138960"/>
                           </a:xfrm>
                           <a:prstGeom prst="rect">
                             <a:avLst/>
@@ -8834,7 +8782,7 @@
                             <w:p>
                               <w:pPr>
                                 <w:pStyle w:val="Normal"/>
-                                <w:overflowPunct w:val="true"/>
+                                <w:overflowPunct w:val="false"/>
                                 <w:spacing w:lineRule="auto" w:line="240" w:before="0" w:after="0"/>
                                 <w:rPr/>
                               </w:pPr>
@@ -8858,7 +8806,7 @@
                           <pic:cNvPicPr/>
                         </pic:nvPicPr>
                         <pic:blipFill>
-                          <a:blip r:embed="rId26"/>
+                          <a:blip r:embed="rId27"/>
                           <a:stretch/>
                         </pic:blipFill>
                         <pic:spPr>
@@ -8884,7 +8832,7 @@
                         <wps:spPr>
                           <a:xfrm>
                             <a:off x="18360" y="4320"/>
-                            <a:ext cx="5739120" cy="720"/>
+                            <a:ext cx="5739840" cy="720"/>
                           </a:xfrm>
                           <a:prstGeom prst="line">
                             <a:avLst/>
@@ -8907,8 +8855,8 @@
                         <wps:cNvSpPr/>
                         <wps:spPr>
                           <a:xfrm>
-                            <a:off x="5757480" y="0"/>
-                            <a:ext cx="720" cy="2544480"/>
+                            <a:off x="5758200" y="0"/>
+                            <a:ext cx="720" cy="2545200"/>
                           </a:xfrm>
                           <a:prstGeom prst="line">
                             <a:avLst/>
@@ -8931,8 +8879,8 @@
                         <wps:cNvSpPr/>
                         <wps:spPr>
                           <a:xfrm flipH="1">
-                            <a:off x="23400" y="2545560"/>
-                            <a:ext cx="5739120" cy="0"/>
+                            <a:off x="23400" y="2546280"/>
+                            <a:ext cx="5739840" cy="0"/>
                           </a:xfrm>
                           <a:prstGeom prst="line">
                             <a:avLst/>
@@ -8956,7 +8904,7 @@
                         <wps:spPr>
                           <a:xfrm flipV="1">
                             <a:off x="23400" y="4320"/>
-                            <a:ext cx="720" cy="2545200"/>
+                            <a:ext cx="720" cy="2545560"/>
                           </a:xfrm>
                           <a:prstGeom prst="line">
                             <a:avLst/>
@@ -8984,7 +8932,7 @@
           <mc:Fallback>
             <w:pict>
               <v:group id="shape_0" alt="Group 14340" style="position:absolute;margin-left:0pt;margin-top:-221.3pt;width:458.5pt;height:220.3pt" coordorigin="0,-4426" coordsize="9170,4406">
-                <v:rect id="shape_0" stroked="f" o:allowincell="f" style="position:absolute;left:9105;top:-547;width:64;height:219;mso-wrap-style:square;v-text-anchor:top;mso-position-vertical:top">
+                <v:rect id="shape_0" stroked="f" o:allowincell="f" style="position:absolute;left:9106;top:-546;width:63;height:218;mso-wrap-style:square;v-text-anchor:top;mso-position-vertical:top">
                   <v:fill o:detectmouseclick="t" on="false"/>
                   <v:stroke color="#3465a4" joinstyle="round" endcap="flat"/>
                   <v:textbox>
@@ -8992,7 +8940,7 @@
                       <w:p>
                         <w:pPr>
                           <w:pStyle w:val="Normal"/>
-                          <w:overflowPunct w:val="true"/>
+                          <w:overflowPunct w:val="false"/>
                           <w:spacing w:lineRule="auto" w:line="240" w:before="0" w:after="0"/>
                           <w:rPr/>
                         </w:pPr>
@@ -9008,7 +8956,7 @@
                   </v:textbox>
                   <w10:wrap type="square"/>
                 </v:rect>
-                <v:rect id="shape_0" stroked="f" o:allowincell="f" style="position:absolute;left:0;top:-240;width:64;height:219;mso-wrap-style:square;v-text-anchor:top;mso-position-vertical:top">
+                <v:rect id="shape_0" stroked="f" o:allowincell="f" style="position:absolute;left:0;top:-239;width:63;height:218;mso-wrap-style:square;v-text-anchor:top;mso-position-vertical:top">
                   <v:fill o:detectmouseclick="t" on="false"/>
                   <v:stroke color="#3465a4" joinstyle="round" endcap="flat"/>
                   <v:textbox>
@@ -9016,7 +8964,7 @@
                       <w:p>
                         <w:pPr>
                           <w:pStyle w:val="Normal"/>
-                          <w:overflowPunct w:val="true"/>
+                          <w:overflowPunct w:val="false"/>
                           <w:spacing w:lineRule="auto" w:line="240" w:before="0" w:after="0"/>
                           <w:rPr/>
                         </w:pPr>
@@ -9033,26 +8981,26 @@
                   <w10:wrap type="square"/>
                 </v:rect>
                 <v:shape id="shape_0" stroked="t" o:allowincell="f" style="position:absolute;left:45;top:-4418;width:9012;height:3983;mso-wrap-style:none;v-text-anchor:middle;mso-position-vertical:top" type="_x0000_t75">
-                  <v:imagedata r:id="rId27" o:detectmouseclick="t"/>
-                  <v:stroke color="black" joinstyle="miter" endcap="flat"/>
+                  <v:imagedata r:id="rId28" o:detectmouseclick="t"/>
+                  <v:stroke color="black" joinstyle="round" endcap="flat"/>
                   <w10:wrap type="square"/>
                 </v:shape>
-                <v:line id="shape_0" from="29,-4419" to="9066,-4419" stroked="t" o:allowincell="f" style="position:absolute;mso-position-vertical:top">
+                <v:line id="shape_0" from="29,-4419" to="9067,-4419" stroked="t" o:allowincell="f" style="position:absolute;mso-position-vertical:top">
                   <v:stroke color="black" joinstyle="round" endcap="flat"/>
                   <v:fill o:detectmouseclick="t" on="false"/>
                   <w10:wrap type="square"/>
                 </v:line>
-                <v:line id="shape_0" from="9067,-4426" to="9067,-420" stroked="t" o:allowincell="f" style="position:absolute;mso-position-vertical:top">
+                <v:line id="shape_0" from="9068,-4426" to="9068,-419" stroked="t" o:allowincell="f" style="position:absolute;mso-position-vertical:top">
                   <v:stroke color="black" joinstyle="round" endcap="flat"/>
                   <v:fill o:detectmouseclick="t" on="false"/>
                   <w10:wrap type="square"/>
                 </v:line>
-                <v:line id="shape_0" from="37,-417" to="9074,-417" stroked="t" o:allowincell="f" style="position:absolute;flip:x;mso-position-vertical:top">
+                <v:line id="shape_0" from="37,-416" to="9075,-416" stroked="t" o:allowincell="f" style="position:absolute;flip:x;mso-position-vertical:top">
                   <v:stroke color="black" joinstyle="round" endcap="flat"/>
                   <v:fill o:detectmouseclick="t" on="false"/>
                   <w10:wrap type="square"/>
                 </v:line>
-                <v:line id="shape_0" from="37,-4419" to="37,-412" stroked="t" o:allowincell="f" style="position:absolute;flip:y;mso-position-vertical:top">
+                <v:line id="shape_0" from="37,-4419" to="37,-411" stroked="t" o:allowincell="f" style="position:absolute;flip:y;mso-position-vertical:top">
                   <v:stroke color="black" joinstyle="round" endcap="flat"/>
                   <v:fill o:detectmouseclick="t" on="false"/>
                   <w10:wrap type="square"/>
@@ -9119,8 +9067,8 @@
                         <wps:cNvSpPr/>
                         <wps:spPr>
                           <a:xfrm>
-                            <a:off x="4181400" y="4493880"/>
-                            <a:ext cx="41400" cy="140400"/>
+                            <a:off x="4182120" y="4494600"/>
+                            <a:ext cx="40680" cy="139680"/>
                           </a:xfrm>
                           <a:prstGeom prst="rect">
                             <a:avLst/>
@@ -9141,7 +9089,7 @@
                             <w:p>
                               <w:pPr>
                                 <w:pStyle w:val="Normal"/>
-                                <w:overflowPunct w:val="true"/>
+                                <w:overflowPunct w:val="false"/>
                                 <w:spacing w:lineRule="auto" w:line="240" w:before="0" w:after="0"/>
                                 <w:rPr/>
                               </w:pPr>
@@ -9165,7 +9113,7 @@
                           <pic:cNvPicPr/>
                         </pic:nvPicPr>
                         <pic:blipFill>
-                          <a:blip r:embed="rId28"/>
+                          <a:blip r:embed="rId29"/>
                           <a:stretch/>
                         </pic:blipFill>
                         <pic:spPr>
@@ -9191,7 +9139,7 @@
                         <wps:spPr>
                           <a:xfrm>
                             <a:off x="0" y="4320"/>
-                            <a:ext cx="4156560" cy="720"/>
+                            <a:ext cx="4157280" cy="720"/>
                           </a:xfrm>
                           <a:prstGeom prst="line">
                             <a:avLst/>
@@ -9214,8 +9162,8 @@
                         <wps:cNvSpPr/>
                         <wps:spPr>
                           <a:xfrm>
-                            <a:off x="4157280" y="0"/>
-                            <a:ext cx="720" cy="4570560"/>
+                            <a:off x="4158000" y="0"/>
+                            <a:ext cx="720" cy="4571280"/>
                           </a:xfrm>
                           <a:prstGeom prst="line">
                             <a:avLst/>
@@ -9238,8 +9186,8 @@
                         <wps:cNvSpPr/>
                         <wps:spPr>
                           <a:xfrm flipH="1">
-                            <a:off x="4320" y="4571280"/>
-                            <a:ext cx="4157280" cy="720"/>
+                            <a:off x="4320" y="4572000"/>
+                            <a:ext cx="4158000" cy="720"/>
                           </a:xfrm>
                           <a:prstGeom prst="line">
                             <a:avLst/>
@@ -9263,7 +9211,7 @@
                         <wps:spPr>
                           <a:xfrm flipV="1">
                             <a:off x="4320" y="4320"/>
-                            <a:ext cx="720" cy="4572000"/>
+                            <a:ext cx="720" cy="4572720"/>
                           </a:xfrm>
                           <a:prstGeom prst="line">
                             <a:avLst/>
@@ -9290,8 +9238,8 @@
           </mc:Choice>
           <mc:Fallback>
             <w:pict>
-              <v:group id="shape_0" alt="Group 14341" style="position:absolute;margin-left:0pt;margin-top:-182.7pt;width:332.5pt;height:364.9pt" coordorigin="0,-3654" coordsize="6650,7298">
-                <v:rect id="shape_0" stroked="f" o:allowincell="f" style="position:absolute;left:6585;top:3423;width:64;height:220;mso-wrap-style:square;v-text-anchor:top;mso-position-vertical:center">
+              <v:group id="shape_0" alt="Group 14341" style="position:absolute;margin-left:0pt;margin-top:-365.4pt;width:332.5pt;height:364.9pt" coordorigin="0,-7308" coordsize="6650,7298">
+                <v:rect id="shape_0" stroked="f" o:allowincell="f" style="position:absolute;left:6586;top:-230;width:63;height:219;mso-wrap-style:square;v-text-anchor:top;mso-position-vertical:top">
                   <v:fill o:detectmouseclick="t" on="false"/>
                   <v:stroke color="#3465a4" joinstyle="round" endcap="flat"/>
                   <v:textbox>
@@ -9299,7 +9247,7 @@
                       <w:p>
                         <w:pPr>
                           <w:pStyle w:val="Normal"/>
-                          <w:overflowPunct w:val="true"/>
+                          <w:overflowPunct w:val="false"/>
                           <w:spacing w:lineRule="auto" w:line="240" w:before="0" w:after="0"/>
                           <w:rPr/>
                         </w:pPr>
@@ -9315,27 +9263,27 @@
                   </v:textbox>
                   <w10:wrap type="square"/>
                 </v:rect>
-                <v:shape id="shape_0" stroked="t" o:allowincell="f" style="position:absolute;left:15;top:-3639;width:6522;height:7174;mso-wrap-style:none;v-text-anchor:middle;mso-position-vertical:center" type="_x0000_t75">
-                  <v:imagedata r:id="rId29" o:detectmouseclick="t"/>
-                  <v:stroke color="black" joinstyle="miter" endcap="flat"/>
+                <v:shape id="shape_0" stroked="t" o:allowincell="f" style="position:absolute;left:15;top:-7294;width:6522;height:7174;mso-wrap-style:none;v-text-anchor:middle;mso-position-vertical:top" type="_x0000_t75">
+                  <v:imagedata r:id="rId30" o:detectmouseclick="t"/>
+                  <v:stroke color="black" joinstyle="round" endcap="flat"/>
                   <w10:wrap type="square"/>
                 </v:shape>
-                <v:line id="shape_0" from="0,-3647" to="6545,-3647" stroked="t" o:allowincell="f" style="position:absolute;mso-position-vertical:center">
+                <v:line id="shape_0" from="0,-7301" to="6546,-7301" stroked="t" o:allowincell="f" style="position:absolute;mso-position-vertical:top">
                   <v:stroke color="black" joinstyle="round" endcap="flat"/>
                   <v:fill o:detectmouseclick="t" on="false"/>
                   <w10:wrap type="square"/>
                 </v:line>
-                <v:line id="shape_0" from="6547,-3654" to="6547,3543" stroked="t" o:allowincell="f" style="position:absolute;mso-position-vertical:center">
+                <v:line id="shape_0" from="6548,-7308" to="6548,-110" stroked="t" o:allowincell="f" style="position:absolute;mso-position-vertical:top">
                   <v:stroke color="black" joinstyle="round" endcap="flat"/>
                   <v:fill o:detectmouseclick="t" on="false"/>
                   <w10:wrap type="square"/>
                 </v:line>
-                <v:line id="shape_0" from="7,3545" to="6553,3545" stroked="t" o:allowincell="f" style="position:absolute;flip:x;mso-position-vertical:center">
+                <v:line id="shape_0" from="7,-108" to="6554,-108" stroked="t" o:allowincell="f" style="position:absolute;flip:x;mso-position-vertical:top">
                   <v:stroke color="black" joinstyle="round" endcap="flat"/>
                   <v:fill o:detectmouseclick="t" on="false"/>
                   <w10:wrap type="square"/>
                 </v:line>
-                <v:line id="shape_0" from="7,-3647" to="7,3552" stroked="t" o:allowincell="f" style="position:absolute;flip:y;mso-position-vertical:center">
+                <v:line id="shape_0" from="7,-7301" to="7,-101" stroked="t" o:allowincell="f" style="position:absolute;flip:y;mso-position-vertical:top">
                   <v:stroke color="black" joinstyle="round" endcap="flat"/>
                   <v:fill o:detectmouseclick="t" on="false"/>
                   <w10:wrap type="square"/>
@@ -9402,8 +9350,8 @@
                         <wps:cNvSpPr/>
                         <wps:spPr>
                           <a:xfrm>
-                            <a:off x="5781600" y="2786400"/>
-                            <a:ext cx="41400" cy="139680"/>
+                            <a:off x="5782320" y="2787120"/>
+                            <a:ext cx="40680" cy="138960"/>
                           </a:xfrm>
                           <a:prstGeom prst="rect">
                             <a:avLst/>
@@ -9424,7 +9372,7 @@
                             <w:p>
                               <w:pPr>
                                 <w:pStyle w:val="Normal"/>
-                                <w:overflowPunct w:val="true"/>
+                                <w:overflowPunct w:val="false"/>
                                 <w:spacing w:lineRule="auto" w:line="240" w:before="0" w:after="0"/>
                                 <w:rPr/>
                               </w:pPr>
@@ -9447,8 +9395,8 @@
                         <wps:cNvSpPr/>
                         <wps:spPr>
                           <a:xfrm>
-                            <a:off x="0" y="2981160"/>
-                            <a:ext cx="41400" cy="140400"/>
+                            <a:off x="0" y="2981880"/>
+                            <a:ext cx="40680" cy="139680"/>
                           </a:xfrm>
                           <a:prstGeom prst="rect">
                             <a:avLst/>
@@ -9469,7 +9417,7 @@
                             <w:p>
                               <w:pPr>
                                 <w:pStyle w:val="Normal"/>
-                                <w:overflowPunct w:val="true"/>
+                                <w:overflowPunct w:val="false"/>
                                 <w:spacing w:lineRule="auto" w:line="240" w:before="0" w:after="0"/>
                                 <w:rPr/>
                               </w:pPr>
@@ -9493,7 +9441,7 @@
                           <pic:cNvPicPr/>
                         </pic:nvPicPr>
                         <pic:blipFill>
-                          <a:blip r:embed="rId30"/>
+                          <a:blip r:embed="rId31"/>
                           <a:stretch/>
                         </pic:blipFill>
                         <pic:spPr>
@@ -9519,7 +9467,7 @@
                         <wps:spPr>
                           <a:xfrm>
                             <a:off x="18360" y="4320"/>
-                            <a:ext cx="5739120" cy="720"/>
+                            <a:ext cx="5739840" cy="720"/>
                           </a:xfrm>
                           <a:prstGeom prst="line">
                             <a:avLst/>
@@ -9542,8 +9490,8 @@
                         <wps:cNvSpPr/>
                         <wps:spPr>
                           <a:xfrm>
-                            <a:off x="5757480" y="0"/>
-                            <a:ext cx="720" cy="2868120"/>
+                            <a:off x="5758200" y="0"/>
+                            <a:ext cx="720" cy="2868840"/>
                           </a:xfrm>
                           <a:prstGeom prst="line">
                             <a:avLst/>
@@ -9566,8 +9514,8 @@
                         <wps:cNvSpPr/>
                         <wps:spPr>
                           <a:xfrm flipH="1">
-                            <a:off x="23400" y="2868840"/>
-                            <a:ext cx="5739120" cy="0"/>
+                            <a:off x="23400" y="2869560"/>
+                            <a:ext cx="5739840" cy="0"/>
                           </a:xfrm>
                           <a:prstGeom prst="line">
                             <a:avLst/>
@@ -9591,7 +9539,7 @@
                         <wps:spPr>
                           <a:xfrm flipV="1">
                             <a:off x="23400" y="4320"/>
-                            <a:ext cx="720" cy="2868840"/>
+                            <a:ext cx="720" cy="2869560"/>
                           </a:xfrm>
                           <a:prstGeom prst="line">
                             <a:avLst/>
@@ -9619,7 +9567,7 @@
           <mc:Fallback>
             <w:pict>
               <v:group id="shape_0" alt="Group 14435" style="position:absolute;margin-left:0pt;margin-top:-246.8pt;width:458.5pt;height:245.75pt" coordorigin="0,-4936" coordsize="9170,4915">
-                <v:rect id="shape_0" stroked="f" o:allowincell="f" style="position:absolute;left:9105;top:-548;width:64;height:219;mso-wrap-style:square;v-text-anchor:top;mso-position-vertical:top">
+                <v:rect id="shape_0" stroked="f" o:allowincell="f" style="position:absolute;left:9106;top:-547;width:63;height:218;mso-wrap-style:square;v-text-anchor:top;mso-position-vertical:top">
                   <v:fill o:detectmouseclick="t" on="false"/>
                   <v:stroke color="#3465a4" joinstyle="round" endcap="flat"/>
                   <v:textbox>
@@ -9627,7 +9575,7 @@
                       <w:p>
                         <w:pPr>
                           <w:pStyle w:val="Normal"/>
-                          <w:overflowPunct w:val="true"/>
+                          <w:overflowPunct w:val="false"/>
                           <w:spacing w:lineRule="auto" w:line="240" w:before="0" w:after="0"/>
                           <w:rPr/>
                         </w:pPr>
@@ -9643,7 +9591,7 @@
                   </v:textbox>
                   <w10:wrap type="square"/>
                 </v:rect>
-                <v:rect id="shape_0" stroked="f" o:allowincell="f" style="position:absolute;left:0;top:-242;width:64;height:220;mso-wrap-style:square;v-text-anchor:top;mso-position-vertical:top">
+                <v:rect id="shape_0" stroked="f" o:allowincell="f" style="position:absolute;left:0;top:-240;width:63;height:219;mso-wrap-style:square;v-text-anchor:top;mso-position-vertical:top">
                   <v:fill o:detectmouseclick="t" on="false"/>
                   <v:stroke color="#3465a4" joinstyle="round" endcap="flat"/>
                   <v:textbox>
@@ -9651,7 +9599,7 @@
                       <w:p>
                         <w:pPr>
                           <w:pStyle w:val="Normal"/>
-                          <w:overflowPunct w:val="true"/>
+                          <w:overflowPunct w:val="false"/>
                           <w:spacing w:lineRule="auto" w:line="240" w:before="0" w:after="0"/>
                           <w:rPr/>
                         </w:pPr>
@@ -9668,26 +9616,26 @@
                   <w10:wrap type="square"/>
                 </v:rect>
                 <v:shape id="shape_0" stroked="t" o:allowincell="f" style="position:absolute;left:45;top:-4928;width:9012;height:4493;mso-wrap-style:none;v-text-anchor:middle;mso-position-vertical:top" type="_x0000_t75">
-                  <v:imagedata r:id="rId31" o:detectmouseclick="t"/>
-                  <v:stroke color="black" joinstyle="miter" endcap="flat"/>
+                  <v:imagedata r:id="rId32" o:detectmouseclick="t"/>
+                  <v:stroke color="black" joinstyle="round" endcap="flat"/>
                   <w10:wrap type="square"/>
                 </v:shape>
-                <v:line id="shape_0" from="29,-4929" to="9066,-4929" stroked="t" o:allowincell="f" style="position:absolute;mso-position-vertical:top">
+                <v:line id="shape_0" from="29,-4929" to="9067,-4929" stroked="t" o:allowincell="f" style="position:absolute;mso-position-vertical:top">
                   <v:stroke color="black" joinstyle="round" endcap="flat"/>
                   <v:fill o:detectmouseclick="t" on="false"/>
                   <w10:wrap type="square"/>
                 </v:line>
-                <v:line id="shape_0" from="9067,-4936" to="9067,-420" stroked="t" o:allowincell="f" style="position:absolute;mso-position-vertical:top">
+                <v:line id="shape_0" from="9068,-4936" to="9068,-419" stroked="t" o:allowincell="f" style="position:absolute;mso-position-vertical:top">
                   <v:stroke color="black" joinstyle="round" endcap="flat"/>
                   <v:fill o:detectmouseclick="t" on="false"/>
                   <w10:wrap type="square"/>
                 </v:line>
-                <v:line id="shape_0" from="37,-418" to="9074,-418" stroked="t" o:allowincell="f" style="position:absolute;flip:x;mso-position-vertical:top">
+                <v:line id="shape_0" from="37,-417" to="9075,-417" stroked="t" o:allowincell="f" style="position:absolute;flip:x;mso-position-vertical:top">
                   <v:stroke color="black" joinstyle="round" endcap="flat"/>
                   <v:fill o:detectmouseclick="t" on="false"/>
                   <w10:wrap type="square"/>
                 </v:line>
-                <v:line id="shape_0" from="37,-4929" to="37,-412" stroked="t" o:allowincell="f" style="position:absolute;flip:y;mso-position-vertical:top">
+                <v:line id="shape_0" from="37,-4929" to="37,-411" stroked="t" o:allowincell="f" style="position:absolute;flip:y;mso-position-vertical:top">
                   <v:stroke color="black" joinstyle="round" endcap="flat"/>
                   <v:fill o:detectmouseclick="t" on="false"/>
                   <w10:wrap type="square"/>
@@ -9728,7 +9676,7 @@
           <w:szCs w:val="22"/>
         </w:rPr>
       </w:pPr>
-      <w:hyperlink r:id="rId32">
+      <w:hyperlink r:id="rId33">
         <w:r>
           <w:rPr>
             <w:rStyle w:val="Style8"/>
@@ -9785,7 +9733,7 @@
                     </pic:cNvPicPr>
                   </pic:nvPicPr>
                   <pic:blipFill>
-                    <a:blip r:embed="rId33"/>
+                    <a:blip r:embed="rId34"/>
                     <a:stretch>
                       <a:fillRect/>
                     </a:stretch>
@@ -9880,7 +9828,7 @@
                     </pic:cNvPicPr>
                   </pic:nvPicPr>
                   <pic:blipFill>
-                    <a:blip r:embed="rId34"/>
+                    <a:blip r:embed="rId35"/>
                     <a:stretch>
                       <a:fillRect/>
                     </a:stretch>
@@ -9957,7 +9905,7 @@
                     </pic:cNvPicPr>
                   </pic:nvPicPr>
                   <pic:blipFill>
-                    <a:blip r:embed="rId35"/>
+                    <a:blip r:embed="rId36"/>
                     <a:stretch>
                       <a:fillRect/>
                     </a:stretch>
@@ -10023,7 +9971,7 @@
                     </pic:cNvPicPr>
                   </pic:nvPicPr>
                   <pic:blipFill>
-                    <a:blip r:embed="rId36"/>
+                    <a:blip r:embed="rId37"/>
                     <a:stretch>
                       <a:fillRect/>
                     </a:stretch>
@@ -10101,7 +10049,7 @@
                     </pic:cNvPicPr>
                   </pic:nvPicPr>
                   <pic:blipFill>
-                    <a:blip r:embed="rId37"/>
+                    <a:blip r:embed="rId38"/>
                     <a:stretch>
                       <a:fillRect/>
                     </a:stretch>
@@ -10178,7 +10126,7 @@
                     </pic:cNvPicPr>
                   </pic:nvPicPr>
                   <pic:blipFill>
-                    <a:blip r:embed="rId38"/>
+                    <a:blip r:embed="rId39"/>
                     <a:stretch>
                       <a:fillRect/>
                     </a:stretch>
@@ -10263,7 +10211,7 @@
           <w:szCs w:val="22"/>
         </w:rPr>
       </w:pPr>
-      <w:hyperlink r:id="rId39">
+      <w:hyperlink r:id="rId40">
         <w:r>
           <w:rPr>
             <w:rStyle w:val="Style8"/>
@@ -10327,7 +10275,7 @@
                     </pic:cNvPicPr>
                   </pic:nvPicPr>
                   <pic:blipFill>
-                    <a:blip r:embed="rId40"/>
+                    <a:blip r:embed="rId41"/>
                     <a:stretch>
                       <a:fillRect/>
                     </a:stretch>
@@ -10373,7 +10321,7 @@
         </w:rPr>
         <w:t xml:space="preserve"> </w:t>
       </w:r>
-      <w:hyperlink r:id="rId41">
+      <w:hyperlink r:id="rId42">
         <w:r>
           <w:rPr>
             <w:rStyle w:val="Hyperlink"/>
@@ -10411,12 +10359,12 @@
       </w:r>
     </w:p>
     <w:sectPr>
-      <w:headerReference w:type="even" r:id="rId42"/>
-      <w:headerReference w:type="default" r:id="rId43"/>
-      <w:headerReference w:type="first" r:id="rId44"/>
-      <w:footerReference w:type="even" r:id="rId45"/>
-      <w:footerReference w:type="default" r:id="rId46"/>
-      <w:footerReference w:type="first" r:id="rId47"/>
+      <w:headerReference w:type="even" r:id="rId43"/>
+      <w:headerReference w:type="default" r:id="rId44"/>
+      <w:headerReference w:type="first" r:id="rId45"/>
+      <w:footerReference w:type="even" r:id="rId46"/>
+      <w:footerReference w:type="default" r:id="rId47"/>
+      <w:footerReference w:type="first" r:id="rId48"/>
       <w:type w:val="nextPage"/>
       <w:pgSz w:w="11906" w:h="16838"/>
       <w:pgMar w:left="1701" w:right="1701" w:gutter="0" w:header="0" w:top="1417" w:footer="720" w:bottom="1417"/>
@@ -10567,7 +10515,7 @@
             <w:sz w:val="20"/>
             <w:szCs w:val="20"/>
           </w:rPr>
-          <w:t>18</w:t>
+          <w:t>19</w:t>
         </w:r>
         <w:r>
           <w:rPr>
@@ -10786,11 +10734,11 @@
           <wp:effectExtent l="0" t="0" r="0" b="0"/>
           <wp:wrapTight wrapText="bothSides">
             <wp:wrapPolygon edited="0">
-              <wp:start x="-72" y="0"/>
-              <wp:lineTo x="-72" y="21097"/>
-              <wp:lineTo x="21311" y="21097"/>
-              <wp:lineTo x="21311" y="0"/>
-              <wp:lineTo x="-72" y="0"/>
+              <wp:start x="-162" y="0"/>
+              <wp:lineTo x="-162" y="20936"/>
+              <wp:lineTo x="21310" y="20936"/>
+              <wp:lineTo x="21310" y="0"/>
+              <wp:lineTo x="-162" y="0"/>
             </wp:wrapPolygon>
           </wp:wrapTight>
           <wp:docPr id="88" name="Imagen3"/>
@@ -10808,7 +10756,7 @@
                 </pic:nvPicPr>
                 <pic:blipFill>
                   <a:blip r:embed="rId1"/>
-                  <a:srcRect l="0" t="34593" r="0" b="28849"/>
+                  <a:srcRect l="0" t="34614" r="0" b="28866"/>
                   <a:stretch>
                     <a:fillRect/>
                   </a:stretch>
@@ -12243,8 +12191,8 @@
       <w:u w:val="single"/>
     </w:rPr>
   </w:style>
-  <w:style w:type="character" w:styleId="Enlacedelndiceuser" w:customStyle="1">
-    <w:name w:val="Enlace del índice (user)"/>
+  <w:style w:type="character" w:styleId="Enlacedelndice">
+    <w:name w:val="Enlace del índice"/>
     <w:qFormat/>
     <w:rPr/>
   </w:style>
@@ -12285,13 +12233,20 @@
       <w:sz w:val="22"/>
     </w:rPr>
   </w:style>
-  <w:style w:type="character" w:styleId="Enlacedelndice">
-    <w:name w:val="Enlace del índice"/>
+  <w:style w:type="character" w:styleId="IndexLink">
+    <w:name w:val="Index Link"/>
     <w:qFormat/>
     <w:rPr/>
   </w:style>
-  <w:style w:type="paragraph" w:styleId="Ttulo">
-    <w:name w:val="Título"/>
+  <w:style w:type="character" w:styleId="FollowedHyperlink">
+    <w:name w:val="FollowedHyperlink"/>
+    <w:rPr>
+      <w:color w:val="800000"/>
+      <w:u w:val="single"/>
+    </w:rPr>
+  </w:style>
+  <w:style w:type="paragraph" w:styleId="Heading">
+    <w:name w:val="Heading"/>
     <w:basedOn w:val="Normal"/>
     <w:next w:val="BodyText"/>
     <w:qFormat/>
@@ -12300,7 +12255,7 @@
       <w:spacing w:before="240" w:after="120"/>
     </w:pPr>
     <w:rPr>
-      <w:rFonts w:ascii="Liberation Sans" w:hAnsi="Liberation Sans" w:eastAsia="Noto Sans SC" w:cs="Lucida Sans"/>
+      <w:rFonts w:ascii="Liberation Sans" w:hAnsi="Liberation Sans" w:eastAsia="Microsoft YaHei" w:cs="Lucida Sans"/>
       <w:sz w:val="28"/>
       <w:szCs w:val="28"/>
     </w:rPr>
@@ -12336,6 +12291,32 @@
       <w:sz w:val="24"/>
     </w:rPr>
   </w:style>
+  <w:style w:type="paragraph" w:styleId="Index">
+    <w:name w:val="Index"/>
+    <w:basedOn w:val="Normal"/>
+    <w:qFormat/>
+    <w:pPr>
+      <w:suppressLineNumbers/>
+    </w:pPr>
+    <w:rPr>
+      <w:rFonts w:cs="Lucida Sans"/>
+    </w:rPr>
+  </w:style>
+  <w:style w:type="paragraph" w:styleId="Ttulo">
+    <w:name w:val="Título"/>
+    <w:basedOn w:val="Normal"/>
+    <w:next w:val="BodyText"/>
+    <w:qFormat/>
+    <w:pPr>
+      <w:keepNext w:val="true"/>
+      <w:spacing w:before="240" w:after="120"/>
+    </w:pPr>
+    <w:rPr>
+      <w:rFonts w:ascii="Liberation Sans" w:hAnsi="Liberation Sans" w:eastAsia="Noto Sans SC" w:cs="Lucida Sans"/>
+      <w:sz w:val="28"/>
+      <w:szCs w:val="28"/>
+    </w:rPr>
+  </w:style>
   <w:style w:type="paragraph" w:styleId="ndice" w:customStyle="1">
     <w:name w:val="Índice"/>
     <w:basedOn w:val="Normal"/>
@@ -12344,7 +12325,7 @@
       <w:suppressLineNumbers/>
     </w:pPr>
     <w:rPr>
-      <w:rFonts w:cs="Noto Sans Devanagari"/>
+      <w:rFonts w:cs="Lucida Sans"/>
     </w:rPr>
   </w:style>
   <w:style w:type="paragraph" w:styleId="Title">
@@ -12362,17 +12343,6 @@
       <w:szCs w:val="28"/>
     </w:rPr>
   </w:style>
-  <w:style w:type="paragraph" w:styleId="ndiceuser" w:customStyle="1">
-    <w:name w:val="Índice (user)"/>
-    <w:basedOn w:val="Normal"/>
-    <w:qFormat/>
-    <w:pPr>
-      <w:suppressLineNumbers/>
-    </w:pPr>
-    <w:rPr>
-      <w:rFonts w:cs="Lucida Sans"/>
-    </w:rPr>
-  </w:style>
   <w:style w:type="paragraph" w:styleId="Contenidodelmarco" w:customStyle="1">
     <w:name w:val="Contenido del marco"/>
     <w:basedOn w:val="Normal"/>
@@ -12387,8 +12357,8 @@
     <w:pPr/>
     <w:rPr/>
   </w:style>
-  <w:style w:type="paragraph" w:styleId="Cabeceraypieuser" w:customStyle="1">
-    <w:name w:val="Cabecera y pie (user)"/>
+  <w:style w:type="paragraph" w:styleId="HeaderandFooter">
+    <w:name w:val="Header and Footer"/>
     <w:basedOn w:val="Normal"/>
     <w:qFormat/>
     <w:pPr/>
@@ -12399,13 +12369,6 @@
     <w:basedOn w:val="Cabeceraypie"/>
     <w:link w:val="PiedepginaCar"/>
     <w:uiPriority w:val="99"/>
-    <w:pPr/>
-    <w:rPr/>
-  </w:style>
-  <w:style w:type="paragraph" w:styleId="Contenidodelmarcouser" w:customStyle="1">
-    <w:name w:val="Contenido del marco (user)"/>
-    <w:basedOn w:val="Normal"/>
-    <w:qFormat/>
     <w:pPr/>
     <w:rPr/>
   </w:style>
@@ -12431,7 +12394,7 @@
   </w:style>
   <w:style w:type="paragraph" w:styleId="TOC1">
     <w:name w:val="toc 1"/>
-    <w:basedOn w:val="ndiceuser"/>
+    <w:basedOn w:val="ndice"/>
     <w:uiPriority w:val="39"/>
     <w:pPr>
       <w:tabs>
@@ -12472,15 +12435,15 @@
     </w:pPr>
     <w:rPr/>
   </w:style>
+  <w:style w:type="paragraph" w:styleId="FrameContents">
+    <w:name w:val="Frame Contents"/>
+    <w:basedOn w:val="Normal"/>
+    <w:qFormat/>
+    <w:pPr/>
+    <w:rPr/>
+  </w:style>
   <w:style w:type="numbering" w:styleId="Ningunalista" w:customStyle="1">
     <w:name w:val="Ninguna lista"/>
-    <w:uiPriority w:val="99"/>
-    <w:semiHidden/>
-    <w:unhideWhenUsed/>
-    <w:qFormat/>
-  </w:style>
-  <w:style w:type="numbering" w:styleId="Ningunalistauser" w:customStyle="1">
-    <w:name w:val="Ninguna lista (user)"/>
     <w:uiPriority w:val="99"/>
     <w:semiHidden/>
     <w:unhideWhenUsed/>

</xml_diff>

<commit_message>
Realice cambios en requerimientos funcionales
</commit_message>
<xml_diff>
--- a/1er entrega TPI - comision 1 grupo 5 - Corregido.docx
+++ b/1er entrega TPI - comision 1 grupo 5 - Corregido.docx
@@ -1,6 +1,6 @@
 
 <file path=word/document.xml><?xml version="1.0" encoding="utf-8"?>
-<w:document xmlns:wpc="http://schemas.microsoft.com/office/word/2010/wordprocessingCanvas" xmlns:cx="http://schemas.microsoft.com/office/drawing/2014/chartex" xmlns:cx1="http://schemas.microsoft.com/office/drawing/2015/9/8/chartex" xmlns:cx2="http://schemas.microsoft.com/office/drawing/2015/10/21/chartex" xmlns:cx3="http://schemas.microsoft.com/office/drawing/2016/5/9/chartex" xmlns:cx4="http://schemas.microsoft.com/office/drawing/2016/5/10/chartex" xmlns:cx5="http://schemas.microsoft.com/office/drawing/2016/5/11/chartex" xmlns:cx6="http://schemas.microsoft.com/office/drawing/2016/5/12/chartex" xmlns:cx7="http://schemas.microsoft.com/office/drawing/2016/5/13/chartex" xmlns:cx8="http://schemas.microsoft.com/office/drawing/2016/5/14/chartex" xmlns:mc="http://schemas.openxmlformats.org/markup-compatibility/2006" xmlns:aink="http://schemas.microsoft.com/office/drawing/2016/ink" xmlns:am3d="http://schemas.microsoft.com/office/drawing/2017/model3d" xmlns:o="urn:schemas-microsoft-com:office:office" xmlns:oel="http://schemas.microsoft.com/office/2019/extlst" xmlns:r="http://schemas.openxmlformats.org/officeDocument/2006/relationships" xmlns:m="http://schemas.openxmlformats.org/officeDocument/2006/math" xmlns:v="urn:schemas-microsoft-com:vml" xmlns:wp14="http://schemas.microsoft.com/office/word/2010/wordprocessingDrawing" xmlns:wp="http://schemas.openxmlformats.org/drawingml/2006/wordprocessingDrawing" xmlns:w10="urn:schemas-microsoft-com:office:word" xmlns:w="http://schemas.openxmlformats.org/wordprocessingml/2006/main" xmlns:w14="http://schemas.microsoft.com/office/word/2010/wordml" xmlns:w15="http://schemas.microsoft.com/office/word/2012/wordml" xmlns:w16cex="http://schemas.microsoft.com/office/word/2018/wordml/cex" xmlns:w16cid="http://schemas.microsoft.com/office/word/2016/wordml/cid" xmlns:w16="http://schemas.microsoft.com/office/word/2018/wordml" xmlns:w16sdtdh="http://schemas.microsoft.com/office/word/2020/wordml/sdtdatahash" xmlns:w16se="http://schemas.microsoft.com/office/word/2015/wordml/symex" xmlns:wpg="http://schemas.microsoft.com/office/word/2010/wordprocessingGroup" xmlns:wpi="http://schemas.microsoft.com/office/word/2010/wordprocessingInk" xmlns:wne="http://schemas.microsoft.com/office/word/2006/wordml" xmlns:wps="http://schemas.microsoft.com/office/word/2010/wordprocessingShape" mc:Ignorable="w14 w15 w16se w16cid w16 w16cex w16sdtdh wp14">
+<w:document xmlns:wpc="http://schemas.microsoft.com/office/word/2010/wordprocessingCanvas" xmlns:cx="http://schemas.microsoft.com/office/drawing/2014/chartex" xmlns:cx1="http://schemas.microsoft.com/office/drawing/2015/9/8/chartex" xmlns:cx2="http://schemas.microsoft.com/office/drawing/2015/10/21/chartex" xmlns:cx3="http://schemas.microsoft.com/office/drawing/2016/5/9/chartex" xmlns:cx4="http://schemas.microsoft.com/office/drawing/2016/5/10/chartex" xmlns:cx5="http://schemas.microsoft.com/office/drawing/2016/5/11/chartex" xmlns:cx6="http://schemas.microsoft.com/office/drawing/2016/5/12/chartex" xmlns:cx7="http://schemas.microsoft.com/office/drawing/2016/5/13/chartex" xmlns:cx8="http://schemas.microsoft.com/office/drawing/2016/5/14/chartex" xmlns:mc="http://schemas.openxmlformats.org/markup-compatibility/2006" xmlns:aink="http://schemas.microsoft.com/office/drawing/2016/ink" xmlns:am3d="http://schemas.microsoft.com/office/drawing/2017/model3d" xmlns:o="urn:schemas-microsoft-com:office:office" xmlns:r="http://schemas.openxmlformats.org/officeDocument/2006/relationships" xmlns:m="http://schemas.openxmlformats.org/officeDocument/2006/math" xmlns:v="urn:schemas-microsoft-com:vml" xmlns:wp14="http://schemas.microsoft.com/office/word/2010/wordprocessingDrawing" xmlns:wp="http://schemas.openxmlformats.org/drawingml/2006/wordprocessingDrawing" xmlns:w10="urn:schemas-microsoft-com:office:word" xmlns:w="http://schemas.openxmlformats.org/wordprocessingml/2006/main" xmlns:w14="http://schemas.microsoft.com/office/word/2010/wordml" xmlns:w15="http://schemas.microsoft.com/office/word/2012/wordml" xmlns:w16cex="http://schemas.microsoft.com/office/word/2018/wordml/cex" xmlns:w16cid="http://schemas.microsoft.com/office/word/2016/wordml/cid" xmlns:w16="http://schemas.microsoft.com/office/word/2018/wordml" xmlns:w16sdtdh="http://schemas.microsoft.com/office/word/2020/wordml/sdtdatahash" xmlns:w16se="http://schemas.microsoft.com/office/word/2015/wordml/symex" xmlns:wpg="http://schemas.microsoft.com/office/word/2010/wordprocessingGroup" xmlns:wpi="http://schemas.microsoft.com/office/word/2010/wordprocessingInk" xmlns:wne="http://schemas.microsoft.com/office/word/2006/wordml" xmlns:wps="http://schemas.microsoft.com/office/word/2010/wordprocessingShape" mc:Ignorable="w14 w15 w16se w16cid w16 w16cex w16sdtdh wp14">
   <w:body>
     <w:p>
       <w:pPr>
@@ -627,23 +627,7 @@
           <w:rFonts w:ascii="Arial" w:eastAsia="Arial" w:hAnsi="Arial" w:cs="Arial"/>
           <w:sz w:val="18"/>
         </w:rPr>
-        <w:t xml:space="preserve"> </w:t>
-      </w:r>
-      <w:proofErr w:type="spellStart"/>
-      <w:r>
-        <w:rPr>
-          <w:rFonts w:ascii="Arial" w:eastAsia="Arial" w:hAnsi="Arial" w:cs="Arial"/>
-          <w:sz w:val="18"/>
-        </w:rPr>
-        <w:t>Agustin</w:t>
-      </w:r>
-      <w:proofErr w:type="spellEnd"/>
-      <w:r>
-        <w:rPr>
-          <w:rFonts w:ascii="Arial" w:eastAsia="Arial" w:hAnsi="Arial" w:cs="Arial"/>
-          <w:sz w:val="18"/>
-        </w:rPr>
-        <w:t xml:space="preserve"> </w:t>
+        <w:t xml:space="preserve"> Agustin </w:t>
       </w:r>
       <w:r>
         <w:rPr>
@@ -829,7 +813,14 @@
           <w:rFonts w:ascii="Arial" w:eastAsia="Arial" w:hAnsi="Arial" w:cs="Arial"/>
           <w:sz w:val="18"/>
         </w:rPr>
-        <w:t xml:space="preserve"> Octavio                                                                        </w:t>
+        <w:t xml:space="preserve"> Octavio                 </w:t>
+      </w:r>
+      <w:r>
+        <w:rPr>
+          <w:rFonts w:ascii="Arial" w:eastAsia="Arial" w:hAnsi="Arial" w:cs="Arial"/>
+          <w:sz w:val="18"/>
+        </w:rPr>
+        <w:t xml:space="preserve">                                                       </w:t>
       </w:r>
       <w:r>
         <w:rPr>
@@ -914,41 +905,13 @@
           <w:color w:val="auto"/>
         </w:rPr>
       </w:pPr>
-      <w:proofErr w:type="spellStart"/>
       <w:r>
         <w:rPr>
           <w:rFonts w:ascii="Arial" w:eastAsia="Arial" w:hAnsi="Arial" w:cs="Arial"/>
           <w:color w:val="auto"/>
           <w:sz w:val="18"/>
         </w:rPr>
-        <w:t>Gomez</w:t>
-      </w:r>
-      <w:proofErr w:type="spellEnd"/>
-      <w:r>
-        <w:rPr>
-          <w:rFonts w:ascii="Arial" w:eastAsia="Arial" w:hAnsi="Arial" w:cs="Arial"/>
-          <w:color w:val="auto"/>
-          <w:sz w:val="18"/>
-        </w:rPr>
-        <w:t xml:space="preserve"> </w:t>
-      </w:r>
-      <w:proofErr w:type="spellStart"/>
-      <w:r>
-        <w:rPr>
-          <w:rFonts w:ascii="Arial" w:eastAsia="Arial" w:hAnsi="Arial" w:cs="Arial"/>
-          <w:color w:val="auto"/>
-          <w:sz w:val="18"/>
-        </w:rPr>
-        <w:t>Rocio</w:t>
-      </w:r>
-      <w:proofErr w:type="spellEnd"/>
-      <w:r>
-        <w:rPr>
-          <w:rFonts w:ascii="Arial" w:eastAsia="Arial" w:hAnsi="Arial" w:cs="Arial"/>
-          <w:color w:val="auto"/>
-          <w:sz w:val="18"/>
-        </w:rPr>
-        <w:t xml:space="preserve">                                                                               </w:t>
+        <w:t xml:space="preserve">Gomez Rocio                                                                               </w:t>
       </w:r>
       <w:hyperlink r:id="rId11" w:history="1">
         <w:r>
@@ -1038,6 +1001,7 @@
           <w:docPartUnique/>
         </w:docPartObj>
       </w:sdtPr>
+      <w:sdtEndPr/>
       <w:sdtContent>
         <w:p>
           <w:pPr>
@@ -1157,7 +1121,13 @@
               <w:rPr>
                 <w:webHidden/>
               </w:rPr>
-              <w:instrText>PAGEREF _Toc232530985 \h</w:instrText>
+              <w:instrText>PAGEREF _T</w:instrText>
+            </w:r>
+            <w:r>
+              <w:rPr>
+                <w:webHidden/>
+              </w:rPr>
+              <w:instrText>oc232530985 \h</w:instrText>
             </w:r>
             <w:r>
               <w:rPr>
@@ -1543,7 +1513,23 @@
           <w:bCs/>
           <w:szCs w:val="22"/>
         </w:rPr>
-        <w:t>El objetivo del Trabajo Práctico Integrador es integrar todos los conocimientos adquiridos en el transcurso del cursado de la cátedra Análisis de Sistemas de Información como también las demás cátedras del año respectivo. En esta primera entrega, el objetivo específico es elaborar un listado de requerimientos funcionales para un sistema de software, identificando los actores involucrados y las funcionalidades específicas que deberá cumplir la aplicación.</w:t>
+        <w:t xml:space="preserve">El objetivo del Trabajo Práctico Integrador es integrar todos los conocimientos adquiridos en el transcurso del cursado de la cátedra Análisis de Sistemas de </w:t>
+      </w:r>
+      <w:r>
+        <w:rPr>
+          <w:rFonts w:ascii="Arial" w:hAnsi="Arial" w:cs="Arial"/>
+          <w:bCs/>
+          <w:szCs w:val="22"/>
+        </w:rPr>
+        <w:t>Información como también las demás cátedras del año respectivo. En esta primera entrega, el objetivo específico es elaborar un listado de requerimientos funcionales para un sistema de software, identificando los actores involucrados y las funcionalidades e</w:t>
+      </w:r>
+      <w:r>
+        <w:rPr>
+          <w:rFonts w:ascii="Arial" w:hAnsi="Arial" w:cs="Arial"/>
+          <w:bCs/>
+          <w:szCs w:val="22"/>
+        </w:rPr>
+        <w:t>specíficas que deberá cumplir la aplicación.</w:t>
       </w:r>
     </w:p>
     <w:p>
@@ -1562,7 +1548,15 @@
           <w:bCs/>
           <w:szCs w:val="22"/>
         </w:rPr>
-        <w:t>A través de este análisis, se busca aplicar buenas prácticas de Ingeniería de Requerimientos, comprendiendo la problemática planteada, relevando información útil y definiendo de manera clara qué necesidades deberá satisfacer el sistema.</w:t>
+        <w:t>A través de este análisis, se busca aplicar buenas prácticas de Ingeniería de Requerimientos, comprendiendo la problemática planteada, relevando información útil y definiendo de manera clara qué necesidades debe</w:t>
+      </w:r>
+      <w:r>
+        <w:rPr>
+          <w:rFonts w:ascii="Arial" w:hAnsi="Arial" w:cs="Arial"/>
+          <w:bCs/>
+          <w:szCs w:val="22"/>
+        </w:rPr>
+        <w:t>rá satisfacer el sistema.</w:t>
       </w:r>
     </w:p>
     <w:p>
@@ -1581,7 +1575,15 @@
           <w:bCs/>
           <w:szCs w:val="22"/>
         </w:rPr>
-        <w:t>El trabajo permitirá establecer un orden para el futuro diseño y desarrollo del sistema de información, asegurando que las funcionalidades propuestas respondan a una necesidad concreta del usuario: registrar, organizar, consultar y comparar la información relacionada con retiros holísticos.</w:t>
+        <w:t xml:space="preserve">El trabajo permitirá establecer un orden para el futuro diseño y desarrollo del sistema de información, asegurando que las funcionalidades propuestas respondan a una necesidad concreta del usuario: registrar, organizar, consultar </w:t>
+      </w:r>
+      <w:r>
+        <w:rPr>
+          <w:rFonts w:ascii="Arial" w:hAnsi="Arial" w:cs="Arial"/>
+          <w:bCs/>
+          <w:szCs w:val="22"/>
+        </w:rPr>
+        <w:t>y comparar la información relacionada con retiros holísticos.</w:t>
       </w:r>
     </w:p>
     <w:p>
@@ -1660,7 +1662,14 @@
           <w:rFonts w:ascii="Arial" w:eastAsia="Arial" w:hAnsi="Arial" w:cs="Arial"/>
           <w:szCs w:val="22"/>
         </w:rPr>
-        <w:t xml:space="preserve"> Dev, un equipo dedicado a la ingeniería en sistemas de información. Nuestro principal servicio es el análisis, diseño y desarrollo de soluciones de software para clientes particulares, pequeñas empresas y medianas organizaciones que necesiten mejorar la forma en que gestionan su información.</w:t>
+        <w:t xml:space="preserve"> Dev, un equipo dedicado a la ingeniería en sistemas de información. Nuestro principal servicio es el análisis, diseño y desarrollo de soluciones</w:t>
+      </w:r>
+      <w:r>
+        <w:rPr>
+          <w:rFonts w:ascii="Arial" w:eastAsia="Arial" w:hAnsi="Arial" w:cs="Arial"/>
+          <w:szCs w:val="22"/>
+        </w:rPr>
+        <w:t xml:space="preserve"> de software para clientes particulares, pequeñas empresas y medianas organizaciones que necesiten mejorar la forma en que gestionan su información.</w:t>
       </w:r>
     </w:p>
     <w:p>
@@ -1677,7 +1686,21 @@
           <w:rFonts w:ascii="Arial" w:eastAsia="Arial" w:hAnsi="Arial" w:cs="Arial"/>
           <w:szCs w:val="22"/>
         </w:rPr>
-        <w:t>Como grupo de trabajo, consideramos que un sistema informático no solo debe almacenar datos, sino también ayudar al usuario a organizar mejor sus actividades, reducir errores, ahorrar tiempo y tomar decisiones de manera más clara. Por eso, nuestro enfoque se basa en comprender primero la problemática del cliente para luego proponer una solución tecnológica adecuada.</w:t>
+        <w:t>Como grupo de trabajo, consideramos que un sistema informático no solo debe almacenar datos, sino también a</w:t>
+      </w:r>
+      <w:r>
+        <w:rPr>
+          <w:rFonts w:ascii="Arial" w:eastAsia="Arial" w:hAnsi="Arial" w:cs="Arial"/>
+          <w:szCs w:val="22"/>
+        </w:rPr>
+        <w:t>yudar al usuario a organizar mejor sus actividades, reducir errores, ahorrar tiempo y tomar decisiones de manera más clara. Por eso, nuestro enfoque se basa en comprender primero la problemática del cliente para luego proponer una solución tecnológica adec</w:t>
+      </w:r>
+      <w:r>
+        <w:rPr>
+          <w:rFonts w:ascii="Arial" w:eastAsia="Arial" w:hAnsi="Arial" w:cs="Arial"/>
+          <w:szCs w:val="22"/>
+        </w:rPr>
+        <w:t>uada.</w:t>
       </w:r>
     </w:p>
     <w:p>
@@ -1702,7 +1725,14 @@
           <w:szCs w:val="22"/>
         </w:rPr>
         <w:lastRenderedPageBreak/>
-        <w:t>experiencias pueda registrar en un único lugar toda la información importante sobre los retiros que consulta, compara, reserva o realiza.</w:t>
+        <w:t>experiencias pueda registrar en un único lugar toda la información impor</w:t>
+      </w:r>
+      <w:r>
+        <w:rPr>
+          <w:rFonts w:ascii="Arial" w:eastAsia="Arial" w:hAnsi="Arial" w:cs="Arial"/>
+          <w:szCs w:val="22"/>
+        </w:rPr>
+        <w:t>tante sobre los retiros que consulta, compara, reserva o realiza.</w:t>
       </w:r>
     </w:p>
     <w:p>
@@ -1719,7 +1749,14 @@
           <w:rFonts w:ascii="Arial" w:eastAsia="Arial" w:hAnsi="Arial" w:cs="Arial"/>
           <w:szCs w:val="22"/>
         </w:rPr>
-        <w:t>Nuestro equipo buscará desarrollar una propuesta clara, funcional y centrada en el usuario, teniendo en cuenta aspectos como la administración de fechas, ubicaciones, precios, actividades, contactos, estados de reserva, medios de pago, valoraciones y recordatorios.</w:t>
+        <w:t>Nuestro equipo buscará desarrollar una propuesta clara, funcional y centrada en el usuario, teniendo en cuenta aspectos como la administración de fechas, ubicaciones, precios, actividades, c</w:t>
+      </w:r>
+      <w:r>
+        <w:rPr>
+          <w:rFonts w:ascii="Arial" w:eastAsia="Arial" w:hAnsi="Arial" w:cs="Arial"/>
+          <w:szCs w:val="22"/>
+        </w:rPr>
+        <w:t>ontactos, estados de reserva, medios de pago, valoraciones y recordatorios.</w:t>
       </w:r>
     </w:p>
     <w:p>
@@ -1793,7 +1830,14 @@
           <w:rFonts w:ascii="Arial" w:eastAsia="Arial" w:hAnsi="Arial" w:cs="Arial"/>
           <w:szCs w:val="22"/>
         </w:rPr>
-        <w:t xml:space="preserve">Una persona interesada en realizar retiros holísticos busca una aplicación que le permita organizar en un único lugar toda la información de los retiros que consulta, evalúa, reserva o realiza. Actualmente la información sobre cada retiro se encuentra dispersa en diferentes medios: páginas web, Instagram, WhatsApp, o recomendaciones de otras personas. Esto dificulta comparar entre retiros, recordar consultas realizadas, controlar fechas, organizar pagos y conservar un registro de las experiencias vividas.  </w:t>
+        <w:t>Una persona interesada en realizar retiros holísticos busca una aplicación que le permita organizar en un único lugar toda la información de los retiros que consulta, evalúa, reserva o realiza. Actualmente la información sobre cada retiro se encuentra disp</w:t>
+      </w:r>
+      <w:r>
+        <w:rPr>
+          <w:rFonts w:ascii="Arial" w:eastAsia="Arial" w:hAnsi="Arial" w:cs="Arial"/>
+          <w:szCs w:val="22"/>
+        </w:rPr>
+        <w:t xml:space="preserve">ersa en diferentes medios: páginas web, Instagram, WhatsApp, o recomendaciones de otras personas. Esto dificulta comparar entre retiros, recordar consultas realizadas, controlar fechas, organizar pagos y conservar un registro de las experiencias vividas.  </w:t>
       </w:r>
     </w:p>
     <w:p>
@@ -1822,7 +1866,14 @@
           <w:rFonts w:ascii="Arial" w:eastAsia="Arial" w:hAnsi="Arial" w:cs="Arial"/>
           <w:szCs w:val="22"/>
         </w:rPr>
-        <w:t>El sistema tiene que permitir registrar retiros espirituales, guardando datos relevantes como fecha de inicio y finalización, lugar, duración, temática principal, costo, medio de contacto, página web o contacto de la persona que lo organiza, transporte, alojamiento, comidas incluidas, elementos necesarios, cronograma, público al que está dirigido, acompañantes, rango de edad, actividades previstas, observaciones.</w:t>
+        <w:t xml:space="preserve">El sistema tiene que permitir registrar retiros espirituales, guardando datos relevantes como fecha de inicio y finalización, lugar, duración, temática principal, costo, medio de contacto, página web o contacto de la persona que lo organiza, transporte, </w:t>
+      </w:r>
+      <w:r>
+        <w:rPr>
+          <w:rFonts w:ascii="Arial" w:eastAsia="Arial" w:hAnsi="Arial" w:cs="Arial"/>
+          <w:szCs w:val="22"/>
+        </w:rPr>
+        <w:t>alojamiento, comidas incluidas, elementos necesarios, cronograma, público al que está dirigido, acompañantes, rango de edad, actividades previstas, observaciones.</w:t>
       </w:r>
     </w:p>
     <w:p>
@@ -1851,7 +1902,21 @@
           <w:rFonts w:ascii="Arial" w:eastAsia="Arial" w:hAnsi="Arial" w:cs="Arial"/>
           <w:szCs w:val="22"/>
         </w:rPr>
-        <w:t>De cada retiro, se tiene que registrar un estado que permita saber la situación en la que se encuentra: si el retiro solo resulta de interés, si ya fue consultado, si se está esperando una respuesta, si está reservado, si fue señado, si está confirmado, cancelado o finalizado. Una vez finalizado un retiro, la aplicación tiene que permitir guardar la experiencia personal del usuario, incluyendo una valoración, comentarios, fotos, observaciones y una opinión del retiro. La opinión se podrá usar después para recordar la experiencia o compartirla con otras personas.</w:t>
+        <w:t>De cada retiro, se tiene que registrar un estado que permita saber la situación en la que se</w:t>
+      </w:r>
+      <w:r>
+        <w:rPr>
+          <w:rFonts w:ascii="Arial" w:eastAsia="Arial" w:hAnsi="Arial" w:cs="Arial"/>
+          <w:szCs w:val="22"/>
+        </w:rPr>
+        <w:t xml:space="preserve"> encuentra: si el retiro solo resulta de interés, si ya fue consultado, si se está esperando una respuesta, si está reservado, si fue señado, si está confirmado, cancelado o finalizado. Una vez finalizado un retiro, la aplicación tiene que permitir guardar</w:t>
+      </w:r>
+      <w:r>
+        <w:rPr>
+          <w:rFonts w:ascii="Arial" w:eastAsia="Arial" w:hAnsi="Arial" w:cs="Arial"/>
+          <w:szCs w:val="22"/>
+        </w:rPr>
+        <w:t xml:space="preserve"> la experiencia personal del usuario, incluyendo una valoración, comentarios, fotos, observaciones y una opinión del retiro. La opinión se podrá usar después para recordar la experiencia o compartirla con otras personas.</w:t>
       </w:r>
     </w:p>
     <w:p>
@@ -1880,7 +1945,14 @@
           <w:szCs w:val="22"/>
         </w:rPr>
         <w:lastRenderedPageBreak/>
-        <w:t xml:space="preserve">Mediante la investigación realizada sobre diferentes retiros holísticos (ver anexo) realizamos una lista simulada sobre cómo un usuario utiliza el sistema. </w:t>
+        <w:t>Mediante la investigación realizad</w:t>
+      </w:r>
+      <w:r>
+        <w:rPr>
+          <w:rFonts w:ascii="Arial" w:eastAsia="Arial" w:hAnsi="Arial" w:cs="Arial"/>
+          <w:szCs w:val="22"/>
+        </w:rPr>
+        <w:t xml:space="preserve">a sobre diferentes retiros holísticos (ver anexo) realizamos una lista simulada sobre cómo un usuario utiliza el sistema. </w:t>
       </w:r>
     </w:p>
     <w:p>
@@ -1969,7 +2041,14 @@
           <w:rFonts w:ascii="Arial" w:eastAsia="Arial" w:hAnsi="Arial" w:cs="Arial"/>
           <w:szCs w:val="22"/>
         </w:rPr>
-        <w:t xml:space="preserve">Registra en el S.I. la información disponible como ubicación, fecha, actividad, contacto, precio, forma de pago, etc. </w:t>
+        <w:t>Registra en el S.I. la informa</w:t>
+      </w:r>
+      <w:r>
+        <w:rPr>
+          <w:rFonts w:ascii="Arial" w:eastAsia="Arial" w:hAnsi="Arial" w:cs="Arial"/>
+          <w:szCs w:val="22"/>
+        </w:rPr>
+        <w:t xml:space="preserve">ción disponible como ubicación, fecha, actividad, contacto, precio, forma de pago, etc. </w:t>
       </w:r>
     </w:p>
     <w:p>
@@ -2035,7 +2114,14 @@
           <w:rFonts w:ascii="Arial" w:eastAsia="Arial" w:hAnsi="Arial" w:cs="Arial"/>
           <w:szCs w:val="22"/>
         </w:rPr>
-        <w:t xml:space="preserve">Compara diferentes retiros utilizando el S.I. </w:t>
+        <w:t>Compa</w:t>
+      </w:r>
+      <w:r>
+        <w:rPr>
+          <w:rFonts w:ascii="Arial" w:eastAsia="Arial" w:hAnsi="Arial" w:cs="Arial"/>
+          <w:szCs w:val="22"/>
+        </w:rPr>
+        <w:t xml:space="preserve">ra diferentes retiros utilizando el S.I. </w:t>
       </w:r>
     </w:p>
     <w:p>
@@ -2284,7 +2370,14 @@
           <w:rFonts w:ascii="Arial" w:eastAsia="Arial" w:hAnsi="Arial" w:cs="Arial"/>
           <w:szCs w:val="22"/>
         </w:rPr>
-        <w:t>Actor: Usuario/Cliente</w:t>
+        <w:t>Actor: Us</w:t>
+      </w:r>
+      <w:r>
+        <w:rPr>
+          <w:rFonts w:ascii="Arial" w:eastAsia="Arial" w:hAnsi="Arial" w:cs="Arial"/>
+          <w:szCs w:val="22"/>
+        </w:rPr>
+        <w:t>uario/Cliente</w:t>
       </w:r>
     </w:p>
     <w:tbl>
@@ -2452,7 +2545,14 @@
                 <w:rFonts w:ascii="Arial" w:eastAsia="Arial" w:hAnsi="Arial" w:cs="Arial"/>
                 <w:szCs w:val="22"/>
               </w:rPr>
-              <w:t xml:space="preserve"> El sistema deberá permitir consultar la información de los retiros registrados de acuerdo con los datos ingresados. </w:t>
+              <w:t xml:space="preserve"> El sistema de</w:t>
+            </w:r>
+            <w:r>
+              <w:rPr>
+                <w:rFonts w:ascii="Arial" w:eastAsia="Arial" w:hAnsi="Arial" w:cs="Arial"/>
+                <w:szCs w:val="22"/>
+              </w:rPr>
+              <w:t>berá permitir consultar la información de los retiros registrados de acuerdo con los datos ingresados. </w:t>
             </w:r>
           </w:p>
         </w:tc>
@@ -2562,7 +2662,14 @@
                 <w:rFonts w:ascii="Arial" w:eastAsia="Arial" w:hAnsi="Arial" w:cs="Arial"/>
                 <w:szCs w:val="22"/>
               </w:rPr>
-              <w:t xml:space="preserve"> El sistema deberá permitir asignar </w:t>
+              <w:t xml:space="preserve"> El sistema</w:t>
+            </w:r>
+            <w:r>
+              <w:rPr>
+                <w:rFonts w:ascii="Arial" w:eastAsia="Arial" w:hAnsi="Arial" w:cs="Arial"/>
+                <w:szCs w:val="22"/>
+              </w:rPr>
+              <w:t xml:space="preserve"> deberá permitir asignar </w:t>
             </w:r>
             <w:r>
               <w:rPr>
@@ -2687,7 +2794,14 @@
                 <w:rFonts w:ascii="Arial" w:hAnsi="Arial" w:cs="Arial"/>
                 <w:szCs w:val="22"/>
               </w:rPr>
-              <w:t>07</w:t>
+              <w:t>0</w:t>
+            </w:r>
+            <w:r>
+              <w:rPr>
+                <w:rFonts w:ascii="Arial" w:hAnsi="Arial" w:cs="Arial"/>
+                <w:szCs w:val="22"/>
+              </w:rPr>
+              <w:t>6</w:t>
             </w:r>
           </w:p>
         </w:tc>
@@ -2711,7 +2825,25 @@
                 <w:bCs/>
                 <w:szCs w:val="22"/>
               </w:rPr>
-              <w:t>Consultar información de contacto:</w:t>
+              <w:t xml:space="preserve">Consultar </w:t>
+            </w:r>
+            <w:r>
+              <w:rPr>
+                <w:rFonts w:ascii="Arial" w:eastAsia="Arial" w:hAnsi="Arial" w:cs="Arial"/>
+                <w:b/>
+                <w:bCs/>
+                <w:szCs w:val="22"/>
+              </w:rPr>
+              <w:t>organizadores</w:t>
+            </w:r>
+            <w:r>
+              <w:rPr>
+                <w:rFonts w:ascii="Arial" w:eastAsia="Arial" w:hAnsi="Arial" w:cs="Arial"/>
+                <w:b/>
+                <w:bCs/>
+                <w:szCs w:val="22"/>
+              </w:rPr>
+              <w:t>:</w:t>
             </w:r>
             <w:r>
               <w:rPr>
@@ -2742,7 +2874,14 @@
                 <w:rFonts w:ascii="Arial" w:hAnsi="Arial" w:cs="Arial"/>
                 <w:szCs w:val="22"/>
               </w:rPr>
-              <w:t>08</w:t>
+              <w:t>0</w:t>
+            </w:r>
+            <w:r>
+              <w:rPr>
+                <w:rFonts w:ascii="Arial" w:hAnsi="Arial" w:cs="Arial"/>
+                <w:szCs w:val="22"/>
+              </w:rPr>
+              <w:t>7</w:t>
             </w:r>
           </w:p>
         </w:tc>
@@ -2766,7 +2905,25 @@
                 <w:bCs/>
                 <w:szCs w:val="22"/>
               </w:rPr>
-              <w:t>Modificar información de contacto:</w:t>
+              <w:t xml:space="preserve">Modificar </w:t>
+            </w:r>
+            <w:r>
+              <w:rPr>
+                <w:rFonts w:ascii="Arial" w:eastAsia="Arial" w:hAnsi="Arial" w:cs="Arial"/>
+                <w:b/>
+                <w:bCs/>
+                <w:szCs w:val="22"/>
+              </w:rPr>
+              <w:t>organizadores</w:t>
+            </w:r>
+            <w:r>
+              <w:rPr>
+                <w:rFonts w:ascii="Arial" w:eastAsia="Arial" w:hAnsi="Arial" w:cs="Arial"/>
+                <w:b/>
+                <w:bCs/>
+                <w:szCs w:val="22"/>
+              </w:rPr>
+              <w:t>:</w:t>
             </w:r>
             <w:r>
               <w:rPr>
@@ -2797,7 +2954,14 @@
                 <w:rFonts w:ascii="Arial" w:hAnsi="Arial" w:cs="Arial"/>
                 <w:szCs w:val="22"/>
               </w:rPr>
-              <w:t>09</w:t>
+              <w:t>0</w:t>
+            </w:r>
+            <w:r>
+              <w:rPr>
+                <w:rFonts w:ascii="Arial" w:hAnsi="Arial" w:cs="Arial"/>
+                <w:szCs w:val="22"/>
+              </w:rPr>
+              <w:t>8</w:t>
             </w:r>
           </w:p>
         </w:tc>
@@ -2821,7 +2985,16 @@
                 <w:bCs/>
                 <w:szCs w:val="22"/>
               </w:rPr>
-              <w:t>Registrar acompañante:</w:t>
+              <w:t xml:space="preserve">Registrar </w:t>
+            </w:r>
+            <w:r>
+              <w:rPr>
+                <w:rFonts w:ascii="Arial" w:eastAsia="Arial" w:hAnsi="Arial" w:cs="Arial"/>
+                <w:b/>
+                <w:bCs/>
+                <w:szCs w:val="22"/>
+              </w:rPr>
+              <w:t>acompañante:</w:t>
             </w:r>
             <w:r>
               <w:rPr>
@@ -2852,7 +3025,7 @@
                 <w:rFonts w:ascii="Arial" w:hAnsi="Arial" w:cs="Arial"/>
                 <w:szCs w:val="22"/>
               </w:rPr>
-              <w:t>10</w:t>
+              <w:t>9</w:t>
             </w:r>
           </w:p>
         </w:tc>
@@ -2909,7 +3082,14 @@
                 <w:rFonts w:ascii="Arial" w:hAnsi="Arial" w:cs="Arial"/>
                 <w:szCs w:val="22"/>
               </w:rPr>
-              <w:t>11</w:t>
+              <w:t>1</w:t>
+            </w:r>
+            <w:r>
+              <w:rPr>
+                <w:rFonts w:ascii="Arial" w:hAnsi="Arial" w:cs="Arial"/>
+                <w:szCs w:val="22"/>
+              </w:rPr>
+              <w:t>0</w:t>
             </w:r>
           </w:p>
         </w:tc>
@@ -2978,7 +3158,7 @@
                 <w:rFonts w:ascii="Arial" w:hAnsi="Arial" w:cs="Arial"/>
                 <w:szCs w:val="22"/>
               </w:rPr>
-              <w:t>12</w:t>
+              <w:t>11</w:t>
             </w:r>
           </w:p>
         </w:tc>
@@ -3004,14 +3184,46 @@
                 <w:bCs/>
                 <w:szCs w:val="22"/>
               </w:rPr>
-              <w:t xml:space="preserve">Registrar calificación de retiro: </w:t>
+              <w:t>Registrar</w:t>
             </w:r>
             <w:r>
               <w:rPr>
                 <w:rFonts w:ascii="Arial" w:eastAsia="Arial" w:hAnsi="Arial" w:cs="Arial"/>
+                <w:b/>
+                <w:bCs/>
                 <w:szCs w:val="22"/>
               </w:rPr>
-              <w:t>El sistema deberá permitir al usuario calificar un retiro al que haya asistido.</w:t>
+              <w:t xml:space="preserve"> experiencia del retiro</w:t>
+            </w:r>
+            <w:r>
+              <w:rPr>
+                <w:rFonts w:ascii="Arial" w:eastAsia="Arial" w:hAnsi="Arial" w:cs="Arial"/>
+                <w:b/>
+                <w:bCs/>
+                <w:szCs w:val="22"/>
+              </w:rPr>
+              <w:t xml:space="preserve">: </w:t>
+            </w:r>
+            <w:r>
+              <w:rPr>
+                <w:rFonts w:ascii="Arial" w:eastAsia="Arial" w:hAnsi="Arial" w:cs="Arial"/>
+                <w:szCs w:val="22"/>
+              </w:rPr>
+              <w:t xml:space="preserve">El sistema deberá permitir al usuario </w:t>
+            </w:r>
+            <w:r>
+              <w:rPr>
+                <w:rFonts w:ascii="Arial" w:eastAsia="Arial" w:hAnsi="Arial" w:cs="Arial"/>
+                <w:szCs w:val="22"/>
+              </w:rPr>
+              <w:t xml:space="preserve">registrar la experiencia de un retiro que </w:t>
+            </w:r>
+            <w:r>
+              <w:rPr>
+                <w:rFonts w:ascii="Arial" w:eastAsia="Arial" w:hAnsi="Arial" w:cs="Arial"/>
+                <w:szCs w:val="22"/>
+              </w:rPr>
+              <w:t>haya asistido.</w:t>
             </w:r>
           </w:p>
         </w:tc>
@@ -3035,6 +3247,70 @@
                 <w:rFonts w:ascii="Arial" w:hAnsi="Arial" w:cs="Arial"/>
                 <w:szCs w:val="22"/>
               </w:rPr>
+              <w:t>12</w:t>
+            </w:r>
+          </w:p>
+        </w:tc>
+        <w:tc>
+          <w:tcPr>
+            <w:tcW w:w="7932" w:type="dxa"/>
+          </w:tcPr>
+          <w:p>
+            <w:pPr>
+              <w:spacing w:after="87" w:line="360" w:lineRule="auto"/>
+              <w:jc w:val="both"/>
+              <w:rPr>
+                <w:rFonts w:ascii="Arial" w:eastAsia="Arial" w:hAnsi="Arial" w:cs="Arial"/>
+                <w:szCs w:val="22"/>
+              </w:rPr>
+            </w:pPr>
+            <w:r>
+              <w:rPr>
+                <w:rFonts w:ascii="Arial" w:eastAsia="Arial" w:hAnsi="Arial" w:cs="Arial"/>
+                <w:b/>
+                <w:bCs/>
+                <w:szCs w:val="22"/>
+              </w:rPr>
+              <w:t>Registrar tipo de retiro:</w:t>
+            </w:r>
+            <w:r>
+              <w:rPr>
+                <w:rFonts w:ascii="Arial" w:eastAsia="Arial" w:hAnsi="Arial" w:cs="Arial"/>
+                <w:b/>
+                <w:bCs/>
+                <w:szCs w:val="22"/>
+              </w:rPr>
+              <w:t xml:space="preserve"> </w:t>
+            </w:r>
+            <w:r>
+              <w:rPr>
+                <w:rFonts w:ascii="Arial" w:eastAsia="Arial" w:hAnsi="Arial" w:cs="Arial"/>
+                <w:szCs w:val="22"/>
+              </w:rPr>
+              <w:t>El sistema deberá permitir registrar el tipo de retiro.</w:t>
+            </w:r>
+          </w:p>
+        </w:tc>
+      </w:tr>
+      <w:tr>
+        <w:tc>
+          <w:tcPr>
+            <w:tcW w:w="562" w:type="dxa"/>
+          </w:tcPr>
+          <w:p>
+            <w:pPr>
+              <w:spacing w:after="87" w:line="360" w:lineRule="auto"/>
+              <w:jc w:val="both"/>
+              <w:rPr>
+                <w:rFonts w:ascii="Arial" w:hAnsi="Arial" w:cs="Arial"/>
+                <w:szCs w:val="22"/>
+              </w:rPr>
+            </w:pPr>
+            <w:r>
+              <w:rPr>
+                <w:rFonts w:ascii="Arial" w:hAnsi="Arial" w:cs="Arial"/>
+                <w:szCs w:val="22"/>
+              </w:rPr>
               <w:t>13</w:t>
             </w:r>
           </w:p>
@@ -3061,14 +3337,262 @@
                 <w:bCs/>
                 <w:szCs w:val="22"/>
               </w:rPr>
-              <w:t>Registrar reseña de retiro</w:t>
+              <w:t>Modificar tipo de retiro:</w:t>
             </w:r>
             <w:r>
               <w:rPr>
                 <w:rFonts w:ascii="Arial" w:eastAsia="Arial" w:hAnsi="Arial" w:cs="Arial"/>
                 <w:szCs w:val="22"/>
               </w:rPr>
-              <w:t>: El sistema deberá permitir al usuario registrar una reseña sobre un retiro al que haya asistido.</w:t>
+              <w:t xml:space="preserve"> El sistema deberá permitir modificar la descripción del retiro.</w:t>
+            </w:r>
+          </w:p>
+        </w:tc>
+      </w:tr>
+      <w:tr>
+        <w:tc>
+          <w:tcPr>
+            <w:tcW w:w="562" w:type="dxa"/>
+          </w:tcPr>
+          <w:p>
+            <w:pPr>
+              <w:spacing w:after="87" w:line="360" w:lineRule="auto"/>
+              <w:jc w:val="both"/>
+              <w:rPr>
+                <w:rFonts w:ascii="Arial" w:hAnsi="Arial" w:cs="Arial"/>
+                <w:szCs w:val="22"/>
+              </w:rPr>
+            </w:pPr>
+            <w:r>
+              <w:rPr>
+                <w:rFonts w:ascii="Arial" w:hAnsi="Arial" w:cs="Arial"/>
+                <w:szCs w:val="22"/>
+              </w:rPr>
+              <w:t>14</w:t>
+            </w:r>
+          </w:p>
+        </w:tc>
+        <w:tc>
+          <w:tcPr>
+            <w:tcW w:w="7932" w:type="dxa"/>
+          </w:tcPr>
+          <w:p>
+            <w:pPr>
+              <w:spacing w:after="87" w:line="360" w:lineRule="auto"/>
+              <w:jc w:val="both"/>
+              <w:rPr>
+                <w:rFonts w:ascii="Arial" w:eastAsia="Arial" w:hAnsi="Arial" w:cs="Arial"/>
+                <w:b/>
+                <w:bCs/>
+                <w:szCs w:val="22"/>
+              </w:rPr>
+            </w:pPr>
+            <w:r>
+              <w:rPr>
+                <w:rFonts w:ascii="Arial" w:eastAsia="Arial" w:hAnsi="Arial" w:cs="Arial"/>
+                <w:b/>
+                <w:bCs/>
+                <w:szCs w:val="22"/>
+              </w:rPr>
+              <w:t>Consultar tipo de retiro:</w:t>
+            </w:r>
+            <w:r>
+              <w:rPr>
+                <w:rFonts w:ascii="Arial" w:eastAsia="Arial" w:hAnsi="Arial" w:cs="Arial"/>
+                <w:szCs w:val="22"/>
+              </w:rPr>
+              <w:t xml:space="preserve"> El sistema deberá permitir consultar el tipo de retiro.</w:t>
+            </w:r>
+          </w:p>
+        </w:tc>
+      </w:tr>
+      <w:tr>
+        <w:tc>
+          <w:tcPr>
+            <w:tcW w:w="562" w:type="dxa"/>
+          </w:tcPr>
+          <w:p>
+            <w:pPr>
+              <w:spacing w:after="87" w:line="360" w:lineRule="auto"/>
+              <w:jc w:val="both"/>
+              <w:rPr>
+                <w:rFonts w:ascii="Arial" w:hAnsi="Arial" w:cs="Arial"/>
+                <w:szCs w:val="22"/>
+              </w:rPr>
+            </w:pPr>
+            <w:r>
+              <w:rPr>
+                <w:rFonts w:ascii="Arial" w:hAnsi="Arial" w:cs="Arial"/>
+                <w:szCs w:val="22"/>
+              </w:rPr>
+              <w:t>15</w:t>
+            </w:r>
+          </w:p>
+        </w:tc>
+        <w:tc>
+          <w:tcPr>
+            <w:tcW w:w="7932" w:type="dxa"/>
+          </w:tcPr>
+          <w:p>
+            <w:pPr>
+              <w:spacing w:after="87" w:line="360" w:lineRule="auto"/>
+              <w:jc w:val="both"/>
+              <w:rPr>
+                <w:rFonts w:ascii="Arial" w:eastAsia="Arial" w:hAnsi="Arial" w:cs="Arial"/>
+                <w:szCs w:val="22"/>
+              </w:rPr>
+            </w:pPr>
+            <w:r>
+              <w:rPr>
+                <w:rFonts w:ascii="Arial" w:eastAsia="Arial" w:hAnsi="Arial" w:cs="Arial"/>
+                <w:b/>
+                <w:bCs/>
+                <w:szCs w:val="22"/>
+              </w:rPr>
+              <w:t xml:space="preserve">Registrar pago: </w:t>
+            </w:r>
+            <w:r>
+              <w:rPr>
+                <w:rFonts w:ascii="Arial" w:eastAsia="Arial" w:hAnsi="Arial" w:cs="Arial"/>
+                <w:szCs w:val="22"/>
+              </w:rPr>
+              <w:t>El sistema deberá permitir registrar el pago indicando el método de pago.</w:t>
+            </w:r>
+          </w:p>
+        </w:tc>
+      </w:tr>
+      <w:tr>
+        <w:tc>
+          <w:tcPr>
+            <w:tcW w:w="562" w:type="dxa"/>
+          </w:tcPr>
+          <w:p>
+            <w:pPr>
+              <w:spacing w:after="87" w:line="360" w:lineRule="auto"/>
+              <w:jc w:val="both"/>
+              <w:rPr>
+                <w:rFonts w:ascii="Arial" w:hAnsi="Arial" w:cs="Arial"/>
+                <w:szCs w:val="22"/>
+              </w:rPr>
+            </w:pPr>
+            <w:r>
+              <w:rPr>
+                <w:rFonts w:ascii="Arial" w:hAnsi="Arial" w:cs="Arial"/>
+                <w:szCs w:val="22"/>
+              </w:rPr>
+              <w:lastRenderedPageBreak/>
+              <w:t>16</w:t>
+            </w:r>
+          </w:p>
+        </w:tc>
+        <w:tc>
+          <w:tcPr>
+            <w:tcW w:w="7932" w:type="dxa"/>
+          </w:tcPr>
+          <w:p>
+            <w:pPr>
+              <w:spacing w:after="87" w:line="360" w:lineRule="auto"/>
+              <w:jc w:val="both"/>
+              <w:rPr>
+                <w:rFonts w:ascii="Arial" w:eastAsia="Arial" w:hAnsi="Arial" w:cs="Arial"/>
+                <w:b/>
+                <w:bCs/>
+                <w:szCs w:val="22"/>
+              </w:rPr>
+            </w:pPr>
+            <w:r>
+              <w:rPr>
+                <w:rFonts w:ascii="Arial" w:eastAsia="Arial" w:hAnsi="Arial" w:cs="Arial"/>
+                <w:b/>
+                <w:bCs/>
+                <w:szCs w:val="22"/>
+              </w:rPr>
+              <w:t xml:space="preserve">Modificar pago: </w:t>
+            </w:r>
+            <w:r>
+              <w:rPr>
+                <w:rFonts w:ascii="Arial" w:eastAsia="Arial" w:hAnsi="Arial" w:cs="Arial"/>
+                <w:szCs w:val="22"/>
+              </w:rPr>
+              <w:t xml:space="preserve">El sistema deberá permitir modificar </w:t>
+            </w:r>
+            <w:r>
+              <w:rPr>
+                <w:rFonts w:ascii="Arial" w:eastAsia="Arial" w:hAnsi="Arial" w:cs="Arial"/>
+                <w:szCs w:val="22"/>
+              </w:rPr>
+              <w:t>el monto del pago.</w:t>
+            </w:r>
+          </w:p>
+        </w:tc>
+      </w:tr>
+      <w:tr>
+        <w:tc>
+          <w:tcPr>
+            <w:tcW w:w="562" w:type="dxa"/>
+          </w:tcPr>
+          <w:p>
+            <w:pPr>
+              <w:spacing w:after="87" w:line="360" w:lineRule="auto"/>
+              <w:jc w:val="both"/>
+              <w:rPr>
+                <w:rFonts w:ascii="Arial" w:hAnsi="Arial" w:cs="Arial"/>
+                <w:szCs w:val="22"/>
+              </w:rPr>
+            </w:pPr>
+            <w:r>
+              <w:rPr>
+                <w:rFonts w:ascii="Arial" w:hAnsi="Arial" w:cs="Arial"/>
+                <w:szCs w:val="22"/>
+              </w:rPr>
+              <w:t>17</w:t>
+            </w:r>
+          </w:p>
+        </w:tc>
+        <w:tc>
+          <w:tcPr>
+            <w:tcW w:w="7932" w:type="dxa"/>
+          </w:tcPr>
+          <w:p>
+            <w:pPr>
+              <w:spacing w:after="87" w:line="360" w:lineRule="auto"/>
+              <w:jc w:val="both"/>
+              <w:rPr>
+                <w:rFonts w:ascii="Arial" w:eastAsia="Arial" w:hAnsi="Arial" w:cs="Arial"/>
+                <w:b/>
+                <w:bCs/>
+                <w:szCs w:val="22"/>
+              </w:rPr>
+            </w:pPr>
+            <w:r>
+              <w:rPr>
+                <w:rFonts w:ascii="Arial" w:eastAsia="Arial" w:hAnsi="Arial" w:cs="Arial"/>
+                <w:b/>
+                <w:bCs/>
+                <w:szCs w:val="22"/>
+              </w:rPr>
+              <w:t>Consultar pago:</w:t>
+            </w:r>
+            <w:r>
+              <w:rPr>
+                <w:rFonts w:ascii="Arial" w:eastAsia="Arial" w:hAnsi="Arial" w:cs="Arial"/>
+                <w:szCs w:val="22"/>
+              </w:rPr>
+              <w:t xml:space="preserve"> </w:t>
+            </w:r>
+            <w:r>
+              <w:rPr>
+                <w:rFonts w:ascii="Arial" w:eastAsia="Arial" w:hAnsi="Arial" w:cs="Arial"/>
+                <w:szCs w:val="22"/>
+              </w:rPr>
+              <w:t xml:space="preserve">El sistema deberá permitir consultar el </w:t>
+            </w:r>
+            <w:r>
+              <w:rPr>
+                <w:rFonts w:ascii="Arial" w:eastAsia="Arial" w:hAnsi="Arial" w:cs="Arial"/>
+                <w:szCs w:val="22"/>
+              </w:rPr>
+              <w:t>pago.</w:t>
             </w:r>
           </w:p>
         </w:tc>
@@ -3081,78 +3605,6 @@
         <w:rPr>
           <w:rFonts w:ascii="Arial" w:hAnsi="Arial" w:cs="Arial"/>
           <w:szCs w:val="22"/>
-        </w:rPr>
-      </w:pPr>
-    </w:p>
-    <w:p>
-      <w:pPr>
-        <w:spacing w:after="0" w:line="360" w:lineRule="auto"/>
-        <w:ind w:left="-5" w:hanging="10"/>
-        <w:jc w:val="both"/>
-        <w:rPr>
-          <w:rFonts w:ascii="Arial" w:eastAsia="Arial" w:hAnsi="Arial" w:cs="Arial"/>
-          <w:szCs w:val="22"/>
-          <w:shd w:val="clear" w:color="auto" w:fill="FFFF00"/>
-        </w:rPr>
-      </w:pPr>
-    </w:p>
-    <w:p>
-      <w:pPr>
-        <w:spacing w:after="0" w:line="360" w:lineRule="auto"/>
-        <w:ind w:left="-5" w:hanging="10"/>
-        <w:jc w:val="both"/>
-        <w:rPr>
-          <w:rFonts w:ascii="Arial" w:eastAsia="Arial" w:hAnsi="Arial" w:cs="Arial"/>
-          <w:szCs w:val="22"/>
-          <w:shd w:val="clear" w:color="auto" w:fill="FFFF00"/>
-        </w:rPr>
-      </w:pPr>
-    </w:p>
-    <w:p>
-      <w:pPr>
-        <w:spacing w:after="0" w:line="360" w:lineRule="auto"/>
-        <w:ind w:left="-5" w:hanging="10"/>
-        <w:jc w:val="both"/>
-        <w:rPr>
-          <w:rFonts w:ascii="Arial" w:eastAsia="Arial" w:hAnsi="Arial" w:cs="Arial"/>
-          <w:szCs w:val="22"/>
-          <w:shd w:val="clear" w:color="auto" w:fill="FFFF00"/>
-        </w:rPr>
-      </w:pPr>
-    </w:p>
-    <w:p>
-      <w:pPr>
-        <w:spacing w:after="0" w:line="360" w:lineRule="auto"/>
-        <w:ind w:left="-5" w:hanging="10"/>
-        <w:jc w:val="both"/>
-        <w:rPr>
-          <w:rFonts w:ascii="Arial" w:eastAsia="Arial" w:hAnsi="Arial" w:cs="Arial"/>
-          <w:szCs w:val="22"/>
-          <w:shd w:val="clear" w:color="auto" w:fill="FFFF00"/>
-        </w:rPr>
-      </w:pPr>
-    </w:p>
-    <w:p>
-      <w:pPr>
-        <w:spacing w:after="0" w:line="360" w:lineRule="auto"/>
-        <w:ind w:left="-5" w:hanging="10"/>
-        <w:jc w:val="both"/>
-        <w:rPr>
-          <w:rFonts w:ascii="Arial" w:eastAsia="Arial" w:hAnsi="Arial" w:cs="Arial"/>
-          <w:szCs w:val="22"/>
-          <w:shd w:val="clear" w:color="auto" w:fill="FFFF00"/>
-        </w:rPr>
-      </w:pPr>
-    </w:p>
-    <w:p>
-      <w:pPr>
-        <w:spacing w:after="0" w:line="360" w:lineRule="auto"/>
-        <w:ind w:left="-5" w:hanging="10"/>
-        <w:jc w:val="both"/>
-        <w:rPr>
-          <w:rFonts w:ascii="Arial" w:eastAsia="Arial" w:hAnsi="Arial" w:cs="Arial"/>
-          <w:szCs w:val="22"/>
-          <w:shd w:val="clear" w:color="auto" w:fill="FFFF00"/>
         </w:rPr>
       </w:pPr>
     </w:p>
@@ -3196,16 +3648,6 @@
         </w:rPr>
         <w:t>iagrama de clases</w:t>
       </w:r>
-    </w:p>
-    <w:p>
-      <w:pPr>
-        <w:spacing w:after="180" w:line="360" w:lineRule="auto"/>
-        <w:ind w:left="-5"/>
-        <w:jc w:val="center"/>
-        <w:rPr>
-          <w:szCs w:val="22"/>
-        </w:rPr>
-      </w:pPr>
     </w:p>
     <w:p>
       <w:pPr>
@@ -3408,7 +3850,14 @@
           <w:rFonts w:ascii="Arial" w:eastAsia="Arial" w:hAnsi="Arial" w:cs="Arial"/>
           <w:szCs w:val="22"/>
         </w:rPr>
-        <w:t xml:space="preserve">Se relevó la existencia de un cronograma diario que detalla las actividades a realizar durante cada jornada del retiro, información que resulta relevante para el registro y consulta de actividades dentro del sistema </w:t>
+        <w:t>Se relevó la existencia de un cronograma diario que detalla las actividades a realizar durante cada jornada del retiro, información que resulta releva</w:t>
+      </w:r>
+      <w:r>
+        <w:rPr>
+          <w:rFonts w:ascii="Arial" w:eastAsia="Arial" w:hAnsi="Arial" w:cs="Arial"/>
+          <w:szCs w:val="22"/>
+        </w:rPr>
+        <w:t xml:space="preserve">nte para el registro y consulta de actividades dentro del sistema </w:t>
       </w:r>
       <w:r>
         <w:rPr>
@@ -3688,7 +4137,7 @@
               </wp:inline>
             </w:drawing>
           </mc:Choice>
-          <mc:Fallback>
+          <mc:Fallback xmlns:oel="http://schemas.microsoft.com/office/2019/extlst">
             <w:pict>
               <v:group w14:anchorId="4B2EBF49" id="Group 13652" o:spid="_x0000_s1026" style="width:458.5pt;height:370.3pt;mso-position-horizontal-relative:char;mso-position-vertical-relative:line" coordsize="58230,47026" o:gfxdata="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">
                 <v:rect id="Cuadro de texto 1273801431" o:spid="_x0000_s1027" style="position:absolute;width:406;height:1396;visibility:visible;mso-wrap-style:square;v-text-anchor:top" o:gfxdata="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" filled="f" stroked="f" strokeweight="0">
@@ -5703,7 +6152,7 @@
               </wp:inline>
             </w:drawing>
           </mc:Choice>
-          <mc:Fallback>
+          <mc:Fallback xmlns:oel="http://schemas.microsoft.com/office/2019/extlst">
             <w:pict>
               <v:group w14:anchorId="04E825D1" id="Group 14120" o:spid="_x0000_s1034" style="width:456.1pt;height:422.55pt;mso-position-horizontal-relative:char;mso-position-vertical-relative:line" coordsize="57924,53665" o:gfxdata="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">
                 <v:rect id="Cuadro de texto 1021373637" o:spid="_x0000_s1035" style="position:absolute;left:57524;top:30034;width:400;height:1404;visibility:visible;mso-wrap-style:square;v-text-anchor:top" o:gfxdata="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" filled="f" stroked="f" strokeweight="0">
@@ -6650,7 +7099,7 @@
               </wp:inline>
             </w:drawing>
           </mc:Choice>
-          <mc:Fallback>
+          <mc:Fallback xmlns:oel="http://schemas.microsoft.com/office/2019/extlst">
             <w:pict>
               <v:group w14:anchorId="59BC129E" id="Group 13936" o:spid="_x0000_s1077" style="width:458.5pt;height:290.8pt;mso-position-horizontal-relative:char;mso-position-vertical-relative:line" coordsize="58230,36932" o:gfxdata="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">
                 <v:rect id="Cuadro de texto 1615641859" o:spid="_x0000_s1078" style="position:absolute;left:57823;top:33577;width:407;height:1397;visibility:visible;mso-wrap-style:square;v-text-anchor:top" o:gfxdata="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" filled="f" stroked="f" strokeweight="0">
@@ -6781,7 +7230,14 @@
           <w:rFonts w:ascii="Arial" w:hAnsi="Arial" w:cs="Arial"/>
           <w:szCs w:val="22"/>
         </w:rPr>
-        <w:t>Se relevó la existencia de material audiovisual que proporciona información general sobre el retiro, permitiendo identificar características, actividades y aspectos relevantes para el registro de información dentro del sistema.</w:t>
+        <w:t xml:space="preserve">Se relevó la existencia de </w:t>
+      </w:r>
+      <w:r>
+        <w:rPr>
+          <w:rFonts w:ascii="Arial" w:hAnsi="Arial" w:cs="Arial"/>
+          <w:szCs w:val="22"/>
+        </w:rPr>
+        <w:t>material audiovisual que proporciona información general sobre el retiro, permitiendo identificar características, actividades y aspectos relevantes para el registro de información dentro del sistema.</w:t>
       </w:r>
     </w:p>
     <w:p>
@@ -7025,7 +7481,7 @@
               </wp:inline>
             </w:drawing>
           </mc:Choice>
-          <mc:Fallback>
+          <mc:Fallback xmlns:oel="http://schemas.microsoft.com/office/2019/extlst">
             <w:pict>
               <v:group w14:anchorId="208CB4FF" id="Group 13937" o:spid="_x0000_s1085" style="width:457pt;height:266.3pt;mso-position-horizontal-relative:char;mso-position-vertical-relative:line" coordsize="58039,33818" o:gfxdata="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">
                 <v:rect id="Cuadro de texto 966845656" o:spid="_x0000_s1086" style="position:absolute;left:57632;top:32421;width:407;height:1397;visibility:visible;mso-wrap-style:square;v-text-anchor:top" o:gfxdata="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" filled="f" stroked="f" strokeweight="0">
@@ -7075,7 +7531,14 @@
           <w:rFonts w:ascii="Arial" w:eastAsia="Arial" w:hAnsi="Arial" w:cs="Arial"/>
           <w:szCs w:val="22"/>
         </w:rPr>
-        <w:t>Se relevó información sobre los costos de los distintos programas disponibles, permitiendo identificar la necesidad de registrar precios y modalidades de contratación dentro del sistema.</w:t>
+        <w:t xml:space="preserve">Se relevó información sobre los costos de los </w:t>
+      </w:r>
+      <w:r>
+        <w:rPr>
+          <w:rFonts w:ascii="Arial" w:eastAsia="Arial" w:hAnsi="Arial" w:cs="Arial"/>
+          <w:szCs w:val="22"/>
+        </w:rPr>
+        <w:t>distintos programas disponibles, permitiendo identificar la necesidad de registrar precios y modalidades de contratación dentro del sistema.</w:t>
       </w:r>
     </w:p>
     <w:p>
@@ -7180,7 +7643,14 @@
           <w:szCs w:val="22"/>
         </w:rPr>
         <w:lastRenderedPageBreak/>
-        <w:t>Presenta una galería de imágenes de retiros realizados anteriormente, permitiendo visualizar las instalaciones, actividades desarrolladas y experiencias de los participantes.</w:t>
+        <w:t>Presenta una galería de imágenes de retiros realizados anteriormente, permitiendo visualizar las instalacione</w:t>
+      </w:r>
+      <w:r>
+        <w:rPr>
+          <w:rFonts w:ascii="Arial" w:hAnsi="Arial" w:cs="Arial"/>
+          <w:szCs w:val="22"/>
+        </w:rPr>
+        <w:t>s, actividades desarrolladas y experiencias de los participantes.</w:t>
       </w:r>
     </w:p>
     <w:p>
@@ -7274,7 +7744,14 @@
           <w:rFonts w:ascii="Arial" w:eastAsia="Arial" w:hAnsi="Arial" w:cs="Arial"/>
           <w:szCs w:val="22"/>
         </w:rPr>
-        <w:t xml:space="preserve">Dispone de un formulario de contacto para realizar consultas o solicitar información adicional, además de proporcionar la ubicación del establecimiento donde se desarrollan las actividades. </w:t>
+        <w:t>Dispone de un formulario de contacto para realizar consultas o solicitar información adicional, además de proporcionar la ubicación del establecimiento donde se desarrollan las activida</w:t>
+      </w:r>
+      <w:r>
+        <w:rPr>
+          <w:rFonts w:ascii="Arial" w:eastAsia="Arial" w:hAnsi="Arial" w:cs="Arial"/>
+          <w:szCs w:val="22"/>
+        </w:rPr>
+        <w:t xml:space="preserve">des. </w:t>
       </w:r>
     </w:p>
     <w:p>
@@ -8352,7 +8829,7 @@
               </wp:inline>
             </w:drawing>
           </mc:Choice>
-          <mc:Fallback>
+          <mc:Fallback xmlns:oel="http://schemas.microsoft.com/office/2019/extlst">
             <w:pict>
               <v:group w14:anchorId="7503BE9B" id="Group 13482" o:spid="_x0000_s1092" style="width:458.5pt;height:247.05pt;mso-position-horizontal-relative:char;mso-position-vertical-relative:line" coordsize="58230,31374" o:gfxdata="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">
                 <v:rect id="Cuadro de texto 1413906796" o:spid="_x0000_s1093" style="position:absolute;width:8838;height:1396;visibility:visible;mso-wrap-style:square;v-text-anchor:top" o:gfxdata="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" filled="f" stroked="f" strokeweight="0">
@@ -8943,7 +9420,7 @@
               </wp:inline>
             </w:drawing>
           </mc:Choice>
-          <mc:Fallback>
+          <mc:Fallback xmlns:oel="http://schemas.microsoft.com/office/2019/extlst">
             <w:pict>
               <v:group w14:anchorId="3A727210" id="Group 14340" o:spid="_x0000_s1113" style="width:458.5pt;height:220.3pt;mso-position-horizontal-relative:char;mso-position-vertical-relative:line" coordsize="58230,27979" o:gfxdata="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">
                 <v:rect id="Cuadro de texto 159190001" o:spid="_x0000_s1114" style="position:absolute;left:57823;top:24638;width:407;height:1390;visibility:visible;mso-wrap-style:square;v-text-anchor:top" o:gfxdata="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" filled="f" stroked="f" strokeweight="0">
@@ -9257,7 +9734,7 @@
               </wp:inline>
             </w:drawing>
           </mc:Choice>
-          <mc:Fallback>
+          <mc:Fallback xmlns:oel="http://schemas.microsoft.com/office/2019/extlst">
             <w:pict>
               <v:group w14:anchorId="21F869E3" id="Group 14341" o:spid="_x0000_s1121" style="width:332.5pt;height:364.9pt;mso-position-horizontal-relative:char;mso-position-vertical-relative:line" coordsize="42228,46342" o:gfxdata="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">
                 <v:rect id="Cuadro de texto 595414710" o:spid="_x0000_s1122" style="position:absolute;left:41821;top:44946;width:407;height:1396;visibility:visible;mso-wrap-style:square;v-text-anchor:top" o:gfxdata="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" filled="f" stroked="f" strokeweight="0">
@@ -9308,7 +9785,14 @@
           <w:rFonts w:ascii="Arial" w:hAnsi="Arial" w:cs="Arial"/>
           <w:szCs w:val="22"/>
         </w:rPr>
-        <w:t>Se relevó información sobre los precios del retiro, permitiendo identificar la necesidad de registrar costos, modalidades de pago y servicios incluidos para facilitar la comparación entre distintas opciones.</w:t>
+        <w:t xml:space="preserve">Se relevó información sobre los precios del retiro, </w:t>
+      </w:r>
+      <w:r>
+        <w:rPr>
+          <w:rFonts w:ascii="Arial" w:hAnsi="Arial" w:cs="Arial"/>
+          <w:szCs w:val="22"/>
+        </w:rPr>
+        <w:t>permitiendo identificar la necesidad de registrar costos, modalidades de pago y servicios incluidos para facilitar la comparación entre distintas opciones.</w:t>
       </w:r>
     </w:p>
     <w:p>
@@ -9601,7 +10085,7 @@
               </wp:inline>
             </w:drawing>
           </mc:Choice>
-          <mc:Fallback>
+          <mc:Fallback xmlns:oel="http://schemas.microsoft.com/office/2019/extlst">
             <w:pict>
               <v:group w14:anchorId="553BA031" id="Group 14435" o:spid="_x0000_s1128" style="width:458.5pt;height:245.8pt;mso-position-horizontal-relative:char;mso-position-vertical-relative:line" coordsize="58230,31215" o:gfxdata="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">
                 <v:rect id="Cuadro de texto 103480568" o:spid="_x0000_s1129" style="position:absolute;left:57823;top:27871;width:407;height:1389;visibility:visible;mso-wrap-style:square;v-text-anchor:top" o:gfxdata="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" filled="f" stroked="f" strokeweight="0">
@@ -9717,7 +10201,14 @@
           <w:rFonts w:ascii="Arial" w:eastAsia="Arial" w:hAnsi="Arial" w:cs="Arial"/>
           <w:szCs w:val="22"/>
         </w:rPr>
-        <w:t>Detalla los servicios y beneficios incluidos en la experiencia, tales como alojamiento, alimentación, actividades programadas y materiales necesarios para la participación.</w:t>
+        <w:t xml:space="preserve">Detalla los servicios y beneficios incluidos en la experiencia, tales como alojamiento, </w:t>
+      </w:r>
+      <w:r>
+        <w:rPr>
+          <w:rFonts w:ascii="Arial" w:eastAsia="Arial" w:hAnsi="Arial" w:cs="Arial"/>
+          <w:szCs w:val="22"/>
+        </w:rPr>
+        <w:t>alimentación, actividades programadas y materiales necesarios para la participación.</w:t>
       </w:r>
       <w:r>
         <w:rPr>
@@ -9802,7 +10293,14 @@
           <w:rFonts w:ascii="Arial" w:eastAsia="Arial" w:hAnsi="Arial" w:cs="Arial"/>
           <w:szCs w:val="22"/>
         </w:rPr>
-        <w:t>Presenta una galería de imágenes correspondientes a retiros realizados anteriormente, permitiendo visualizar las instalaciones, actividades desarrolladas y el entorno en el que se llevan a cabo las experiencias.</w:t>
+        <w:t xml:space="preserve">Presenta una galería de imágenes correspondientes a retiros realizados anteriormente, permitiendo visualizar las instalaciones, actividades desarrolladas y el entorno </w:t>
+      </w:r>
+      <w:r>
+        <w:rPr>
+          <w:rFonts w:ascii="Arial" w:eastAsia="Arial" w:hAnsi="Arial" w:cs="Arial"/>
+          <w:szCs w:val="22"/>
+        </w:rPr>
+        <w:t>en el que se llevan a cabo las experiencias.</w:t>
       </w:r>
     </w:p>
     <w:p>
@@ -9957,7 +10455,14 @@
           <w:rFonts w:ascii="Arial" w:eastAsia="Arial" w:hAnsi="Arial" w:cs="Arial"/>
           <w:szCs w:val="22"/>
         </w:rPr>
-        <w:t>Presenta información sobre las personas responsables de la organización y coordinación del retiro, incluyendo su experiencia, formación y rol dentro de las actividades propuestas.</w:t>
+        <w:t>Presenta inform</w:t>
+      </w:r>
+      <w:r>
+        <w:rPr>
+          <w:rFonts w:ascii="Arial" w:eastAsia="Arial" w:hAnsi="Arial" w:cs="Arial"/>
+          <w:szCs w:val="22"/>
+        </w:rPr>
+        <w:t>ación sobre las personas responsables de la organización y coordinación del retiro, incluyendo su experiencia, formación y rol dentro de las actividades propuestas.</w:t>
       </w:r>
       <w:r>
         <w:rPr>
@@ -10025,7 +10530,14 @@
           <w:szCs w:val="22"/>
         </w:rPr>
         <w:lastRenderedPageBreak/>
-        <w:t>Se relevó información sobre fechas, ubicación y costo del retiro, permitiendo identificar la necesidad de registrar estos datos para facilitar la organización, consulta y comparación de diferentes propuestas.</w:t>
+        <w:t>Se relevó información sobre fechas, ubicación y costo del retiro, permitiendo identificar</w:t>
+      </w:r>
+      <w:r>
+        <w:rPr>
+          <w:rFonts w:ascii="Arial" w:hAnsi="Arial" w:cs="Arial"/>
+          <w:szCs w:val="22"/>
+        </w:rPr>
+        <w:t xml:space="preserve"> la necesidad de registrar estos datos para facilitar la organización, consulta y comparación de diferentes propuestas.</w:t>
       </w:r>
     </w:p>
     <w:p>
@@ -10103,7 +10615,14 @@
           <w:rFonts w:ascii="Arial" w:eastAsia="Arial" w:hAnsi="Arial" w:cs="Arial"/>
           <w:szCs w:val="22"/>
         </w:rPr>
-        <w:t>Detalla las modalidades y medios de pago disponibles para la contratación del retiro, incluyendo opciones de transferencia, efectivo, cuotas u otros mecanismos habilitados por la organización.</w:t>
+        <w:t xml:space="preserve">Detalla las modalidades y medios de pago disponibles para la contratación del retiro, incluyendo opciones de </w:t>
+      </w:r>
+      <w:r>
+        <w:rPr>
+          <w:rFonts w:ascii="Arial" w:eastAsia="Arial" w:hAnsi="Arial" w:cs="Arial"/>
+          <w:szCs w:val="22"/>
+        </w:rPr>
+        <w:t>transferencia, efectivo, cuotas u otros mecanismos habilitados por la organización.</w:t>
       </w:r>
     </w:p>
     <w:p>
@@ -10253,7 +10772,14 @@
           <w:rFonts w:ascii="Arial" w:eastAsia="Arial" w:hAnsi="Arial" w:cs="Arial"/>
           <w:szCs w:val="22"/>
         </w:rPr>
-        <w:t xml:space="preserve"> Presenta información detallada sobre las distintas propuestas y programas ofrecidos, incluyendo sus características, objetivos, actividades y condiciones de participación.</w:t>
+        <w:t xml:space="preserve"> Presenta información detallada sobre las dist</w:t>
+      </w:r>
+      <w:r>
+        <w:rPr>
+          <w:rFonts w:ascii="Arial" w:eastAsia="Arial" w:hAnsi="Arial" w:cs="Arial"/>
+          <w:szCs w:val="22"/>
+        </w:rPr>
+        <w:t>intas propuestas y programas ofrecidos, incluyendo sus características, objetivos, actividades y condiciones de participación.</w:t>
       </w:r>
       <w:r>
         <w:rPr>
@@ -10377,7 +10903,7 @@
 </file>
 
 <file path=word/endnotes.xml><?xml version="1.0" encoding="utf-8"?>
-<w:endnotes xmlns:wpc="http://schemas.microsoft.com/office/word/2010/wordprocessingCanvas" xmlns:cx="http://schemas.microsoft.com/office/drawing/2014/chartex" xmlns:cx1="http://schemas.microsoft.com/office/drawing/2015/9/8/chartex" xmlns:cx2="http://schemas.microsoft.com/office/drawing/2015/10/21/chartex" xmlns:cx3="http://schemas.microsoft.com/office/drawing/2016/5/9/chartex" xmlns:cx4="http://schemas.microsoft.com/office/drawing/2016/5/10/chartex" xmlns:cx5="http://schemas.microsoft.com/office/drawing/2016/5/11/chartex" xmlns:cx6="http://schemas.microsoft.com/office/drawing/2016/5/12/chartex" xmlns:cx7="http://schemas.microsoft.com/office/drawing/2016/5/13/chartex" xmlns:cx8="http://schemas.microsoft.com/office/drawing/2016/5/14/chartex" xmlns:mc="http://schemas.openxmlformats.org/markup-compatibility/2006" xmlns:aink="http://schemas.microsoft.com/office/drawing/2016/ink" xmlns:am3d="http://schemas.microsoft.com/office/drawing/2017/model3d" xmlns:o="urn:schemas-microsoft-com:office:office" xmlns:oel="http://schemas.microsoft.com/office/2019/extlst" xmlns:r="http://schemas.openxmlformats.org/officeDocument/2006/relationships" xmlns:m="http://schemas.openxmlformats.org/officeDocument/2006/math" xmlns:v="urn:schemas-microsoft-com:vml" xmlns:wp14="http://schemas.microsoft.com/office/word/2010/wordprocessingDrawing" xmlns:wp="http://schemas.openxmlformats.org/drawingml/2006/wordprocessingDrawing" xmlns:w10="urn:schemas-microsoft-com:office:word" xmlns:w="http://schemas.openxmlformats.org/wordprocessingml/2006/main" xmlns:w14="http://schemas.microsoft.com/office/word/2010/wordml" xmlns:w15="http://schemas.microsoft.com/office/word/2012/wordml" xmlns:w16cex="http://schemas.microsoft.com/office/word/2018/wordml/cex" xmlns:w16cid="http://schemas.microsoft.com/office/word/2016/wordml/cid" xmlns:w16="http://schemas.microsoft.com/office/word/2018/wordml" xmlns:w16sdtdh="http://schemas.microsoft.com/office/word/2020/wordml/sdtdatahash" xmlns:w16se="http://schemas.microsoft.com/office/word/2015/wordml/symex" xmlns:wpg="http://schemas.microsoft.com/office/word/2010/wordprocessingGroup" xmlns:wpi="http://schemas.microsoft.com/office/word/2010/wordprocessingInk" xmlns:wne="http://schemas.microsoft.com/office/word/2006/wordml" xmlns:wps="http://schemas.microsoft.com/office/word/2010/wordprocessingShape" mc:Ignorable="w14 w15 w16se w16cid w16 w16cex w16sdtdh wp14">
+<w:endnotes xmlns:wpc="http://schemas.microsoft.com/office/word/2010/wordprocessingCanvas" xmlns:cx="http://schemas.microsoft.com/office/drawing/2014/chartex" xmlns:cx1="http://schemas.microsoft.com/office/drawing/2015/9/8/chartex" xmlns:cx2="http://schemas.microsoft.com/office/drawing/2015/10/21/chartex" xmlns:cx3="http://schemas.microsoft.com/office/drawing/2016/5/9/chartex" xmlns:cx4="http://schemas.microsoft.com/office/drawing/2016/5/10/chartex" xmlns:cx5="http://schemas.microsoft.com/office/drawing/2016/5/11/chartex" xmlns:cx6="http://schemas.microsoft.com/office/drawing/2016/5/12/chartex" xmlns:cx7="http://schemas.microsoft.com/office/drawing/2016/5/13/chartex" xmlns:cx8="http://schemas.microsoft.com/office/drawing/2016/5/14/chartex" xmlns:mc="http://schemas.openxmlformats.org/markup-compatibility/2006" xmlns:aink="http://schemas.microsoft.com/office/drawing/2016/ink" xmlns:am3d="http://schemas.microsoft.com/office/drawing/2017/model3d" xmlns:o="urn:schemas-microsoft-com:office:office" xmlns:r="http://schemas.openxmlformats.org/officeDocument/2006/relationships" xmlns:m="http://schemas.openxmlformats.org/officeDocument/2006/math" xmlns:v="urn:schemas-microsoft-com:vml" xmlns:wp14="http://schemas.microsoft.com/office/word/2010/wordprocessingDrawing" xmlns:wp="http://schemas.openxmlformats.org/drawingml/2006/wordprocessingDrawing" xmlns:w10="urn:schemas-microsoft-com:office:word" xmlns:w="http://schemas.openxmlformats.org/wordprocessingml/2006/main" xmlns:w14="http://schemas.microsoft.com/office/word/2010/wordml" xmlns:w15="http://schemas.microsoft.com/office/word/2012/wordml" xmlns:w16cex="http://schemas.microsoft.com/office/word/2018/wordml/cex" xmlns:w16cid="http://schemas.microsoft.com/office/word/2016/wordml/cid" xmlns:w16="http://schemas.microsoft.com/office/word/2018/wordml" xmlns:w16sdtdh="http://schemas.microsoft.com/office/word/2020/wordml/sdtdatahash" xmlns:w16se="http://schemas.microsoft.com/office/word/2015/wordml/symex" xmlns:wpg="http://schemas.microsoft.com/office/word/2010/wordprocessingGroup" xmlns:wpi="http://schemas.microsoft.com/office/word/2010/wordprocessingInk" xmlns:wne="http://schemas.microsoft.com/office/word/2006/wordml" xmlns:wps="http://schemas.microsoft.com/office/word/2010/wordprocessingShape" mc:Ignorable="w14 w15 w16se w16cid w16 w16cex w16sdtdh wp14">
   <w:endnote w:type="separator" w:id="-1">
     <w:p>
       <w:pPr>
@@ -10402,7 +10928,7 @@
 </file>
 
 <file path=word/footer1.xml><?xml version="1.0" encoding="utf-8"?>
-<w:ftr xmlns:wpc="http://schemas.microsoft.com/office/word/2010/wordprocessingCanvas" xmlns:cx="http://schemas.microsoft.com/office/drawing/2014/chartex" xmlns:cx1="http://schemas.microsoft.com/office/drawing/2015/9/8/chartex" xmlns:cx2="http://schemas.microsoft.com/office/drawing/2015/10/21/chartex" xmlns:cx3="http://schemas.microsoft.com/office/drawing/2016/5/9/chartex" xmlns:cx4="http://schemas.microsoft.com/office/drawing/2016/5/10/chartex" xmlns:cx5="http://schemas.microsoft.com/office/drawing/2016/5/11/chartex" xmlns:cx6="http://schemas.microsoft.com/office/drawing/2016/5/12/chartex" xmlns:cx7="http://schemas.microsoft.com/office/drawing/2016/5/13/chartex" xmlns:cx8="http://schemas.microsoft.com/office/drawing/2016/5/14/chartex" xmlns:mc="http://schemas.openxmlformats.org/markup-compatibility/2006" xmlns:aink="http://schemas.microsoft.com/office/drawing/2016/ink" xmlns:am3d="http://schemas.microsoft.com/office/drawing/2017/model3d" xmlns:o="urn:schemas-microsoft-com:office:office" xmlns:oel="http://schemas.microsoft.com/office/2019/extlst" xmlns:r="http://schemas.openxmlformats.org/officeDocument/2006/relationships" xmlns:m="http://schemas.openxmlformats.org/officeDocument/2006/math" xmlns:v="urn:schemas-microsoft-com:vml" xmlns:wp14="http://schemas.microsoft.com/office/word/2010/wordprocessingDrawing" xmlns:wp="http://schemas.openxmlformats.org/drawingml/2006/wordprocessingDrawing" xmlns:w10="urn:schemas-microsoft-com:office:word" xmlns:w="http://schemas.openxmlformats.org/wordprocessingml/2006/main" xmlns:w14="http://schemas.microsoft.com/office/word/2010/wordml" xmlns:w15="http://schemas.microsoft.com/office/word/2012/wordml" xmlns:w16cex="http://schemas.microsoft.com/office/word/2018/wordml/cex" xmlns:w16cid="http://schemas.microsoft.com/office/word/2016/wordml/cid" xmlns:w16="http://schemas.microsoft.com/office/word/2018/wordml" xmlns:w16sdtdh="http://schemas.microsoft.com/office/word/2020/wordml/sdtdatahash" xmlns:w16se="http://schemas.microsoft.com/office/word/2015/wordml/symex" xmlns:wpg="http://schemas.microsoft.com/office/word/2010/wordprocessingGroup" xmlns:wpi="http://schemas.microsoft.com/office/word/2010/wordprocessingInk" xmlns:wne="http://schemas.microsoft.com/office/word/2006/wordml" xmlns:wps="http://schemas.microsoft.com/office/word/2010/wordprocessingShape" mc:Ignorable="w14 w15 w16se w16cid w16 w16cex w16sdtdh wp14">
+<w:ftr xmlns:wpc="http://schemas.microsoft.com/office/word/2010/wordprocessingCanvas" xmlns:cx="http://schemas.microsoft.com/office/drawing/2014/chartex" xmlns:cx1="http://schemas.microsoft.com/office/drawing/2015/9/8/chartex" xmlns:cx2="http://schemas.microsoft.com/office/drawing/2015/10/21/chartex" xmlns:cx3="http://schemas.microsoft.com/office/drawing/2016/5/9/chartex" xmlns:cx4="http://schemas.microsoft.com/office/drawing/2016/5/10/chartex" xmlns:cx5="http://schemas.microsoft.com/office/drawing/2016/5/11/chartex" xmlns:cx6="http://schemas.microsoft.com/office/drawing/2016/5/12/chartex" xmlns:cx7="http://schemas.microsoft.com/office/drawing/2016/5/13/chartex" xmlns:cx8="http://schemas.microsoft.com/office/drawing/2016/5/14/chartex" xmlns:mc="http://schemas.openxmlformats.org/markup-compatibility/2006" xmlns:aink="http://schemas.microsoft.com/office/drawing/2016/ink" xmlns:am3d="http://schemas.microsoft.com/office/drawing/2017/model3d" xmlns:o="urn:schemas-microsoft-com:office:office" xmlns:r="http://schemas.openxmlformats.org/officeDocument/2006/relationships" xmlns:m="http://schemas.openxmlformats.org/officeDocument/2006/math" xmlns:v="urn:schemas-microsoft-com:vml" xmlns:wp14="http://schemas.microsoft.com/office/word/2010/wordprocessingDrawing" xmlns:wp="http://schemas.openxmlformats.org/drawingml/2006/wordprocessingDrawing" xmlns:w10="urn:schemas-microsoft-com:office:word" xmlns:w="http://schemas.openxmlformats.org/wordprocessingml/2006/main" xmlns:w14="http://schemas.microsoft.com/office/word/2010/wordml" xmlns:w15="http://schemas.microsoft.com/office/word/2012/wordml" xmlns:w16cex="http://schemas.microsoft.com/office/word/2018/wordml/cex" xmlns:w16cid="http://schemas.microsoft.com/office/word/2016/wordml/cid" xmlns:w16="http://schemas.microsoft.com/office/word/2018/wordml" xmlns:w16sdtdh="http://schemas.microsoft.com/office/word/2020/wordml/sdtdatahash" xmlns:w16se="http://schemas.microsoft.com/office/word/2015/wordml/symex" xmlns:wpg="http://schemas.microsoft.com/office/word/2010/wordprocessingGroup" xmlns:wpi="http://schemas.microsoft.com/office/word/2010/wordprocessingInk" xmlns:wne="http://schemas.microsoft.com/office/word/2006/wordml" xmlns:wps="http://schemas.microsoft.com/office/word/2010/wordprocessingShape" mc:Ignorable="w14 w15 w16se w16cid w16 w16cex w16sdtdh wp14">
   <w:p>
     <w:pPr>
       <w:spacing w:after="14"/>
@@ -10479,7 +11005,7 @@
 </file>
 
 <file path=word/footer2.xml><?xml version="1.0" encoding="utf-8"?>
-<w:ftr xmlns:wpc="http://schemas.microsoft.com/office/word/2010/wordprocessingCanvas" xmlns:cx="http://schemas.microsoft.com/office/drawing/2014/chartex" xmlns:cx1="http://schemas.microsoft.com/office/drawing/2015/9/8/chartex" xmlns:cx2="http://schemas.microsoft.com/office/drawing/2015/10/21/chartex" xmlns:cx3="http://schemas.microsoft.com/office/drawing/2016/5/9/chartex" xmlns:cx4="http://schemas.microsoft.com/office/drawing/2016/5/10/chartex" xmlns:cx5="http://schemas.microsoft.com/office/drawing/2016/5/11/chartex" xmlns:cx6="http://schemas.microsoft.com/office/drawing/2016/5/12/chartex" xmlns:cx7="http://schemas.microsoft.com/office/drawing/2016/5/13/chartex" xmlns:cx8="http://schemas.microsoft.com/office/drawing/2016/5/14/chartex" xmlns:mc="http://schemas.openxmlformats.org/markup-compatibility/2006" xmlns:aink="http://schemas.microsoft.com/office/drawing/2016/ink" xmlns:am3d="http://schemas.microsoft.com/office/drawing/2017/model3d" xmlns:o="urn:schemas-microsoft-com:office:office" xmlns:oel="http://schemas.microsoft.com/office/2019/extlst" xmlns:r="http://schemas.openxmlformats.org/officeDocument/2006/relationships" xmlns:m="http://schemas.openxmlformats.org/officeDocument/2006/math" xmlns:v="urn:schemas-microsoft-com:vml" xmlns:wp14="http://schemas.microsoft.com/office/word/2010/wordprocessingDrawing" xmlns:wp="http://schemas.openxmlformats.org/drawingml/2006/wordprocessingDrawing" xmlns:w10="urn:schemas-microsoft-com:office:word" xmlns:w="http://schemas.openxmlformats.org/wordprocessingml/2006/main" xmlns:w14="http://schemas.microsoft.com/office/word/2010/wordml" xmlns:w15="http://schemas.microsoft.com/office/word/2012/wordml" xmlns:w16cex="http://schemas.microsoft.com/office/word/2018/wordml/cex" xmlns:w16cid="http://schemas.microsoft.com/office/word/2016/wordml/cid" xmlns:w16="http://schemas.microsoft.com/office/word/2018/wordml" xmlns:w16sdtdh="http://schemas.microsoft.com/office/word/2020/wordml/sdtdatahash" xmlns:w16se="http://schemas.microsoft.com/office/word/2015/wordml/symex" xmlns:wpg="http://schemas.microsoft.com/office/word/2010/wordprocessingGroup" xmlns:wpi="http://schemas.microsoft.com/office/word/2010/wordprocessingInk" xmlns:wne="http://schemas.microsoft.com/office/word/2006/wordml" xmlns:wps="http://schemas.microsoft.com/office/word/2010/wordprocessingShape" mc:Ignorable="w14 w15 w16se w16cid w16 w16cex w16sdtdh wp14">
+<w:ftr xmlns:wpc="http://schemas.microsoft.com/office/word/2010/wordprocessingCanvas" xmlns:cx="http://schemas.microsoft.com/office/drawing/2014/chartex" xmlns:cx1="http://schemas.microsoft.com/office/drawing/2015/9/8/chartex" xmlns:cx2="http://schemas.microsoft.com/office/drawing/2015/10/21/chartex" xmlns:cx3="http://schemas.microsoft.com/office/drawing/2016/5/9/chartex" xmlns:cx4="http://schemas.microsoft.com/office/drawing/2016/5/10/chartex" xmlns:cx5="http://schemas.microsoft.com/office/drawing/2016/5/11/chartex" xmlns:cx6="http://schemas.microsoft.com/office/drawing/2016/5/12/chartex" xmlns:cx7="http://schemas.microsoft.com/office/drawing/2016/5/13/chartex" xmlns:cx8="http://schemas.microsoft.com/office/drawing/2016/5/14/chartex" xmlns:mc="http://schemas.openxmlformats.org/markup-compatibility/2006" xmlns:aink="http://schemas.microsoft.com/office/drawing/2016/ink" xmlns:am3d="http://schemas.microsoft.com/office/drawing/2017/model3d" xmlns:o="urn:schemas-microsoft-com:office:office" xmlns:r="http://schemas.openxmlformats.org/officeDocument/2006/relationships" xmlns:m="http://schemas.openxmlformats.org/officeDocument/2006/math" xmlns:v="urn:schemas-microsoft-com:vml" xmlns:wp14="http://schemas.microsoft.com/office/word/2010/wordprocessingDrawing" xmlns:wp="http://schemas.openxmlformats.org/drawingml/2006/wordprocessingDrawing" xmlns:w10="urn:schemas-microsoft-com:office:word" xmlns:w="http://schemas.openxmlformats.org/wordprocessingml/2006/main" xmlns:w14="http://schemas.microsoft.com/office/word/2010/wordml" xmlns:w15="http://schemas.microsoft.com/office/word/2012/wordml" xmlns:w16cex="http://schemas.microsoft.com/office/word/2018/wordml/cex" xmlns:w16cid="http://schemas.microsoft.com/office/word/2016/wordml/cid" xmlns:w16="http://schemas.microsoft.com/office/word/2018/wordml" xmlns:w16sdtdh="http://schemas.microsoft.com/office/word/2020/wordml/sdtdatahash" xmlns:w16se="http://schemas.microsoft.com/office/word/2015/wordml/symex" xmlns:wpg="http://schemas.microsoft.com/office/word/2010/wordprocessingGroup" xmlns:wpi="http://schemas.microsoft.com/office/word/2010/wordprocessingInk" xmlns:wne="http://schemas.microsoft.com/office/word/2006/wordml" xmlns:wps="http://schemas.microsoft.com/office/word/2010/wordprocessingShape" mc:Ignorable="w14 w15 w16se w16cid w16 w16cex w16sdtdh wp14">
   <w:sdt>
     <w:sdtPr>
       <w:id w:val="658957513"/>
@@ -10488,6 +11014,7 @@
         <w:docPartUnique/>
       </w:docPartObj>
     </w:sdtPr>
+    <w:sdtEndPr/>
     <w:sdtContent>
       <w:p>
         <w:pPr>
@@ -10565,7 +11092,7 @@
 </file>
 
 <file path=word/footer3.xml><?xml version="1.0" encoding="utf-8"?>
-<w:ftr xmlns:wpc="http://schemas.microsoft.com/office/word/2010/wordprocessingCanvas" xmlns:cx="http://schemas.microsoft.com/office/drawing/2014/chartex" xmlns:cx1="http://schemas.microsoft.com/office/drawing/2015/9/8/chartex" xmlns:cx2="http://schemas.microsoft.com/office/drawing/2015/10/21/chartex" xmlns:cx3="http://schemas.microsoft.com/office/drawing/2016/5/9/chartex" xmlns:cx4="http://schemas.microsoft.com/office/drawing/2016/5/10/chartex" xmlns:cx5="http://schemas.microsoft.com/office/drawing/2016/5/11/chartex" xmlns:cx6="http://schemas.microsoft.com/office/drawing/2016/5/12/chartex" xmlns:cx7="http://schemas.microsoft.com/office/drawing/2016/5/13/chartex" xmlns:cx8="http://schemas.microsoft.com/office/drawing/2016/5/14/chartex" xmlns:mc="http://schemas.openxmlformats.org/markup-compatibility/2006" xmlns:aink="http://schemas.microsoft.com/office/drawing/2016/ink" xmlns:am3d="http://schemas.microsoft.com/office/drawing/2017/model3d" xmlns:o="urn:schemas-microsoft-com:office:office" xmlns:oel="http://schemas.microsoft.com/office/2019/extlst" xmlns:r="http://schemas.openxmlformats.org/officeDocument/2006/relationships" xmlns:m="http://schemas.openxmlformats.org/officeDocument/2006/math" xmlns:v="urn:schemas-microsoft-com:vml" xmlns:wp14="http://schemas.microsoft.com/office/word/2010/wordprocessingDrawing" xmlns:wp="http://schemas.openxmlformats.org/drawingml/2006/wordprocessingDrawing" xmlns:w10="urn:schemas-microsoft-com:office:word" xmlns:w="http://schemas.openxmlformats.org/wordprocessingml/2006/main" xmlns:w14="http://schemas.microsoft.com/office/word/2010/wordml" xmlns:w15="http://schemas.microsoft.com/office/word/2012/wordml" xmlns:w16cex="http://schemas.microsoft.com/office/word/2018/wordml/cex" xmlns:w16cid="http://schemas.microsoft.com/office/word/2016/wordml/cid" xmlns:w16="http://schemas.microsoft.com/office/word/2018/wordml" xmlns:w16sdtdh="http://schemas.microsoft.com/office/word/2020/wordml/sdtdatahash" xmlns:w16se="http://schemas.microsoft.com/office/word/2015/wordml/symex" xmlns:wpg="http://schemas.microsoft.com/office/word/2010/wordprocessingGroup" xmlns:wpi="http://schemas.microsoft.com/office/word/2010/wordprocessingInk" xmlns:wne="http://schemas.microsoft.com/office/word/2006/wordml" xmlns:wps="http://schemas.microsoft.com/office/word/2010/wordprocessingShape" mc:Ignorable="w14 w15 w16se w16cid w16 w16cex w16sdtdh wp14">
+<w:ftr xmlns:wpc="http://schemas.microsoft.com/office/word/2010/wordprocessingCanvas" xmlns:cx="http://schemas.microsoft.com/office/drawing/2014/chartex" xmlns:cx1="http://schemas.microsoft.com/office/drawing/2015/9/8/chartex" xmlns:cx2="http://schemas.microsoft.com/office/drawing/2015/10/21/chartex" xmlns:cx3="http://schemas.microsoft.com/office/drawing/2016/5/9/chartex" xmlns:cx4="http://schemas.microsoft.com/office/drawing/2016/5/10/chartex" xmlns:cx5="http://schemas.microsoft.com/office/drawing/2016/5/11/chartex" xmlns:cx6="http://schemas.microsoft.com/office/drawing/2016/5/12/chartex" xmlns:cx7="http://schemas.microsoft.com/office/drawing/2016/5/13/chartex" xmlns:cx8="http://schemas.microsoft.com/office/drawing/2016/5/14/chartex" xmlns:mc="http://schemas.openxmlformats.org/markup-compatibility/2006" xmlns:aink="http://schemas.microsoft.com/office/drawing/2016/ink" xmlns:am3d="http://schemas.microsoft.com/office/drawing/2017/model3d" xmlns:o="urn:schemas-microsoft-com:office:office" xmlns:r="http://schemas.openxmlformats.org/officeDocument/2006/relationships" xmlns:m="http://schemas.openxmlformats.org/officeDocument/2006/math" xmlns:v="urn:schemas-microsoft-com:vml" xmlns:wp14="http://schemas.microsoft.com/office/word/2010/wordprocessingDrawing" xmlns:wp="http://schemas.openxmlformats.org/drawingml/2006/wordprocessingDrawing" xmlns:w10="urn:schemas-microsoft-com:office:word" xmlns:w="http://schemas.openxmlformats.org/wordprocessingml/2006/main" xmlns:w14="http://schemas.microsoft.com/office/word/2010/wordml" xmlns:w15="http://schemas.microsoft.com/office/word/2012/wordml" xmlns:w16cex="http://schemas.microsoft.com/office/word/2018/wordml/cex" xmlns:w16cid="http://schemas.microsoft.com/office/word/2016/wordml/cid" xmlns:w16="http://schemas.microsoft.com/office/word/2018/wordml" xmlns:w16sdtdh="http://schemas.microsoft.com/office/word/2020/wordml/sdtdatahash" xmlns:w16se="http://schemas.microsoft.com/office/word/2015/wordml/symex" xmlns:wpg="http://schemas.microsoft.com/office/word/2010/wordprocessingGroup" xmlns:wpi="http://schemas.microsoft.com/office/word/2010/wordprocessingInk" xmlns:wne="http://schemas.microsoft.com/office/word/2006/wordml" xmlns:wps="http://schemas.microsoft.com/office/word/2010/wordprocessingShape" mc:Ignorable="w14 w15 w16se w16cid w16 w16cex w16sdtdh wp14">
   <w:p>
     <w:pPr>
       <w:pStyle w:val="Piedepgina"/>
@@ -10620,7 +11147,7 @@
 </file>
 
 <file path=word/footnotes.xml><?xml version="1.0" encoding="utf-8"?>
-<w:footnotes xmlns:wpc="http://schemas.microsoft.com/office/word/2010/wordprocessingCanvas" xmlns:cx="http://schemas.microsoft.com/office/drawing/2014/chartex" xmlns:cx1="http://schemas.microsoft.com/office/drawing/2015/9/8/chartex" xmlns:cx2="http://schemas.microsoft.com/office/drawing/2015/10/21/chartex" xmlns:cx3="http://schemas.microsoft.com/office/drawing/2016/5/9/chartex" xmlns:cx4="http://schemas.microsoft.com/office/drawing/2016/5/10/chartex" xmlns:cx5="http://schemas.microsoft.com/office/drawing/2016/5/11/chartex" xmlns:cx6="http://schemas.microsoft.com/office/drawing/2016/5/12/chartex" xmlns:cx7="http://schemas.microsoft.com/office/drawing/2016/5/13/chartex" xmlns:cx8="http://schemas.microsoft.com/office/drawing/2016/5/14/chartex" xmlns:mc="http://schemas.openxmlformats.org/markup-compatibility/2006" xmlns:aink="http://schemas.microsoft.com/office/drawing/2016/ink" xmlns:am3d="http://schemas.microsoft.com/office/drawing/2017/model3d" xmlns:o="urn:schemas-microsoft-com:office:office" xmlns:oel="http://schemas.microsoft.com/office/2019/extlst" xmlns:r="http://schemas.openxmlformats.org/officeDocument/2006/relationships" xmlns:m="http://schemas.openxmlformats.org/officeDocument/2006/math" xmlns:v="urn:schemas-microsoft-com:vml" xmlns:wp14="http://schemas.microsoft.com/office/word/2010/wordprocessingDrawing" xmlns:wp="http://schemas.openxmlformats.org/drawingml/2006/wordprocessingDrawing" xmlns:w10="urn:schemas-microsoft-com:office:word" xmlns:w="http://schemas.openxmlformats.org/wordprocessingml/2006/main" xmlns:w14="http://schemas.microsoft.com/office/word/2010/wordml" xmlns:w15="http://schemas.microsoft.com/office/word/2012/wordml" xmlns:w16cex="http://schemas.microsoft.com/office/word/2018/wordml/cex" xmlns:w16cid="http://schemas.microsoft.com/office/word/2016/wordml/cid" xmlns:w16="http://schemas.microsoft.com/office/word/2018/wordml" xmlns:w16sdtdh="http://schemas.microsoft.com/office/word/2020/wordml/sdtdatahash" xmlns:w16se="http://schemas.microsoft.com/office/word/2015/wordml/symex" xmlns:wpg="http://schemas.microsoft.com/office/word/2010/wordprocessingGroup" xmlns:wpi="http://schemas.microsoft.com/office/word/2010/wordprocessingInk" xmlns:wne="http://schemas.microsoft.com/office/word/2006/wordml" xmlns:wps="http://schemas.microsoft.com/office/word/2010/wordprocessingShape" mc:Ignorable="w14 w15 w16se w16cid w16 w16cex w16sdtdh wp14">
+<w:footnotes xmlns:wpc="http://schemas.microsoft.com/office/word/2010/wordprocessingCanvas" xmlns:cx="http://schemas.microsoft.com/office/drawing/2014/chartex" xmlns:cx1="http://schemas.microsoft.com/office/drawing/2015/9/8/chartex" xmlns:cx2="http://schemas.microsoft.com/office/drawing/2015/10/21/chartex" xmlns:cx3="http://schemas.microsoft.com/office/drawing/2016/5/9/chartex" xmlns:cx4="http://schemas.microsoft.com/office/drawing/2016/5/10/chartex" xmlns:cx5="http://schemas.microsoft.com/office/drawing/2016/5/11/chartex" xmlns:cx6="http://schemas.microsoft.com/office/drawing/2016/5/12/chartex" xmlns:cx7="http://schemas.microsoft.com/office/drawing/2016/5/13/chartex" xmlns:cx8="http://schemas.microsoft.com/office/drawing/2016/5/14/chartex" xmlns:mc="http://schemas.openxmlformats.org/markup-compatibility/2006" xmlns:aink="http://schemas.microsoft.com/office/drawing/2016/ink" xmlns:am3d="http://schemas.microsoft.com/office/drawing/2017/model3d" xmlns:o="urn:schemas-microsoft-com:office:office" xmlns:r="http://schemas.openxmlformats.org/officeDocument/2006/relationships" xmlns:m="http://schemas.openxmlformats.org/officeDocument/2006/math" xmlns:v="urn:schemas-microsoft-com:vml" xmlns:wp14="http://schemas.microsoft.com/office/word/2010/wordprocessingDrawing" xmlns:wp="http://schemas.openxmlformats.org/drawingml/2006/wordprocessingDrawing" xmlns:w10="urn:schemas-microsoft-com:office:word" xmlns:w="http://schemas.openxmlformats.org/wordprocessingml/2006/main" xmlns:w14="http://schemas.microsoft.com/office/word/2010/wordml" xmlns:w15="http://schemas.microsoft.com/office/word/2012/wordml" xmlns:w16cex="http://schemas.microsoft.com/office/word/2018/wordml/cex" xmlns:w16cid="http://schemas.microsoft.com/office/word/2016/wordml/cid" xmlns:w16="http://schemas.microsoft.com/office/word/2018/wordml" xmlns:w16sdtdh="http://schemas.microsoft.com/office/word/2020/wordml/sdtdatahash" xmlns:w16se="http://schemas.microsoft.com/office/word/2015/wordml/symex" xmlns:wpg="http://schemas.microsoft.com/office/word/2010/wordprocessingGroup" xmlns:wpi="http://schemas.microsoft.com/office/word/2010/wordprocessingInk" xmlns:wne="http://schemas.microsoft.com/office/word/2006/wordml" xmlns:wps="http://schemas.microsoft.com/office/word/2010/wordprocessingShape" mc:Ignorable="w14 w15 w16se w16cid w16 w16cex w16sdtdh wp14">
   <w:footnote w:type="separator" w:id="-1">
     <w:p>
       <w:pPr>
@@ -10645,7 +11172,7 @@
 </file>
 
 <file path=word/header1.xml><?xml version="1.0" encoding="utf-8"?>
-<w:hdr xmlns:wpc="http://schemas.microsoft.com/office/word/2010/wordprocessingCanvas" xmlns:cx="http://schemas.microsoft.com/office/drawing/2014/chartex" xmlns:cx1="http://schemas.microsoft.com/office/drawing/2015/9/8/chartex" xmlns:cx2="http://schemas.microsoft.com/office/drawing/2015/10/21/chartex" xmlns:cx3="http://schemas.microsoft.com/office/drawing/2016/5/9/chartex" xmlns:cx4="http://schemas.microsoft.com/office/drawing/2016/5/10/chartex" xmlns:cx5="http://schemas.microsoft.com/office/drawing/2016/5/11/chartex" xmlns:cx6="http://schemas.microsoft.com/office/drawing/2016/5/12/chartex" xmlns:cx7="http://schemas.microsoft.com/office/drawing/2016/5/13/chartex" xmlns:cx8="http://schemas.microsoft.com/office/drawing/2016/5/14/chartex" xmlns:mc="http://schemas.openxmlformats.org/markup-compatibility/2006" xmlns:aink="http://schemas.microsoft.com/office/drawing/2016/ink" xmlns:am3d="http://schemas.microsoft.com/office/drawing/2017/model3d" xmlns:o="urn:schemas-microsoft-com:office:office" xmlns:oel="http://schemas.microsoft.com/office/2019/extlst" xmlns:r="http://schemas.openxmlformats.org/officeDocument/2006/relationships" xmlns:m="http://schemas.openxmlformats.org/officeDocument/2006/math" xmlns:v="urn:schemas-microsoft-com:vml" xmlns:wp14="http://schemas.microsoft.com/office/word/2010/wordprocessingDrawing" xmlns:wp="http://schemas.openxmlformats.org/drawingml/2006/wordprocessingDrawing" xmlns:w10="urn:schemas-microsoft-com:office:word" xmlns:w="http://schemas.openxmlformats.org/wordprocessingml/2006/main" xmlns:w14="http://schemas.microsoft.com/office/word/2010/wordml" xmlns:w15="http://schemas.microsoft.com/office/word/2012/wordml" xmlns:w16cex="http://schemas.microsoft.com/office/word/2018/wordml/cex" xmlns:w16cid="http://schemas.microsoft.com/office/word/2016/wordml/cid" xmlns:w16="http://schemas.microsoft.com/office/word/2018/wordml" xmlns:w16sdtdh="http://schemas.microsoft.com/office/word/2020/wordml/sdtdatahash" xmlns:w16se="http://schemas.microsoft.com/office/word/2015/wordml/symex" xmlns:wpg="http://schemas.microsoft.com/office/word/2010/wordprocessingGroup" xmlns:wpi="http://schemas.microsoft.com/office/word/2010/wordprocessingInk" xmlns:wne="http://schemas.microsoft.com/office/word/2006/wordml" xmlns:wps="http://schemas.microsoft.com/office/word/2010/wordprocessingShape" mc:Ignorable="w14 w15 w16se w16cid w16 w16cex w16sdtdh wp14">
+<w:hdr xmlns:wpc="http://schemas.microsoft.com/office/word/2010/wordprocessingCanvas" xmlns:cx="http://schemas.microsoft.com/office/drawing/2014/chartex" xmlns:cx1="http://schemas.microsoft.com/office/drawing/2015/9/8/chartex" xmlns:cx2="http://schemas.microsoft.com/office/drawing/2015/10/21/chartex" xmlns:cx3="http://schemas.microsoft.com/office/drawing/2016/5/9/chartex" xmlns:cx4="http://schemas.microsoft.com/office/drawing/2016/5/10/chartex" xmlns:cx5="http://schemas.microsoft.com/office/drawing/2016/5/11/chartex" xmlns:cx6="http://schemas.microsoft.com/office/drawing/2016/5/12/chartex" xmlns:cx7="http://schemas.microsoft.com/office/drawing/2016/5/13/chartex" xmlns:cx8="http://schemas.microsoft.com/office/drawing/2016/5/14/chartex" xmlns:mc="http://schemas.openxmlformats.org/markup-compatibility/2006" xmlns:aink="http://schemas.microsoft.com/office/drawing/2016/ink" xmlns:am3d="http://schemas.microsoft.com/office/drawing/2017/model3d" xmlns:o="urn:schemas-microsoft-com:office:office" xmlns:r="http://schemas.openxmlformats.org/officeDocument/2006/relationships" xmlns:m="http://schemas.openxmlformats.org/officeDocument/2006/math" xmlns:v="urn:schemas-microsoft-com:vml" xmlns:wp14="http://schemas.microsoft.com/office/word/2010/wordprocessingDrawing" xmlns:wp="http://schemas.openxmlformats.org/drawingml/2006/wordprocessingDrawing" xmlns:w10="urn:schemas-microsoft-com:office:word" xmlns:w="http://schemas.openxmlformats.org/wordprocessingml/2006/main" xmlns:w14="http://schemas.microsoft.com/office/word/2010/wordml" xmlns:w15="http://schemas.microsoft.com/office/word/2012/wordml" xmlns:w16cex="http://schemas.microsoft.com/office/word/2018/wordml/cex" xmlns:w16cid="http://schemas.microsoft.com/office/word/2016/wordml/cid" xmlns:w16="http://schemas.microsoft.com/office/word/2018/wordml" xmlns:w16sdtdh="http://schemas.microsoft.com/office/word/2020/wordml/sdtdatahash" xmlns:w16se="http://schemas.microsoft.com/office/word/2015/wordml/symex" xmlns:wpg="http://schemas.microsoft.com/office/word/2010/wordprocessingGroup" xmlns:wpi="http://schemas.microsoft.com/office/word/2010/wordprocessingInk" xmlns:wne="http://schemas.microsoft.com/office/word/2006/wordml" xmlns:wps="http://schemas.microsoft.com/office/word/2010/wordprocessingShape" mc:Ignorable="w14 w15 w16se w16cid w16 w16cex w16sdtdh wp14">
   <w:p>
     <w:pPr>
       <w:pStyle w:val="Encabezado"/>
@@ -10695,7 +11222,14 @@
         <w:b/>
         <w:bCs/>
       </w:rPr>
-      <w:t>Ingeniería en sistemas de información</w:t>
+      <w:t xml:space="preserve">Ingeniería en sistemas de </w:t>
+    </w:r>
+    <w:r>
+      <w:rPr>
+        <w:b/>
+        <w:bCs/>
+      </w:rPr>
+      <w:t>información</w:t>
     </w:r>
   </w:p>
   <w:p>
@@ -10811,7 +11345,7 @@
 </file>
 
 <file path=word/header2.xml><?xml version="1.0" encoding="utf-8"?>
-<w:hdr xmlns:wpc="http://schemas.microsoft.com/office/word/2010/wordprocessingCanvas" xmlns:cx="http://schemas.microsoft.com/office/drawing/2014/chartex" xmlns:cx1="http://schemas.microsoft.com/office/drawing/2015/9/8/chartex" xmlns:cx2="http://schemas.microsoft.com/office/drawing/2015/10/21/chartex" xmlns:cx3="http://schemas.microsoft.com/office/drawing/2016/5/9/chartex" xmlns:cx4="http://schemas.microsoft.com/office/drawing/2016/5/10/chartex" xmlns:cx5="http://schemas.microsoft.com/office/drawing/2016/5/11/chartex" xmlns:cx6="http://schemas.microsoft.com/office/drawing/2016/5/12/chartex" xmlns:cx7="http://schemas.microsoft.com/office/drawing/2016/5/13/chartex" xmlns:cx8="http://schemas.microsoft.com/office/drawing/2016/5/14/chartex" xmlns:mc="http://schemas.openxmlformats.org/markup-compatibility/2006" xmlns:aink="http://schemas.microsoft.com/office/drawing/2016/ink" xmlns:am3d="http://schemas.microsoft.com/office/drawing/2017/model3d" xmlns:o="urn:schemas-microsoft-com:office:office" xmlns:oel="http://schemas.microsoft.com/office/2019/extlst" xmlns:r="http://schemas.openxmlformats.org/officeDocument/2006/relationships" xmlns:m="http://schemas.openxmlformats.org/officeDocument/2006/math" xmlns:v="urn:schemas-microsoft-com:vml" xmlns:wp14="http://schemas.microsoft.com/office/word/2010/wordprocessingDrawing" xmlns:wp="http://schemas.openxmlformats.org/drawingml/2006/wordprocessingDrawing" xmlns:w10="urn:schemas-microsoft-com:office:word" xmlns:w="http://schemas.openxmlformats.org/wordprocessingml/2006/main" xmlns:w14="http://schemas.microsoft.com/office/word/2010/wordml" xmlns:w15="http://schemas.microsoft.com/office/word/2012/wordml" xmlns:w16cex="http://schemas.microsoft.com/office/word/2018/wordml/cex" xmlns:w16cid="http://schemas.microsoft.com/office/word/2016/wordml/cid" xmlns:w16="http://schemas.microsoft.com/office/word/2018/wordml" xmlns:w16sdtdh="http://schemas.microsoft.com/office/word/2020/wordml/sdtdatahash" xmlns:w16se="http://schemas.microsoft.com/office/word/2015/wordml/symex" xmlns:wpg="http://schemas.microsoft.com/office/word/2010/wordprocessingGroup" xmlns:wpi="http://schemas.microsoft.com/office/word/2010/wordprocessingInk" xmlns:wne="http://schemas.microsoft.com/office/word/2006/wordml" xmlns:wps="http://schemas.microsoft.com/office/word/2010/wordprocessingShape" mc:Ignorable="w14 w15 w16se w16cid w16 w16cex w16sdtdh wp14">
+<w:hdr xmlns:wpc="http://schemas.microsoft.com/office/word/2010/wordprocessingCanvas" xmlns:cx="http://schemas.microsoft.com/office/drawing/2014/chartex" xmlns:cx1="http://schemas.microsoft.com/office/drawing/2015/9/8/chartex" xmlns:cx2="http://schemas.microsoft.com/office/drawing/2015/10/21/chartex" xmlns:cx3="http://schemas.microsoft.com/office/drawing/2016/5/9/chartex" xmlns:cx4="http://schemas.microsoft.com/office/drawing/2016/5/10/chartex" xmlns:cx5="http://schemas.microsoft.com/office/drawing/2016/5/11/chartex" xmlns:cx6="http://schemas.microsoft.com/office/drawing/2016/5/12/chartex" xmlns:cx7="http://schemas.microsoft.com/office/drawing/2016/5/13/chartex" xmlns:cx8="http://schemas.microsoft.com/office/drawing/2016/5/14/chartex" xmlns:mc="http://schemas.openxmlformats.org/markup-compatibility/2006" xmlns:aink="http://schemas.microsoft.com/office/drawing/2016/ink" xmlns:am3d="http://schemas.microsoft.com/office/drawing/2017/model3d" xmlns:o="urn:schemas-microsoft-com:office:office" xmlns:r="http://schemas.openxmlformats.org/officeDocument/2006/relationships" xmlns:m="http://schemas.openxmlformats.org/officeDocument/2006/math" xmlns:v="urn:schemas-microsoft-com:vml" xmlns:wp14="http://schemas.microsoft.com/office/word/2010/wordprocessingDrawing" xmlns:wp="http://schemas.openxmlformats.org/drawingml/2006/wordprocessingDrawing" xmlns:w10="urn:schemas-microsoft-com:office:word" xmlns:w="http://schemas.openxmlformats.org/wordprocessingml/2006/main" xmlns:w14="http://schemas.microsoft.com/office/word/2010/wordml" xmlns:w15="http://schemas.microsoft.com/office/word/2012/wordml" xmlns:w16cex="http://schemas.microsoft.com/office/word/2018/wordml/cex" xmlns:w16cid="http://schemas.microsoft.com/office/word/2016/wordml/cid" xmlns:w16="http://schemas.microsoft.com/office/word/2018/wordml" xmlns:w16sdtdh="http://schemas.microsoft.com/office/word/2020/wordml/sdtdatahash" xmlns:w16se="http://schemas.microsoft.com/office/word/2015/wordml/symex" xmlns:wpg="http://schemas.microsoft.com/office/word/2010/wordprocessingGroup" xmlns:wpi="http://schemas.microsoft.com/office/word/2010/wordprocessingInk" xmlns:wne="http://schemas.microsoft.com/office/word/2006/wordml" xmlns:wps="http://schemas.microsoft.com/office/word/2010/wordprocessingShape" mc:Ignorable="w14 w15 w16se w16cid w16 w16cex w16sdtdh wp14">
   <w:p>
     <w:pPr>
       <w:pStyle w:val="Encabezado"/>
@@ -10871,7 +11405,7 @@
 </file>
 
 <file path=word/numbering.xml><?xml version="1.0" encoding="utf-8"?>
-<w:numbering xmlns:wpc="http://schemas.microsoft.com/office/word/2010/wordprocessingCanvas" xmlns:cx="http://schemas.microsoft.com/office/drawing/2014/chartex" xmlns:cx1="http://schemas.microsoft.com/office/drawing/2015/9/8/chartex" xmlns:cx2="http://schemas.microsoft.com/office/drawing/2015/10/21/chartex" xmlns:cx3="http://schemas.microsoft.com/office/drawing/2016/5/9/chartex" xmlns:cx4="http://schemas.microsoft.com/office/drawing/2016/5/10/chartex" xmlns:cx5="http://schemas.microsoft.com/office/drawing/2016/5/11/chartex" xmlns:cx6="http://schemas.microsoft.com/office/drawing/2016/5/12/chartex" xmlns:cx7="http://schemas.microsoft.com/office/drawing/2016/5/13/chartex" xmlns:cx8="http://schemas.microsoft.com/office/drawing/2016/5/14/chartex" xmlns:mc="http://schemas.openxmlformats.org/markup-compatibility/2006" xmlns:aink="http://schemas.microsoft.com/office/drawing/2016/ink" xmlns:am3d="http://schemas.microsoft.com/office/drawing/2017/model3d" xmlns:o="urn:schemas-microsoft-com:office:office" xmlns:oel="http://schemas.microsoft.com/office/2019/extlst" xmlns:r="http://schemas.openxmlformats.org/officeDocument/2006/relationships" xmlns:m="http://schemas.openxmlformats.org/officeDocument/2006/math" xmlns:v="urn:schemas-microsoft-com:vml" xmlns:wp14="http://schemas.microsoft.com/office/word/2010/wordprocessingDrawing" xmlns:wp="http://schemas.openxmlformats.org/drawingml/2006/wordprocessingDrawing" xmlns:w10="urn:schemas-microsoft-com:office:word" xmlns:w="http://schemas.openxmlformats.org/wordprocessingml/2006/main" xmlns:w14="http://schemas.microsoft.com/office/word/2010/wordml" xmlns:w15="http://schemas.microsoft.com/office/word/2012/wordml" xmlns:w16cex="http://schemas.microsoft.com/office/word/2018/wordml/cex" xmlns:w16cid="http://schemas.microsoft.com/office/word/2016/wordml/cid" xmlns:w16="http://schemas.microsoft.com/office/word/2018/wordml" xmlns:w16sdtdh="http://schemas.microsoft.com/office/word/2020/wordml/sdtdatahash" xmlns:w16se="http://schemas.microsoft.com/office/word/2015/wordml/symex" xmlns:wpg="http://schemas.microsoft.com/office/word/2010/wordprocessingGroup" xmlns:wpi="http://schemas.microsoft.com/office/word/2010/wordprocessingInk" xmlns:wne="http://schemas.microsoft.com/office/word/2006/wordml" xmlns:wps="http://schemas.microsoft.com/office/word/2010/wordprocessingShape" mc:Ignorable="w14 w15 w16se w16cid w16 w16cex w16sdtdh wp14">
+<w:numbering xmlns:wpc="http://schemas.microsoft.com/office/word/2010/wordprocessingCanvas" xmlns:cx="http://schemas.microsoft.com/office/drawing/2014/chartex" xmlns:cx1="http://schemas.microsoft.com/office/drawing/2015/9/8/chartex" xmlns:cx2="http://schemas.microsoft.com/office/drawing/2015/10/21/chartex" xmlns:cx3="http://schemas.microsoft.com/office/drawing/2016/5/9/chartex" xmlns:cx4="http://schemas.microsoft.com/office/drawing/2016/5/10/chartex" xmlns:cx5="http://schemas.microsoft.com/office/drawing/2016/5/11/chartex" xmlns:cx6="http://schemas.microsoft.com/office/drawing/2016/5/12/chartex" xmlns:cx7="http://schemas.microsoft.com/office/drawing/2016/5/13/chartex" xmlns:cx8="http://schemas.microsoft.com/office/drawing/2016/5/14/chartex" xmlns:mc="http://schemas.openxmlformats.org/markup-compatibility/2006" xmlns:aink="http://schemas.microsoft.com/office/drawing/2016/ink" xmlns:am3d="http://schemas.microsoft.com/office/drawing/2017/model3d" xmlns:o="urn:schemas-microsoft-com:office:office" xmlns:r="http://schemas.openxmlformats.org/officeDocument/2006/relationships" xmlns:m="http://schemas.openxmlformats.org/officeDocument/2006/math" xmlns:v="urn:schemas-microsoft-com:vml" xmlns:wp14="http://schemas.microsoft.com/office/word/2010/wordprocessingDrawing" xmlns:wp="http://schemas.openxmlformats.org/drawingml/2006/wordprocessingDrawing" xmlns:w10="urn:schemas-microsoft-com:office:word" xmlns:w="http://schemas.openxmlformats.org/wordprocessingml/2006/main" xmlns:w14="http://schemas.microsoft.com/office/word/2010/wordml" xmlns:w15="http://schemas.microsoft.com/office/word/2012/wordml" xmlns:w16cex="http://schemas.microsoft.com/office/word/2018/wordml/cex" xmlns:w16cid="http://schemas.microsoft.com/office/word/2016/wordml/cid" xmlns:w16="http://schemas.microsoft.com/office/word/2018/wordml" xmlns:w16sdtdh="http://schemas.microsoft.com/office/word/2020/wordml/sdtdatahash" xmlns:w16se="http://schemas.microsoft.com/office/word/2015/wordml/symex" xmlns:wpg="http://schemas.microsoft.com/office/word/2010/wordprocessingGroup" xmlns:wpi="http://schemas.microsoft.com/office/word/2010/wordprocessingInk" xmlns:wne="http://schemas.microsoft.com/office/word/2006/wordml" xmlns:wps="http://schemas.microsoft.com/office/word/2010/wordprocessingShape" mc:Ignorable="w14 w15 w16se w16cid w16 w16cex w16sdtdh wp14">
   <w:abstractNum w:abstractNumId="0" w15:restartNumberingAfterBreak="0">
     <w:nsid w:val="0D8135C2"/>
     <w:multiLevelType w:val="multilevel"/>
@@ -11721,16 +12255,16 @@
       </w:rPr>
     </w:lvl>
   </w:abstractNum>
-  <w:num w:numId="1" w16cid:durableId="667639360">
+  <w:num w:numId="1">
     <w:abstractNumId w:val="1"/>
   </w:num>
-  <w:num w:numId="2" w16cid:durableId="1291084640">
+  <w:num w:numId="2">
     <w:abstractNumId w:val="3"/>
   </w:num>
-  <w:num w:numId="3" w16cid:durableId="496115627">
+  <w:num w:numId="3">
     <w:abstractNumId w:val="2"/>
   </w:num>
-  <w:num w:numId="4" w16cid:durableId="1681085651">
+  <w:num w:numId="4">
     <w:abstractNumId w:val="0"/>
   </w:num>
 </w:numbering>

</xml_diff>